<commit_message>
docs: report links the software repository
</commit_message>
<xml_diff>
--- a/deliverables/159333_Final_Report_Bargain_Agent.docx
+++ b/deliverables/159333_Final_Report_Bargain_Agent.docx
@@ -704,7 +704,7 @@
     <w:sdt>
       <w:sdtPr>
         <w:alias w:val="Contents"/>
-        <w:id w:val="2080934192"/>
+        <w:id w:val="-1318640873"/>
       </w:sdtPr>
       <w:sdtEndPr/>
       <w:sdtContent>
@@ -715,7 +715,11 @@
               <w:tab w:val="right" w:leader="dot" w:pos="9016"/>
             </w:tabs>
             <w:rPr>
+              <w:rFonts w:asciiTheme="minorHAnsi" w:hAnsiTheme="minorHAnsi" w:cstheme="minorBidi"/>
               <w:noProof/>
+              <w:kern w:val="2"/>
+              <w:szCs w:val="24"/>
+              <w14:ligatures w14:val="standardContextual"/>
             </w:rPr>
           </w:pPr>
           <w:r>
@@ -727,7 +731,7 @@
           <w:r>
             <w:fldChar w:fldCharType="separate"/>
           </w:r>
-          <w:hyperlink w:anchor="_Toc243319411" w:history="1">
+          <w:hyperlink w:anchor="_Toc243321549" w:history="1">
             <w:r>
               <w:rPr>
                 <w:rStyle w:val="a5"/>
@@ -751,7 +755,7 @@
               <w:rPr>
                 <w:noProof/>
               </w:rPr>
-              <w:instrText xml:space="preserve"> PAGEREF _Toc243319411 \h </w:instrText>
+              <w:instrText xml:space="preserve"> PAGEREF _Toc243321549 \h </w:instrText>
             </w:r>
             <w:r>
               <w:rPr>
@@ -786,10 +790,14 @@
             </w:tabs>
             <w:ind w:left="440"/>
             <w:rPr>
+              <w:rFonts w:asciiTheme="minorHAnsi" w:hAnsiTheme="minorHAnsi" w:cstheme="minorBidi"/>
               <w:noProof/>
+              <w:kern w:val="2"/>
+              <w:szCs w:val="24"/>
+              <w14:ligatures w14:val="standardContextual"/>
             </w:rPr>
           </w:pPr>
-          <w:hyperlink w:anchor="_Toc243319412" w:history="1">
+          <w:hyperlink w:anchor="_Toc243321550" w:history="1">
             <w:r>
               <w:rPr>
                 <w:rStyle w:val="a5"/>
@@ -813,7 +821,7 @@
               <w:rPr>
                 <w:noProof/>
               </w:rPr>
-              <w:instrText xml:space="preserve"> PAGEREF _Toc243319412 \h </w:instrText>
+              <w:instrText xml:space="preserve"> PAGEREF _Toc243321550 \h </w:instrText>
             </w:r>
             <w:r>
               <w:rPr>
@@ -848,10 +856,14 @@
             </w:tabs>
             <w:ind w:left="440"/>
             <w:rPr>
+              <w:rFonts w:asciiTheme="minorHAnsi" w:hAnsiTheme="minorHAnsi" w:cstheme="minorBidi"/>
               <w:noProof/>
+              <w:kern w:val="2"/>
+              <w:szCs w:val="24"/>
+              <w14:ligatures w14:val="standardContextual"/>
             </w:rPr>
           </w:pPr>
-          <w:hyperlink w:anchor="_Toc243319413" w:history="1">
+          <w:hyperlink w:anchor="_Toc243321551" w:history="1">
             <w:r>
               <w:rPr>
                 <w:rStyle w:val="a5"/>
@@ -875,7 +887,7 @@
               <w:rPr>
                 <w:noProof/>
               </w:rPr>
-              <w:instrText xml:space="preserve"> PAGEREF _Toc243319413 \h </w:instrText>
+              <w:instrText xml:space="preserve"> PAGEREF _Toc243321551 \h </w:instrText>
             </w:r>
             <w:r>
               <w:rPr>
@@ -910,10 +922,14 @@
             </w:tabs>
             <w:ind w:left="440"/>
             <w:rPr>
+              <w:rFonts w:asciiTheme="minorHAnsi" w:hAnsiTheme="minorHAnsi" w:cstheme="minorBidi"/>
               <w:noProof/>
+              <w:kern w:val="2"/>
+              <w:szCs w:val="24"/>
+              <w14:ligatures w14:val="standardContextual"/>
             </w:rPr>
           </w:pPr>
-          <w:hyperlink w:anchor="_Toc243319414" w:history="1">
+          <w:hyperlink w:anchor="_Toc243321552" w:history="1">
             <w:r>
               <w:rPr>
                 <w:rStyle w:val="a5"/>
@@ -937,7 +953,7 @@
               <w:rPr>
                 <w:noProof/>
               </w:rPr>
-              <w:instrText xml:space="preserve"> PAGEREF _Toc243319414 \h </w:instrText>
+              <w:instrText xml:space="preserve"> PAGEREF _Toc243321552 \h </w:instrText>
             </w:r>
             <w:r>
               <w:rPr>
@@ -972,10 +988,14 @@
             </w:tabs>
             <w:ind w:left="440"/>
             <w:rPr>
+              <w:rFonts w:asciiTheme="minorHAnsi" w:hAnsiTheme="minorHAnsi" w:cstheme="minorBidi"/>
               <w:noProof/>
+              <w:kern w:val="2"/>
+              <w:szCs w:val="24"/>
+              <w14:ligatures w14:val="standardContextual"/>
             </w:rPr>
           </w:pPr>
-          <w:hyperlink w:anchor="_Toc243319415" w:history="1">
+          <w:hyperlink w:anchor="_Toc243321553" w:history="1">
             <w:r>
               <w:rPr>
                 <w:rStyle w:val="a5"/>
@@ -999,7 +1019,7 @@
               <w:rPr>
                 <w:noProof/>
               </w:rPr>
-              <w:instrText xml:space="preserve"> PAGEREF _Toc243319415 \h </w:instrText>
+              <w:instrText xml:space="preserve"> PAGEREF _Toc243321553 \h </w:instrText>
             </w:r>
             <w:r>
               <w:rPr>
@@ -1034,10 +1054,14 @@
             </w:tabs>
             <w:ind w:left="440"/>
             <w:rPr>
+              <w:rFonts w:asciiTheme="minorHAnsi" w:hAnsiTheme="minorHAnsi" w:cstheme="minorBidi"/>
               <w:noProof/>
+              <w:kern w:val="2"/>
+              <w:szCs w:val="24"/>
+              <w14:ligatures w14:val="standardContextual"/>
             </w:rPr>
           </w:pPr>
-          <w:hyperlink w:anchor="_Toc243319416" w:history="1">
+          <w:hyperlink w:anchor="_Toc243321554" w:history="1">
             <w:r>
               <w:rPr>
                 <w:rStyle w:val="a5"/>
@@ -1061,7 +1085,7 @@
               <w:rPr>
                 <w:noProof/>
               </w:rPr>
-              <w:instrText xml:space="preserve"> PAGEREF _Toc243319416 \h </w:instrText>
+              <w:instrText xml:space="preserve"> PAGEREF _Toc243321554 \h </w:instrText>
             </w:r>
             <w:r>
               <w:rPr>
@@ -1095,10 +1119,14 @@
               <w:tab w:val="right" w:leader="dot" w:pos="9016"/>
             </w:tabs>
             <w:rPr>
+              <w:rFonts w:asciiTheme="minorHAnsi" w:hAnsiTheme="minorHAnsi" w:cstheme="minorBidi"/>
               <w:noProof/>
+              <w:kern w:val="2"/>
+              <w:szCs w:val="24"/>
+              <w14:ligatures w14:val="standardContextual"/>
             </w:rPr>
           </w:pPr>
-          <w:hyperlink w:anchor="_Toc243319417" w:history="1">
+          <w:hyperlink w:anchor="_Toc243321555" w:history="1">
             <w:r>
               <w:rPr>
                 <w:rStyle w:val="a5"/>
@@ -1122,7 +1150,7 @@
               <w:rPr>
                 <w:noProof/>
               </w:rPr>
-              <w:instrText xml:space="preserve"> PAGEREF _Toc243319417 \h </w:instrText>
+              <w:instrText xml:space="preserve"> PAGEREF _Toc243321555 \h </w:instrText>
             </w:r>
             <w:r>
               <w:rPr>
@@ -1156,10 +1184,14 @@
               <w:tab w:val="right" w:leader="dot" w:pos="9016"/>
             </w:tabs>
             <w:rPr>
+              <w:rFonts w:asciiTheme="minorHAnsi" w:hAnsiTheme="minorHAnsi" w:cstheme="minorBidi"/>
               <w:noProof/>
+              <w:kern w:val="2"/>
+              <w:szCs w:val="24"/>
+              <w14:ligatures w14:val="standardContextual"/>
             </w:rPr>
           </w:pPr>
-          <w:hyperlink w:anchor="_Toc243319418" w:history="1">
+          <w:hyperlink w:anchor="_Toc243321556" w:history="1">
             <w:r>
               <w:rPr>
                 <w:rStyle w:val="a5"/>
@@ -1183,7 +1215,7 @@
               <w:rPr>
                 <w:noProof/>
               </w:rPr>
-              <w:instrText xml:space="preserve"> PAGEREF _Toc243319418 \h </w:instrText>
+              <w:instrText xml:space="preserve"> PAGEREF _Toc243321556 \h </w:instrText>
             </w:r>
             <w:r>
               <w:rPr>
@@ -1218,10 +1250,14 @@
             </w:tabs>
             <w:ind w:left="440"/>
             <w:rPr>
+              <w:rFonts w:asciiTheme="minorHAnsi" w:hAnsiTheme="minorHAnsi" w:cstheme="minorBidi"/>
               <w:noProof/>
+              <w:kern w:val="2"/>
+              <w:szCs w:val="24"/>
+              <w14:ligatures w14:val="standardContextual"/>
             </w:rPr>
           </w:pPr>
-          <w:hyperlink w:anchor="_Toc243319419" w:history="1">
+          <w:hyperlink w:anchor="_Toc243321557" w:history="1">
             <w:r>
               <w:rPr>
                 <w:rStyle w:val="a5"/>
@@ -1245,7 +1281,7 @@
               <w:rPr>
                 <w:noProof/>
               </w:rPr>
-              <w:instrText xml:space="preserve"> PAGEREF _Toc243319419 \h </w:instrText>
+              <w:instrText xml:space="preserve"> PAGEREF _Toc243321557 \h </w:instrText>
             </w:r>
             <w:r>
               <w:rPr>
@@ -1280,10 +1316,14 @@
             </w:tabs>
             <w:ind w:left="440"/>
             <w:rPr>
+              <w:rFonts w:asciiTheme="minorHAnsi" w:hAnsiTheme="minorHAnsi" w:cstheme="minorBidi"/>
               <w:noProof/>
+              <w:kern w:val="2"/>
+              <w:szCs w:val="24"/>
+              <w14:ligatures w14:val="standardContextual"/>
             </w:rPr>
           </w:pPr>
-          <w:hyperlink w:anchor="_Toc243319420" w:history="1">
+          <w:hyperlink w:anchor="_Toc243321558" w:history="1">
             <w:r>
               <w:rPr>
                 <w:rStyle w:val="a5"/>
@@ -1307,7 +1347,7 @@
               <w:rPr>
                 <w:noProof/>
               </w:rPr>
-              <w:instrText xml:space="preserve"> PAGEREF _Toc243319420 \h </w:instrText>
+              <w:instrText xml:space="preserve"> PAGEREF _Toc243321558 \h </w:instrText>
             </w:r>
             <w:r>
               <w:rPr>
@@ -1342,10 +1382,14 @@
             </w:tabs>
             <w:ind w:left="440"/>
             <w:rPr>
+              <w:rFonts w:asciiTheme="minorHAnsi" w:hAnsiTheme="minorHAnsi" w:cstheme="minorBidi"/>
               <w:noProof/>
+              <w:kern w:val="2"/>
+              <w:szCs w:val="24"/>
+              <w14:ligatures w14:val="standardContextual"/>
             </w:rPr>
           </w:pPr>
-          <w:hyperlink w:anchor="_Toc243319421" w:history="1">
+          <w:hyperlink w:anchor="_Toc243321559" w:history="1">
             <w:r>
               <w:rPr>
                 <w:rStyle w:val="a5"/>
@@ -1369,7 +1413,7 @@
               <w:rPr>
                 <w:noProof/>
               </w:rPr>
-              <w:instrText xml:space="preserve"> PAGEREF _Toc243319421 \h </w:instrText>
+              <w:instrText xml:space="preserve"> PAGEREF _Toc243321559 \h </w:instrText>
             </w:r>
             <w:r>
               <w:rPr>
@@ -1404,10 +1448,14 @@
             </w:tabs>
             <w:ind w:left="440"/>
             <w:rPr>
+              <w:rFonts w:asciiTheme="minorHAnsi" w:hAnsiTheme="minorHAnsi" w:cstheme="minorBidi"/>
               <w:noProof/>
+              <w:kern w:val="2"/>
+              <w:szCs w:val="24"/>
+              <w14:ligatures w14:val="standardContextual"/>
             </w:rPr>
           </w:pPr>
-          <w:hyperlink w:anchor="_Toc243319422" w:history="1">
+          <w:hyperlink w:anchor="_Toc243321560" w:history="1">
             <w:r>
               <w:rPr>
                 <w:rStyle w:val="a5"/>
@@ -1431,7 +1479,7 @@
               <w:rPr>
                 <w:noProof/>
               </w:rPr>
-              <w:instrText xml:space="preserve"> PAGEREF _Toc243319422 \h </w:instrText>
+              <w:instrText xml:space="preserve"> PAGEREF _Toc243321560 \h </w:instrText>
             </w:r>
             <w:r>
               <w:rPr>
@@ -1466,10 +1514,14 @@
             </w:tabs>
             <w:ind w:left="440"/>
             <w:rPr>
+              <w:rFonts w:asciiTheme="minorHAnsi" w:hAnsiTheme="minorHAnsi" w:cstheme="minorBidi"/>
               <w:noProof/>
+              <w:kern w:val="2"/>
+              <w:szCs w:val="24"/>
+              <w14:ligatures w14:val="standardContextual"/>
             </w:rPr>
           </w:pPr>
-          <w:hyperlink w:anchor="_Toc243319423" w:history="1">
+          <w:hyperlink w:anchor="_Toc243321561" w:history="1">
             <w:r>
               <w:rPr>
                 <w:rStyle w:val="a5"/>
@@ -1493,7 +1545,7 @@
               <w:rPr>
                 <w:noProof/>
               </w:rPr>
-              <w:instrText xml:space="preserve"> PAGEREF _Toc243319423 \h </w:instrText>
+              <w:instrText xml:space="preserve"> PAGEREF _Toc243321561 \h </w:instrText>
             </w:r>
             <w:r>
               <w:rPr>
@@ -1527,10 +1579,14 @@
               <w:tab w:val="right" w:leader="dot" w:pos="9016"/>
             </w:tabs>
             <w:rPr>
+              <w:rFonts w:asciiTheme="minorHAnsi" w:hAnsiTheme="minorHAnsi" w:cstheme="minorBidi"/>
               <w:noProof/>
+              <w:kern w:val="2"/>
+              <w:szCs w:val="24"/>
+              <w14:ligatures w14:val="standardContextual"/>
             </w:rPr>
           </w:pPr>
-          <w:hyperlink w:anchor="_Toc243319424" w:history="1">
+          <w:hyperlink w:anchor="_Toc243321562" w:history="1">
             <w:r>
               <w:rPr>
                 <w:rStyle w:val="a5"/>
@@ -1554,7 +1610,7 @@
               <w:rPr>
                 <w:noProof/>
               </w:rPr>
-              <w:instrText xml:space="preserve"> PAGEREF _Toc243319424 \h </w:instrText>
+              <w:instrText xml:space="preserve"> PAGEREF _Toc243321562 \h </w:instrText>
             </w:r>
             <w:r>
               <w:rPr>
@@ -1589,10 +1645,14 @@
             </w:tabs>
             <w:ind w:left="440"/>
             <w:rPr>
+              <w:rFonts w:asciiTheme="minorHAnsi" w:hAnsiTheme="minorHAnsi" w:cstheme="minorBidi"/>
               <w:noProof/>
+              <w:kern w:val="2"/>
+              <w:szCs w:val="24"/>
+              <w14:ligatures w14:val="standardContextual"/>
             </w:rPr>
           </w:pPr>
-          <w:hyperlink w:anchor="_Toc243319425" w:history="1">
+          <w:hyperlink w:anchor="_Toc243321563" w:history="1">
             <w:r>
               <w:rPr>
                 <w:rStyle w:val="a5"/>
@@ -1616,7 +1676,7 @@
               <w:rPr>
                 <w:noProof/>
               </w:rPr>
-              <w:instrText xml:space="preserve"> PAGEREF _Toc243319425 \h </w:instrText>
+              <w:instrText xml:space="preserve"> PAGEREF _Toc243321563 \h </w:instrText>
             </w:r>
             <w:r>
               <w:rPr>
@@ -1651,10 +1711,14 @@
             </w:tabs>
             <w:ind w:left="440"/>
             <w:rPr>
+              <w:rFonts w:asciiTheme="minorHAnsi" w:hAnsiTheme="minorHAnsi" w:cstheme="minorBidi"/>
               <w:noProof/>
+              <w:kern w:val="2"/>
+              <w:szCs w:val="24"/>
+              <w14:ligatures w14:val="standardContextual"/>
             </w:rPr>
           </w:pPr>
-          <w:hyperlink w:anchor="_Toc243319426" w:history="1">
+          <w:hyperlink w:anchor="_Toc243321564" w:history="1">
             <w:r>
               <w:rPr>
                 <w:rStyle w:val="a5"/>
@@ -1678,7 +1742,7 @@
               <w:rPr>
                 <w:noProof/>
               </w:rPr>
-              <w:instrText xml:space="preserve"> PAGEREF _Toc243319426 \h </w:instrText>
+              <w:instrText xml:space="preserve"> PAGEREF _Toc243321564 \h </w:instrText>
             </w:r>
             <w:r>
               <w:rPr>
@@ -1713,10 +1777,14 @@
             </w:tabs>
             <w:ind w:left="440"/>
             <w:rPr>
+              <w:rFonts w:asciiTheme="minorHAnsi" w:hAnsiTheme="minorHAnsi" w:cstheme="minorBidi"/>
               <w:noProof/>
+              <w:kern w:val="2"/>
+              <w:szCs w:val="24"/>
+              <w14:ligatures w14:val="standardContextual"/>
             </w:rPr>
           </w:pPr>
-          <w:hyperlink w:anchor="_Toc243319427" w:history="1">
+          <w:hyperlink w:anchor="_Toc243321565" w:history="1">
             <w:r>
               <w:rPr>
                 <w:rStyle w:val="a5"/>
@@ -1740,7 +1808,7 @@
               <w:rPr>
                 <w:noProof/>
               </w:rPr>
-              <w:instrText xml:space="preserve"> PAGEREF _Toc243319427 \h </w:instrText>
+              <w:instrText xml:space="preserve"> PAGEREF _Toc243321565 \h </w:instrText>
             </w:r>
             <w:r>
               <w:rPr>
@@ -1774,10 +1842,14 @@
               <w:tab w:val="right" w:leader="dot" w:pos="9016"/>
             </w:tabs>
             <w:rPr>
+              <w:rFonts w:asciiTheme="minorHAnsi" w:hAnsiTheme="minorHAnsi" w:cstheme="minorBidi"/>
               <w:noProof/>
+              <w:kern w:val="2"/>
+              <w:szCs w:val="24"/>
+              <w14:ligatures w14:val="standardContextual"/>
             </w:rPr>
           </w:pPr>
-          <w:hyperlink w:anchor="_Toc243319428" w:history="1">
+          <w:hyperlink w:anchor="_Toc243321566" w:history="1">
             <w:r>
               <w:rPr>
                 <w:rStyle w:val="a5"/>
@@ -1801,7 +1873,7 @@
               <w:rPr>
                 <w:noProof/>
               </w:rPr>
-              <w:instrText xml:space="preserve"> PAGEREF _Toc243319428 \h </w:instrText>
+              <w:instrText xml:space="preserve"> PAGEREF _Toc243321566 \h </w:instrText>
             </w:r>
             <w:r>
               <w:rPr>
@@ -1836,10 +1908,14 @@
             </w:tabs>
             <w:ind w:left="440"/>
             <w:rPr>
+              <w:rFonts w:asciiTheme="minorHAnsi" w:hAnsiTheme="minorHAnsi" w:cstheme="minorBidi"/>
               <w:noProof/>
+              <w:kern w:val="2"/>
+              <w:szCs w:val="24"/>
+              <w14:ligatures w14:val="standardContextual"/>
             </w:rPr>
           </w:pPr>
-          <w:hyperlink w:anchor="_Toc243319429" w:history="1">
+          <w:hyperlink w:anchor="_Toc243321567" w:history="1">
             <w:r>
               <w:rPr>
                 <w:rStyle w:val="a5"/>
@@ -1863,7 +1939,7 @@
               <w:rPr>
                 <w:noProof/>
               </w:rPr>
-              <w:instrText xml:space="preserve"> PAGEREF _Toc243319429 \h </w:instrText>
+              <w:instrText xml:space="preserve"> PAGEREF _Toc243321567 \h </w:instrText>
             </w:r>
             <w:r>
               <w:rPr>
@@ -1898,10 +1974,14 @@
             </w:tabs>
             <w:ind w:left="440"/>
             <w:rPr>
+              <w:rFonts w:asciiTheme="minorHAnsi" w:hAnsiTheme="minorHAnsi" w:cstheme="minorBidi"/>
               <w:noProof/>
+              <w:kern w:val="2"/>
+              <w:szCs w:val="24"/>
+              <w14:ligatures w14:val="standardContextual"/>
             </w:rPr>
           </w:pPr>
-          <w:hyperlink w:anchor="_Toc243319430" w:history="1">
+          <w:hyperlink w:anchor="_Toc243321568" w:history="1">
             <w:r>
               <w:rPr>
                 <w:rStyle w:val="a5"/>
@@ -1925,7 +2005,7 @@
               <w:rPr>
                 <w:noProof/>
               </w:rPr>
-              <w:instrText xml:space="preserve"> PAGEREF _Toc243319430 \h </w:instrText>
+              <w:instrText xml:space="preserve"> PAGEREF _Toc243321568 \h </w:instrText>
             </w:r>
             <w:r>
               <w:rPr>
@@ -1960,10 +2040,14 @@
             </w:tabs>
             <w:ind w:left="440"/>
             <w:rPr>
+              <w:rFonts w:asciiTheme="minorHAnsi" w:hAnsiTheme="minorHAnsi" w:cstheme="minorBidi"/>
               <w:noProof/>
+              <w:kern w:val="2"/>
+              <w:szCs w:val="24"/>
+              <w14:ligatures w14:val="standardContextual"/>
             </w:rPr>
           </w:pPr>
-          <w:hyperlink w:anchor="_Toc243319431" w:history="1">
+          <w:hyperlink w:anchor="_Toc243321569" w:history="1">
             <w:r>
               <w:rPr>
                 <w:rStyle w:val="a5"/>
@@ -1987,7 +2071,7 @@
               <w:rPr>
                 <w:noProof/>
               </w:rPr>
-              <w:instrText xml:space="preserve"> PAGEREF _Toc243319431 \h </w:instrText>
+              <w:instrText xml:space="preserve"> PAGEREF _Toc243321569 \h </w:instrText>
             </w:r>
             <w:r>
               <w:rPr>
@@ -2022,10 +2106,14 @@
             </w:tabs>
             <w:ind w:left="440"/>
             <w:rPr>
+              <w:rFonts w:asciiTheme="minorHAnsi" w:hAnsiTheme="minorHAnsi" w:cstheme="minorBidi"/>
               <w:noProof/>
+              <w:kern w:val="2"/>
+              <w:szCs w:val="24"/>
+              <w14:ligatures w14:val="standardContextual"/>
             </w:rPr>
           </w:pPr>
-          <w:hyperlink w:anchor="_Toc243319432" w:history="1">
+          <w:hyperlink w:anchor="_Toc243321570" w:history="1">
             <w:r>
               <w:rPr>
                 <w:rStyle w:val="a5"/>
@@ -2049,7 +2137,7 @@
               <w:rPr>
                 <w:noProof/>
               </w:rPr>
-              <w:instrText xml:space="preserve"> PAGEREF _Toc243319432 \h </w:instrText>
+              <w:instrText xml:space="preserve"> PAGEREF _Toc243321570 \h </w:instrText>
             </w:r>
             <w:r>
               <w:rPr>
@@ -2084,10 +2172,14 @@
             </w:tabs>
             <w:ind w:left="440"/>
             <w:rPr>
+              <w:rFonts w:asciiTheme="minorHAnsi" w:hAnsiTheme="minorHAnsi" w:cstheme="minorBidi"/>
               <w:noProof/>
+              <w:kern w:val="2"/>
+              <w:szCs w:val="24"/>
+              <w14:ligatures w14:val="standardContextual"/>
             </w:rPr>
           </w:pPr>
-          <w:hyperlink w:anchor="_Toc243319433" w:history="1">
+          <w:hyperlink w:anchor="_Toc243321571" w:history="1">
             <w:r>
               <w:rPr>
                 <w:rStyle w:val="a5"/>
@@ -2111,7 +2203,7 @@
               <w:rPr>
                 <w:noProof/>
               </w:rPr>
-              <w:instrText xml:space="preserve"> PAGEREF _Toc243319433 \h </w:instrText>
+              <w:instrText xml:space="preserve"> PAGEREF _Toc243321571 \h </w:instrText>
             </w:r>
             <w:r>
               <w:rPr>
@@ -2146,10 +2238,14 @@
             </w:tabs>
             <w:ind w:left="440"/>
             <w:rPr>
+              <w:rFonts w:asciiTheme="minorHAnsi" w:hAnsiTheme="minorHAnsi" w:cstheme="minorBidi"/>
               <w:noProof/>
+              <w:kern w:val="2"/>
+              <w:szCs w:val="24"/>
+              <w14:ligatures w14:val="standardContextual"/>
             </w:rPr>
           </w:pPr>
-          <w:hyperlink w:anchor="_Toc243319434" w:history="1">
+          <w:hyperlink w:anchor="_Toc243321572" w:history="1">
             <w:r>
               <w:rPr>
                 <w:rStyle w:val="a5"/>
@@ -2173,7 +2269,7 @@
               <w:rPr>
                 <w:noProof/>
               </w:rPr>
-              <w:instrText xml:space="preserve"> PAGEREF _Toc243319434 \h </w:instrText>
+              <w:instrText xml:space="preserve"> PAGEREF _Toc243321572 \h </w:instrText>
             </w:r>
             <w:r>
               <w:rPr>
@@ -2208,10 +2304,14 @@
             </w:tabs>
             <w:ind w:left="440"/>
             <w:rPr>
+              <w:rFonts w:asciiTheme="minorHAnsi" w:hAnsiTheme="minorHAnsi" w:cstheme="minorBidi"/>
               <w:noProof/>
+              <w:kern w:val="2"/>
+              <w:szCs w:val="24"/>
+              <w14:ligatures w14:val="standardContextual"/>
             </w:rPr>
           </w:pPr>
-          <w:hyperlink w:anchor="_Toc243319435" w:history="1">
+          <w:hyperlink w:anchor="_Toc243321573" w:history="1">
             <w:r>
               <w:rPr>
                 <w:rStyle w:val="a5"/>
@@ -2235,7 +2335,7 @@
               <w:rPr>
                 <w:noProof/>
               </w:rPr>
-              <w:instrText xml:space="preserve"> PAGEREF _Toc243319435 \h </w:instrText>
+              <w:instrText xml:space="preserve"> PAGEREF _Toc243321573 \h </w:instrText>
             </w:r>
             <w:r>
               <w:rPr>
@@ -2270,10 +2370,14 @@
             </w:tabs>
             <w:ind w:left="440"/>
             <w:rPr>
+              <w:rFonts w:asciiTheme="minorHAnsi" w:hAnsiTheme="minorHAnsi" w:cstheme="minorBidi"/>
               <w:noProof/>
+              <w:kern w:val="2"/>
+              <w:szCs w:val="24"/>
+              <w14:ligatures w14:val="standardContextual"/>
             </w:rPr>
           </w:pPr>
-          <w:hyperlink w:anchor="_Toc243319436" w:history="1">
+          <w:hyperlink w:anchor="_Toc243321574" w:history="1">
             <w:r>
               <w:rPr>
                 <w:rStyle w:val="a5"/>
@@ -2297,7 +2401,7 @@
               <w:rPr>
                 <w:noProof/>
               </w:rPr>
-              <w:instrText xml:space="preserve"> PAGEREF _Toc243319436 \h </w:instrText>
+              <w:instrText xml:space="preserve"> PAGEREF _Toc243321574 \h </w:instrText>
             </w:r>
             <w:r>
               <w:rPr>
@@ -2332,10 +2436,14 @@
             </w:tabs>
             <w:ind w:left="440"/>
             <w:rPr>
+              <w:rFonts w:asciiTheme="minorHAnsi" w:hAnsiTheme="minorHAnsi" w:cstheme="minorBidi"/>
               <w:noProof/>
+              <w:kern w:val="2"/>
+              <w:szCs w:val="24"/>
+              <w14:ligatures w14:val="standardContextual"/>
             </w:rPr>
           </w:pPr>
-          <w:hyperlink w:anchor="_Toc243319437" w:history="1">
+          <w:hyperlink w:anchor="_Toc243321575" w:history="1">
             <w:r>
               <w:rPr>
                 <w:rStyle w:val="a5"/>
@@ -2359,7 +2467,7 @@
               <w:rPr>
                 <w:noProof/>
               </w:rPr>
-              <w:instrText xml:space="preserve"> PAGEREF _Toc243319437 \h </w:instrText>
+              <w:instrText xml:space="preserve"> PAGEREF _Toc243321575 \h </w:instrText>
             </w:r>
             <w:r>
               <w:rPr>
@@ -2393,10 +2501,14 @@
               <w:tab w:val="right" w:leader="dot" w:pos="9016"/>
             </w:tabs>
             <w:rPr>
+              <w:rFonts w:asciiTheme="minorHAnsi" w:hAnsiTheme="minorHAnsi" w:cstheme="minorBidi"/>
               <w:noProof/>
+              <w:kern w:val="2"/>
+              <w:szCs w:val="24"/>
+              <w14:ligatures w14:val="standardContextual"/>
             </w:rPr>
           </w:pPr>
-          <w:hyperlink w:anchor="_Toc243319438" w:history="1">
+          <w:hyperlink w:anchor="_Toc243321576" w:history="1">
             <w:r>
               <w:rPr>
                 <w:rStyle w:val="a5"/>
@@ -2420,7 +2532,7 @@
               <w:rPr>
                 <w:noProof/>
               </w:rPr>
-              <w:instrText xml:space="preserve"> PAGEREF _Toc243319438 \h </w:instrText>
+              <w:instrText xml:space="preserve"> PAGEREF _Toc243321576 \h </w:instrText>
             </w:r>
             <w:r>
               <w:rPr>
@@ -2455,10 +2567,14 @@
             </w:tabs>
             <w:ind w:left="440"/>
             <w:rPr>
+              <w:rFonts w:asciiTheme="minorHAnsi" w:hAnsiTheme="minorHAnsi" w:cstheme="minorBidi"/>
               <w:noProof/>
+              <w:kern w:val="2"/>
+              <w:szCs w:val="24"/>
+              <w14:ligatures w14:val="standardContextual"/>
             </w:rPr>
           </w:pPr>
-          <w:hyperlink w:anchor="_Toc243319439" w:history="1">
+          <w:hyperlink w:anchor="_Toc243321577" w:history="1">
             <w:r>
               <w:rPr>
                 <w:rStyle w:val="a5"/>
@@ -2482,7 +2598,7 @@
               <w:rPr>
                 <w:noProof/>
               </w:rPr>
-              <w:instrText xml:space="preserve"> PAGEREF _Toc243319439 \h </w:instrText>
+              <w:instrText xml:space="preserve"> PAGEREF _Toc243321577 \h </w:instrText>
             </w:r>
             <w:r>
               <w:rPr>
@@ -2517,10 +2633,14 @@
             </w:tabs>
             <w:ind w:left="440"/>
             <w:rPr>
+              <w:rFonts w:asciiTheme="minorHAnsi" w:hAnsiTheme="minorHAnsi" w:cstheme="minorBidi"/>
               <w:noProof/>
+              <w:kern w:val="2"/>
+              <w:szCs w:val="24"/>
+              <w14:ligatures w14:val="standardContextual"/>
             </w:rPr>
           </w:pPr>
-          <w:hyperlink w:anchor="_Toc243319440" w:history="1">
+          <w:hyperlink w:anchor="_Toc243321578" w:history="1">
             <w:r>
               <w:rPr>
                 <w:rStyle w:val="a5"/>
@@ -2544,7 +2664,7 @@
               <w:rPr>
                 <w:noProof/>
               </w:rPr>
-              <w:instrText xml:space="preserve"> PAGEREF _Toc243319440 \h </w:instrText>
+              <w:instrText xml:space="preserve"> PAGEREF _Toc243321578 \h </w:instrText>
             </w:r>
             <w:r>
               <w:rPr>
@@ -2579,10 +2699,14 @@
             </w:tabs>
             <w:ind w:left="440"/>
             <w:rPr>
+              <w:rFonts w:asciiTheme="minorHAnsi" w:hAnsiTheme="minorHAnsi" w:cstheme="minorBidi"/>
               <w:noProof/>
+              <w:kern w:val="2"/>
+              <w:szCs w:val="24"/>
+              <w14:ligatures w14:val="standardContextual"/>
             </w:rPr>
           </w:pPr>
-          <w:hyperlink w:anchor="_Toc243319441" w:history="1">
+          <w:hyperlink w:anchor="_Toc243321579" w:history="1">
             <w:r>
               <w:rPr>
                 <w:rStyle w:val="a5"/>
@@ -2606,7 +2730,7 @@
               <w:rPr>
                 <w:noProof/>
               </w:rPr>
-              <w:instrText xml:space="preserve"> PAGEREF _Toc243319441 \h </w:instrText>
+              <w:instrText xml:space="preserve"> PAGEREF _Toc243321579 \h </w:instrText>
             </w:r>
             <w:r>
               <w:rPr>
@@ -2641,10 +2765,14 @@
             </w:tabs>
             <w:ind w:left="440"/>
             <w:rPr>
+              <w:rFonts w:asciiTheme="minorHAnsi" w:hAnsiTheme="minorHAnsi" w:cstheme="minorBidi"/>
               <w:noProof/>
+              <w:kern w:val="2"/>
+              <w:szCs w:val="24"/>
+              <w14:ligatures w14:val="standardContextual"/>
             </w:rPr>
           </w:pPr>
-          <w:hyperlink w:anchor="_Toc243319442" w:history="1">
+          <w:hyperlink w:anchor="_Toc243321580" w:history="1">
             <w:r>
               <w:rPr>
                 <w:rStyle w:val="a5"/>
@@ -2668,7 +2796,7 @@
               <w:rPr>
                 <w:noProof/>
               </w:rPr>
-              <w:instrText xml:space="preserve"> PAGEREF _Toc243319442 \h </w:instrText>
+              <w:instrText xml:space="preserve"> PAGEREF _Toc243321580 \h </w:instrText>
             </w:r>
             <w:r>
               <w:rPr>
@@ -2703,10 +2831,14 @@
             </w:tabs>
             <w:ind w:left="440"/>
             <w:rPr>
+              <w:rFonts w:asciiTheme="minorHAnsi" w:hAnsiTheme="minorHAnsi" w:cstheme="minorBidi"/>
               <w:noProof/>
+              <w:kern w:val="2"/>
+              <w:szCs w:val="24"/>
+              <w14:ligatures w14:val="standardContextual"/>
             </w:rPr>
           </w:pPr>
-          <w:hyperlink w:anchor="_Toc243319443" w:history="1">
+          <w:hyperlink w:anchor="_Toc243321581" w:history="1">
             <w:r>
               <w:rPr>
                 <w:rStyle w:val="a5"/>
@@ -2730,7 +2862,7 @@
               <w:rPr>
                 <w:noProof/>
               </w:rPr>
-              <w:instrText xml:space="preserve"> PAGEREF _Toc243319443 \h </w:instrText>
+              <w:instrText xml:space="preserve"> PAGEREF _Toc243321581 \h </w:instrText>
             </w:r>
             <w:r>
               <w:rPr>
@@ -2765,10 +2897,14 @@
             </w:tabs>
             <w:ind w:left="440"/>
             <w:rPr>
+              <w:rFonts w:asciiTheme="minorHAnsi" w:hAnsiTheme="minorHAnsi" w:cstheme="minorBidi"/>
               <w:noProof/>
+              <w:kern w:val="2"/>
+              <w:szCs w:val="24"/>
+              <w14:ligatures w14:val="standardContextual"/>
             </w:rPr>
           </w:pPr>
-          <w:hyperlink w:anchor="_Toc243319444" w:history="1">
+          <w:hyperlink w:anchor="_Toc243321582" w:history="1">
             <w:r>
               <w:rPr>
                 <w:rStyle w:val="a5"/>
@@ -2792,7 +2928,7 @@
               <w:rPr>
                 <w:noProof/>
               </w:rPr>
-              <w:instrText xml:space="preserve"> PAGEREF _Toc243319444 \h </w:instrText>
+              <w:instrText xml:space="preserve"> PAGEREF _Toc243321582 \h </w:instrText>
             </w:r>
             <w:r>
               <w:rPr>
@@ -2826,10 +2962,14 @@
               <w:tab w:val="right" w:leader="dot" w:pos="9016"/>
             </w:tabs>
             <w:rPr>
+              <w:rFonts w:asciiTheme="minorHAnsi" w:hAnsiTheme="minorHAnsi" w:cstheme="minorBidi"/>
               <w:noProof/>
+              <w:kern w:val="2"/>
+              <w:szCs w:val="24"/>
+              <w14:ligatures w14:val="standardContextual"/>
             </w:rPr>
           </w:pPr>
-          <w:hyperlink w:anchor="_Toc243319445" w:history="1">
+          <w:hyperlink w:anchor="_Toc243321583" w:history="1">
             <w:r>
               <w:rPr>
                 <w:rStyle w:val="a5"/>
@@ -2853,7 +2993,7 @@
               <w:rPr>
                 <w:noProof/>
               </w:rPr>
-              <w:instrText xml:space="preserve"> PAGEREF _Toc243319445 \h </w:instrText>
+              <w:instrText xml:space="preserve"> PAGEREF _Toc243321583 \h </w:instrText>
             </w:r>
             <w:r>
               <w:rPr>
@@ -2887,10 +3027,14 @@
               <w:tab w:val="right" w:leader="dot" w:pos="9016"/>
             </w:tabs>
             <w:rPr>
+              <w:rFonts w:asciiTheme="minorHAnsi" w:hAnsiTheme="minorHAnsi" w:cstheme="minorBidi"/>
               <w:noProof/>
+              <w:kern w:val="2"/>
+              <w:szCs w:val="24"/>
+              <w14:ligatures w14:val="standardContextual"/>
             </w:rPr>
           </w:pPr>
-          <w:hyperlink w:anchor="_Toc243319446" w:history="1">
+          <w:hyperlink w:anchor="_Toc243321584" w:history="1">
             <w:r>
               <w:rPr>
                 <w:rStyle w:val="a5"/>
@@ -2914,7 +3058,7 @@
               <w:rPr>
                 <w:noProof/>
               </w:rPr>
-              <w:instrText xml:space="preserve"> PAGEREF _Toc243319446 \h </w:instrText>
+              <w:instrText xml:space="preserve"> PAGEREF _Toc243321584 \h </w:instrText>
             </w:r>
             <w:r>
               <w:rPr>
@@ -2949,10 +3093,14 @@
             </w:tabs>
             <w:ind w:left="440"/>
             <w:rPr>
+              <w:rFonts w:asciiTheme="minorHAnsi" w:hAnsiTheme="minorHAnsi" w:cstheme="minorBidi"/>
               <w:noProof/>
+              <w:kern w:val="2"/>
+              <w:szCs w:val="24"/>
+              <w14:ligatures w14:val="standardContextual"/>
             </w:rPr>
           </w:pPr>
-          <w:hyperlink w:anchor="_Toc243319447" w:history="1">
+          <w:hyperlink w:anchor="_Toc243321585" w:history="1">
             <w:r>
               <w:rPr>
                 <w:rStyle w:val="a5"/>
@@ -2976,7 +3124,7 @@
               <w:rPr>
                 <w:noProof/>
               </w:rPr>
-              <w:instrText xml:space="preserve"> PAGEREF _Toc243319447 \h </w:instrText>
+              <w:instrText xml:space="preserve"> PAGEREF _Toc243321585 \h </w:instrText>
             </w:r>
             <w:r>
               <w:rPr>
@@ -3011,10 +3159,14 @@
             </w:tabs>
             <w:ind w:left="440"/>
             <w:rPr>
+              <w:rFonts w:asciiTheme="minorHAnsi" w:hAnsiTheme="minorHAnsi" w:cstheme="minorBidi"/>
               <w:noProof/>
+              <w:kern w:val="2"/>
+              <w:szCs w:val="24"/>
+              <w14:ligatures w14:val="standardContextual"/>
             </w:rPr>
           </w:pPr>
-          <w:hyperlink w:anchor="_Toc243319448" w:history="1">
+          <w:hyperlink w:anchor="_Toc243321586" w:history="1">
             <w:r>
               <w:rPr>
                 <w:rStyle w:val="a5"/>
@@ -3038,7 +3190,7 @@
               <w:rPr>
                 <w:noProof/>
               </w:rPr>
-              <w:instrText xml:space="preserve"> PAGEREF _Toc243319448 \h </w:instrText>
+              <w:instrText xml:space="preserve"> PAGEREF _Toc243321586 \h </w:instrText>
             </w:r>
             <w:r>
               <w:rPr>
@@ -3073,10 +3225,14 @@
             </w:tabs>
             <w:ind w:left="440"/>
             <w:rPr>
+              <w:rFonts w:asciiTheme="minorHAnsi" w:hAnsiTheme="minorHAnsi" w:cstheme="minorBidi"/>
               <w:noProof/>
+              <w:kern w:val="2"/>
+              <w:szCs w:val="24"/>
+              <w14:ligatures w14:val="standardContextual"/>
             </w:rPr>
           </w:pPr>
-          <w:hyperlink w:anchor="_Toc243319449" w:history="1">
+          <w:hyperlink w:anchor="_Toc243321587" w:history="1">
             <w:r>
               <w:rPr>
                 <w:rStyle w:val="a5"/>
@@ -3100,7 +3256,7 @@
               <w:rPr>
                 <w:noProof/>
               </w:rPr>
-              <w:instrText xml:space="preserve"> PAGEREF _Toc243319449 \h </w:instrText>
+              <w:instrText xml:space="preserve"> PAGEREF _Toc243321587 \h </w:instrText>
             </w:r>
             <w:r>
               <w:rPr>
@@ -3135,10 +3291,14 @@
             </w:tabs>
             <w:ind w:left="440"/>
             <w:rPr>
+              <w:rFonts w:asciiTheme="minorHAnsi" w:hAnsiTheme="minorHAnsi" w:cstheme="minorBidi"/>
               <w:noProof/>
+              <w:kern w:val="2"/>
+              <w:szCs w:val="24"/>
+              <w14:ligatures w14:val="standardContextual"/>
             </w:rPr>
           </w:pPr>
-          <w:hyperlink w:anchor="_Toc243319450" w:history="1">
+          <w:hyperlink w:anchor="_Toc243321588" w:history="1">
             <w:r>
               <w:rPr>
                 <w:rStyle w:val="a5"/>
@@ -3162,7 +3322,7 @@
               <w:rPr>
                 <w:noProof/>
               </w:rPr>
-              <w:instrText xml:space="preserve"> PAGEREF _Toc243319450 \h </w:instrText>
+              <w:instrText xml:space="preserve"> PAGEREF _Toc243321588 \h </w:instrText>
             </w:r>
             <w:r>
               <w:rPr>
@@ -3196,10 +3356,14 @@
               <w:tab w:val="right" w:leader="dot" w:pos="9016"/>
             </w:tabs>
             <w:rPr>
+              <w:rFonts w:asciiTheme="minorHAnsi" w:hAnsiTheme="minorHAnsi" w:cstheme="minorBidi"/>
               <w:noProof/>
+              <w:kern w:val="2"/>
+              <w:szCs w:val="24"/>
+              <w14:ligatures w14:val="standardContextual"/>
             </w:rPr>
           </w:pPr>
-          <w:hyperlink w:anchor="_Toc243319451" w:history="1">
+          <w:hyperlink w:anchor="_Toc243321589" w:history="1">
             <w:r>
               <w:rPr>
                 <w:rStyle w:val="a5"/>
@@ -3223,7 +3387,7 @@
               <w:rPr>
                 <w:noProof/>
               </w:rPr>
-              <w:instrText xml:space="preserve"> PAGEREF _Toc243319451 \h </w:instrText>
+              <w:instrText xml:space="preserve"> PAGEREF _Toc243321589 \h </w:instrText>
             </w:r>
             <w:r>
               <w:rPr>
@@ -3257,10 +3421,14 @@
               <w:tab w:val="right" w:leader="dot" w:pos="9016"/>
             </w:tabs>
             <w:rPr>
+              <w:rFonts w:asciiTheme="minorHAnsi" w:hAnsiTheme="minorHAnsi" w:cstheme="minorBidi"/>
               <w:noProof/>
+              <w:kern w:val="2"/>
+              <w:szCs w:val="24"/>
+              <w14:ligatures w14:val="standardContextual"/>
             </w:rPr>
           </w:pPr>
-          <w:hyperlink w:anchor="_Toc243319452" w:history="1">
+          <w:hyperlink w:anchor="_Toc243321590" w:history="1">
             <w:r>
               <w:rPr>
                 <w:rStyle w:val="a5"/>
@@ -3284,7 +3452,7 @@
               <w:rPr>
                 <w:noProof/>
               </w:rPr>
-              <w:instrText xml:space="preserve"> PAGEREF _Toc243319452 \h </w:instrText>
+              <w:instrText xml:space="preserve"> PAGEREF _Toc243321590 \h </w:instrText>
             </w:r>
             <w:r>
               <w:rPr>
@@ -3318,10 +3486,14 @@
               <w:tab w:val="right" w:leader="dot" w:pos="9016"/>
             </w:tabs>
             <w:rPr>
+              <w:rFonts w:asciiTheme="minorHAnsi" w:hAnsiTheme="minorHAnsi" w:cstheme="minorBidi"/>
               <w:noProof/>
+              <w:kern w:val="2"/>
+              <w:szCs w:val="24"/>
+              <w14:ligatures w14:val="standardContextual"/>
             </w:rPr>
           </w:pPr>
-          <w:hyperlink w:anchor="_Toc243319453" w:history="1">
+          <w:hyperlink w:anchor="_Toc243321591" w:history="1">
             <w:r>
               <w:rPr>
                 <w:rStyle w:val="a5"/>
@@ -3345,7 +3517,7 @@
               <w:rPr>
                 <w:noProof/>
               </w:rPr>
-              <w:instrText xml:space="preserve"> PAGEREF _Toc243319453 \h </w:instrText>
+              <w:instrText xml:space="preserve"> PAGEREF _Toc243321591 \h </w:instrText>
             </w:r>
             <w:r>
               <w:rPr>
@@ -3379,10 +3551,14 @@
               <w:tab w:val="right" w:leader="dot" w:pos="9016"/>
             </w:tabs>
             <w:rPr>
+              <w:rFonts w:asciiTheme="minorHAnsi" w:hAnsiTheme="minorHAnsi" w:cstheme="minorBidi"/>
               <w:noProof/>
+              <w:kern w:val="2"/>
+              <w:szCs w:val="24"/>
+              <w14:ligatures w14:val="standardContextual"/>
             </w:rPr>
           </w:pPr>
-          <w:hyperlink w:anchor="_Toc243319454" w:history="1">
+          <w:hyperlink w:anchor="_Toc243321592" w:history="1">
             <w:r>
               <w:rPr>
                 <w:rStyle w:val="a5"/>
@@ -3406,7 +3582,7 @@
               <w:rPr>
                 <w:noProof/>
               </w:rPr>
-              <w:instrText xml:space="preserve"> PAGEREF _Toc243319454 \h </w:instrText>
+              <w:instrText xml:space="preserve"> PAGEREF _Toc243321592 \h </w:instrText>
             </w:r>
             <w:r>
               <w:rPr>
@@ -3441,10 +3617,14 @@
             </w:tabs>
             <w:ind w:left="440"/>
             <w:rPr>
+              <w:rFonts w:asciiTheme="minorHAnsi" w:hAnsiTheme="minorHAnsi" w:cstheme="minorBidi"/>
               <w:noProof/>
+              <w:kern w:val="2"/>
+              <w:szCs w:val="24"/>
+              <w14:ligatures w14:val="standardContextual"/>
             </w:rPr>
           </w:pPr>
-          <w:hyperlink w:anchor="_Toc243319455" w:history="1">
+          <w:hyperlink w:anchor="_Toc243321593" w:history="1">
             <w:r>
               <w:rPr>
                 <w:rStyle w:val="a5"/>
@@ -3468,7 +3648,7 @@
               <w:rPr>
                 <w:noProof/>
               </w:rPr>
-              <w:instrText xml:space="preserve"> PAGEREF _Toc243319455 \h </w:instrText>
+              <w:instrText xml:space="preserve"> PAGEREF _Toc243321593 \h </w:instrText>
             </w:r>
             <w:r>
               <w:rPr>
@@ -3507,7 +3687,7 @@
         <w:pStyle w:val="1"/>
         <w:pageBreakBefore/>
       </w:pPr>
-      <w:bookmarkStart w:id="0" w:name="_Toc243319411"/>
+      <w:bookmarkStart w:id="0" w:name="_Toc243321549"/>
       <w:r>
         <w:lastRenderedPageBreak/>
         <w:t>1. Introduction</w:t>
@@ -3518,7 +3698,7 @@
       <w:pPr>
         <w:pStyle w:val="2"/>
       </w:pPr>
-      <w:bookmarkStart w:id="1" w:name="_Toc243319412"/>
+      <w:bookmarkStart w:id="1" w:name="_Toc243321550"/>
       <w:r>
         <w:t>1.1 Purpose of the project</w:t>
       </w:r>
@@ -3561,7 +3741,7 @@
       <w:pPr>
         <w:pStyle w:val="2"/>
       </w:pPr>
-      <w:bookmarkStart w:id="2" w:name="_Toc243319413"/>
+      <w:bookmarkStart w:id="2" w:name="_Toc243321551"/>
       <w:r>
         <w:t>1.2 Who will use it</w:t>
       </w:r>
@@ -3579,7 +3759,7 @@
       <w:pPr>
         <w:pStyle w:val="2"/>
       </w:pPr>
-      <w:bookmarkStart w:id="3" w:name="_Toc243319414"/>
+      <w:bookmarkStart w:id="3" w:name="_Toc243321552"/>
       <w:r>
         <w:t>1.3 Goals</w:t>
       </w:r>
@@ -3662,7 +3842,7 @@
       <w:pPr>
         <w:pStyle w:val="2"/>
       </w:pPr>
-      <w:bookmarkStart w:id="4" w:name="_Toc243319415"/>
+      <w:bookmarkStart w:id="4" w:name="_Toc243321553"/>
       <w:r>
         <w:t>1.4 Team and module ownership</w:t>
       </w:r>
@@ -4316,7 +4496,7 @@
       <w:pPr>
         <w:pStyle w:val="2"/>
       </w:pPr>
-      <w:bookmarkStart w:id="5" w:name="_Toc243319416"/>
+      <w:bookmarkStart w:id="5" w:name="_Toc243321554"/>
       <w:r>
         <w:t>1.5 Use of generative AI</w:t>
       </w:r>
@@ -4349,7 +4529,7 @@
         <w:pStyle w:val="1"/>
         <w:pageBreakBefore/>
       </w:pPr>
-      <w:bookmarkStart w:id="6" w:name="_Toc243319417"/>
+      <w:bookmarkStart w:id="6" w:name="_Toc243321555"/>
       <w:r>
         <w:lastRenderedPageBreak/>
         <w:t>2. Background</w:t>
@@ -4369,10 +4549,7 @@
         <w:spacing w:after="140" w:line="300" w:lineRule="auto"/>
       </w:pPr>
       <w:r>
-        <w:t>Large language models make a new kind of agent possible. ReAct showed that a model can interleave reasoning with actions such as searching (Yao et al., 2023), and Wang et al. (2024) survey the growing field of LLM-based autonomous agents, which plan, use tools and act on behalf of a user. The same models can also produce fluent text that is not true, a problem known as hallucination (Ji et al., 2023). For a shopping agent, an invented price or product would be worse than no answer at all. This shaped the mo</w:t>
-      </w:r>
-      <w:r>
-        <w:t xml:space="preserve">st important design rule of our system: </w:t>
+        <w:t xml:space="preserve">Large language models make a new kind of agent possible. ReAct showed that a model can interleave reasoning with actions such as searching (Yao et al., 2023), and Wang et al. (2024) survey the growing field of LLM-based autonomous agents, which plan, use tools and act on behalf of a user. The same models can also produce fluent text that is not true, a problem known as hallucination (Ji et al., 2023). For a shopping agent, an invented price or product would be worse than no answer at all. This shaped the most important design rule of our system: </w:t>
       </w:r>
       <w:r>
         <w:rPr>
@@ -4398,7 +4575,7 @@
         <w:pStyle w:val="1"/>
         <w:pageBreakBefore/>
       </w:pPr>
-      <w:bookmarkStart w:id="7" w:name="_Toc243319418"/>
+      <w:bookmarkStart w:id="7" w:name="_Toc243321556"/>
       <w:r>
         <w:lastRenderedPageBreak/>
         <w:t>3. Project evolution and key decisions</w:t>
@@ -4417,7 +4594,7 @@
       <w:pPr>
         <w:pStyle w:val="2"/>
       </w:pPr>
-      <w:bookmarkStart w:id="8" w:name="_Toc243319419"/>
+      <w:bookmarkStart w:id="8" w:name="_Toc243321557"/>
       <w:r>
         <w:t>3.1 The original approach: scraping each retailer</w:t>
       </w:r>
@@ -4435,7 +4612,7 @@
       <w:pPr>
         <w:pStyle w:val="2"/>
       </w:pPr>
-      <w:bookmarkStart w:id="9" w:name="_Toc243319420"/>
+      <w:bookmarkStart w:id="9" w:name="_Toc243321558"/>
       <w:r>
         <w:t>3.2 What went wrong</w:t>
       </w:r>
@@ -4500,7 +4677,7 @@
       <w:pPr>
         <w:pStyle w:val="2"/>
       </w:pPr>
-      <w:bookmarkStart w:id="10" w:name="_Toc243319421"/>
+      <w:bookmarkStart w:id="10" w:name="_Toc243321559"/>
       <w:r>
         <w:t>3.3 Decision: read Google Shopping through search APIs</w:t>
       </w:r>
@@ -4546,7 +4723,7 @@
       <w:pPr>
         <w:pStyle w:val="2"/>
       </w:pPr>
-      <w:bookmarkStart w:id="11" w:name="_Toc243319422"/>
+      <w:bookmarkStart w:id="11" w:name="_Toc243321560"/>
       <w:r>
         <w:t>3.4 Decision: a pipeline of single-purpose AI agents</w:t>
       </w:r>
@@ -4586,7 +4763,7 @@
       <w:pPr>
         <w:pStyle w:val="2"/>
       </w:pPr>
-      <w:bookmarkStart w:id="12" w:name="_Toc243319423"/>
+      <w:bookmarkStart w:id="12" w:name="_Toc243321561"/>
       <w:r>
         <w:t>3.5 Other decisions</w:t>
       </w:r>
@@ -5151,7 +5328,7 @@
         <w:pStyle w:val="1"/>
         <w:pageBreakBefore/>
       </w:pPr>
-      <w:bookmarkStart w:id="13" w:name="_Toc243319424"/>
+      <w:bookmarkStart w:id="13" w:name="_Toc243321562"/>
       <w:r>
         <w:lastRenderedPageBreak/>
         <w:t>4. System design</w:t>
@@ -5162,7 +5339,7 @@
       <w:pPr>
         <w:pStyle w:val="2"/>
       </w:pPr>
-      <w:bookmarkStart w:id="14" w:name="_Toc243319425"/>
+      <w:bookmarkStart w:id="14" w:name="_Toc243321563"/>
       <w:r>
         <w:t>4.1 Architecture</w:t>
       </w:r>
@@ -5197,7 +5374,7 @@
           <w:noProof/>
         </w:rPr>
         <w:drawing>
-          <wp:inline distT="0" distB="0" distL="0" distR="0" wp14:anchorId="71B887EF" wp14:editId="4F43D0A3">
+          <wp:inline distT="0" distB="0" distL="0" distR="0" wp14:anchorId="10F38098" wp14:editId="6898FB84">
             <wp:extent cx="5715000" cy="2105025"/>
             <wp:effectExtent l="0" t="0" r="0" b="0"/>
             <wp:docPr id="1" name="architecture.png" descr="Architecture: four layers connected by an integration layer, and the external services the system uses." title="Figure 1"/>
@@ -5263,7 +5440,7 @@
       <w:pPr>
         <w:pStyle w:val="2"/>
       </w:pPr>
-      <w:bookmarkStart w:id="15" w:name="_Toc243319426"/>
+      <w:bookmarkStart w:id="15" w:name="_Toc243321564"/>
       <w:r>
         <w:t>4.2 Main flows</w:t>
       </w:r>
@@ -5307,7 +5484,7 @@
           <w:noProof/>
         </w:rPr>
         <w:drawing>
-          <wp:inline distT="0" distB="0" distL="0" distR="0" wp14:anchorId="77A7DDF2" wp14:editId="7DFA79DB">
+          <wp:inline distT="0" distB="0" distL="0" distR="0" wp14:anchorId="4FF5EEEA" wp14:editId="28DB596E">
             <wp:extent cx="5715000" cy="1771650"/>
             <wp:effectExtent l="0" t="0" r="0" b="0"/>
             <wp:docPr id="2" name="pipeline.png" descr="The Find pipeline (top) and the monitoring flow (bottom). Purple boxes are AI agents; all decisions about deals and emails are made in code." title="Figure 2"/>
@@ -5373,7 +5550,7 @@
       <w:pPr>
         <w:pStyle w:val="2"/>
       </w:pPr>
-      <w:bookmarkStart w:id="16" w:name="_Toc243319427"/>
+      <w:bookmarkStart w:id="16" w:name="_Toc243321565"/>
       <w:r>
         <w:t>4.3 Technologies</w:t>
       </w:r>
@@ -6431,7 +6608,7 @@
         <w:pStyle w:val="1"/>
         <w:pageBreakBefore/>
       </w:pPr>
-      <w:bookmarkStart w:id="17" w:name="_Toc243319428"/>
+      <w:bookmarkStart w:id="17" w:name="_Toc243321566"/>
       <w:r>
         <w:lastRenderedPageBreak/>
         <w:t>5. Implementation</w:t>
@@ -6442,7 +6619,7 @@
       <w:pPr>
         <w:pStyle w:val="2"/>
       </w:pPr>
-      <w:bookmarkStart w:id="18" w:name="_Toc243319429"/>
+      <w:bookmarkStart w:id="18" w:name="_Toc243321567"/>
       <w:r>
         <w:t>5.1 The eight AI agents</w:t>
       </w:r>
@@ -7320,7 +7497,7 @@
       <w:pPr>
         <w:pStyle w:val="2"/>
       </w:pPr>
-      <w:bookmarkStart w:id="19" w:name="_Toc243319430"/>
+      <w:bookmarkStart w:id="19" w:name="_Toc243321568"/>
       <w:r>
         <w:t>5.2 Connecting the agents with LangGraph</w:t>
       </w:r>
@@ -7644,7 +7821,7 @@
       <w:pPr>
         <w:pStyle w:val="2"/>
       </w:pPr>
-      <w:bookmarkStart w:id="20" w:name="_Toc243319431"/>
+      <w:bookmarkStart w:id="20" w:name="_Toc243321569"/>
       <w:r>
         <w:t>5.3 One validated entry point for the model</w:t>
       </w:r>
@@ -7776,7 +7953,7 @@
       <w:pPr>
         <w:pStyle w:val="2"/>
       </w:pPr>
-      <w:bookmarkStart w:id="21" w:name="_Toc243319432"/>
+      <w:bookmarkStart w:id="21" w:name="_Toc243321570"/>
       <w:r>
         <w:t>5.4 Data providers and price verification</w:t>
       </w:r>
@@ -7813,7 +7990,7 @@
       <w:pPr>
         <w:pStyle w:val="2"/>
       </w:pPr>
-      <w:bookmarkStart w:id="22" w:name="_Toc243319433"/>
+      <w:bookmarkStart w:id="22" w:name="_Toc243321571"/>
       <w:r>
         <w:t>5.5 Same-product matching</w:t>
       </w:r>
@@ -7842,7 +8019,7 @@
       <w:pPr>
         <w:pStyle w:val="2"/>
       </w:pPr>
-      <w:bookmarkStart w:id="23" w:name="_Toc243319434"/>
+      <w:bookmarkStart w:id="23" w:name="_Toc243321572"/>
       <w:r>
         <w:t>5.6 Monitoring and alerts</w:t>
       </w:r>
@@ -7854,10 +8031,7 @@
       </w:pPr>
       <w:r>
         <w:lastRenderedPageBreak/>
-        <w:t>Each scheduled check runs one shared Google Shopping search for the whole task, however many merchants it watches, and reads each merchant's current price by product identifier. If a merchant is missing from the results, at most two retry searches and two detail lookups are made. The scheduler then excludes offers the verifier marked as different, takes the cheapest offer from a trusted merchant, and decides in code whether it is a deal: the price is at or below the target, or it has dropped by a chosen per</w:t>
-      </w:r>
-      <w:r>
-        <w:t>centage since the last alert.</w:t>
+        <w:t>Each scheduled check runs one shared Google Shopping search for the whole task, however many merchants it watches, and reads each merchant's current price by product identifier. If a merchant is missing from the results, at most two retry searches and two detail lookups are made. The scheduler then excludes offers the verifier marked as different, takes the cheapest offer from a trusted merchant, and decides in code whether it is a deal: the price is at or below the target, or it has dropped by a chosen percentage since the last alert.</w:t>
       </w:r>
     </w:p>
     <w:p>
@@ -7883,7 +8057,7 @@
       <w:pPr>
         <w:pStyle w:val="2"/>
       </w:pPr>
-      <w:bookmarkStart w:id="24" w:name="_Toc243319435"/>
+      <w:bookmarkStart w:id="24" w:name="_Toc243321573"/>
       <w:r>
         <w:t>5.7 Web interface and email</w:t>
       </w:r>
@@ -7907,7 +8081,7 @@
           <w:noProof/>
         </w:rPr>
         <w:drawing>
-          <wp:inline distT="0" distB="0" distL="0" distR="0" wp14:anchorId="0D21CAF6" wp14:editId="6473F158">
+          <wp:inline distT="0" distB="0" distL="0" distR="0" wp14:anchorId="0202A350" wp14:editId="3A3FD914">
             <wp:extent cx="5715000" cy="3838575"/>
             <wp:effectExtent l="0" t="0" r="0" b="0"/>
             <wp:docPr id="3" name="find.png" descr="A real search for &quot;noise cancelling headphones under NZD 400&quot;: the search terms written by the Rewrite agent, and product cards with bilingual summaries." title="Figure 3"/>
@@ -7980,7 +8154,7 @@
         </w:rPr>
         <w:lastRenderedPageBreak/>
         <w:drawing>
-          <wp:inline distT="0" distB="0" distL="0" distR="0" wp14:anchorId="4EFE9CBA" wp14:editId="18CF6AA8">
+          <wp:inline distT="0" distB="0" distL="0" distR="0" wp14:anchorId="3E77A3C4" wp14:editId="0ED27C55">
             <wp:extent cx="5715000" cy="3838575"/>
             <wp:effectExtent l="0" t="0" r="0" b="0"/>
             <wp:docPr id="4" name="preview.png" descr="Compare and monitor: the same product at other merchants, checked by the offer verifier (&quot;AI: same product&quot;). Trusted merchants are ticked by default." title="Figure 4"/>
@@ -8052,7 +8226,7 @@
           <w:noProof/>
         </w:rPr>
         <w:drawing>
-          <wp:inline distT="0" distB="0" distL="0" distR="0" wp14:anchorId="683B75C3" wp14:editId="4C21A5A9">
+          <wp:inline distT="0" distB="0" distL="0" distR="0" wp14:anchorId="3BF89276" wp14:editId="4A177A94">
             <wp:extent cx="5715000" cy="3838575"/>
             <wp:effectExtent l="0" t="0" r="0" b="0"/>
             <wp:docPr id="5" name="detail.png" descr="A real monitor for the Fitbit Charge 6 at two merchants, with its price trend from 6 to 14 October 2026 and the 30-day comparison. The owner's email address is hidden." title="Figure 5"/>
@@ -8149,101 +8323,37 @@
           <w:sz w:val="17"/>
           <w:szCs w:val="17"/>
         </w:rPr>
-        <w:t xml:space="preserve">Subject: [Bargain Agent] </w:t>
-      </w:r>
+        <w:t>Subject: [Bargain Agent] 降价提醒：Fitbit Charge 6 Fitness Tracker — NZD 275.00 @ Harvey Norman New Zealand</w:t>
+      </w:r>
+    </w:p>
+    <w:p>
+      <w:pPr>
+        <w:shd w:val="clear" w:color="auto" w:fill="FBF7EF"/>
+        <w:spacing w:line="260" w:lineRule="auto"/>
+        <w:ind w:left="200" w:right="200"/>
+      </w:pPr>
       <w:r>
         <w:rPr>
           <w:rFonts w:ascii="Consolas" w:eastAsia="Consolas" w:hAnsi="Consolas" w:cs="Consolas"/>
           <w:sz w:val="17"/>
           <w:szCs w:val="17"/>
         </w:rPr>
-        <w:t>降价提醒：</w:t>
-      </w:r>
+        <w:t> </w:t>
+      </w:r>
+    </w:p>
+    <w:p>
+      <w:pPr>
+        <w:shd w:val="clear" w:color="auto" w:fill="FBF7EF"/>
+        <w:spacing w:line="260" w:lineRule="auto"/>
+        <w:ind w:left="200" w:right="200"/>
+      </w:pPr>
       <w:r>
         <w:rPr>
           <w:rFonts w:ascii="Consolas" w:eastAsia="Consolas" w:hAnsi="Consolas" w:cs="Consolas"/>
           <w:sz w:val="17"/>
           <w:szCs w:val="17"/>
         </w:rPr>
-        <w:t>Fitbit Charge 6 Fitness Tracker — NZD 275.00 @ Harvey Norman New Zealand</w:t>
-      </w:r>
-    </w:p>
-    <w:p>
-      <w:pPr>
-        <w:shd w:val="clear" w:color="auto" w:fill="FBF7EF"/>
-        <w:spacing w:line="260" w:lineRule="auto"/>
-        <w:ind w:left="200" w:right="200"/>
-      </w:pPr>
-      <w:r>
-        <w:rPr>
-          <w:rFonts w:ascii="Consolas" w:eastAsia="Consolas" w:hAnsi="Consolas" w:cs="Consolas"/>
-          <w:sz w:val="17"/>
-          <w:szCs w:val="17"/>
-        </w:rPr>
-        <w:t> </w:t>
-      </w:r>
-    </w:p>
-    <w:p>
-      <w:pPr>
-        <w:shd w:val="clear" w:color="auto" w:fill="FBF7EF"/>
-        <w:spacing w:line="260" w:lineRule="auto"/>
-        <w:ind w:left="200" w:right="200"/>
-      </w:pPr>
-      <w:r>
-        <w:rPr>
-          <w:rFonts w:ascii="Consolas" w:eastAsia="Consolas" w:hAnsi="Consolas" w:cs="Consolas"/>
-          <w:sz w:val="17"/>
-          <w:szCs w:val="17"/>
-        </w:rPr>
-        <w:t>降价提醒</w:t>
-      </w:r>
-      <w:r>
-        <w:rPr>
-          <w:rFonts w:ascii="Consolas" w:eastAsia="Consolas" w:hAnsi="Consolas" w:cs="Consolas"/>
-          <w:sz w:val="17"/>
-          <w:szCs w:val="17"/>
-        </w:rPr>
-        <w:t xml:space="preserve"> / Price alert: Harvey Norman New Zealand </w:t>
-      </w:r>
-      <w:r>
-        <w:rPr>
-          <w:rFonts w:ascii="Consolas" w:eastAsia="Consolas" w:hAnsi="Consolas" w:cs="Consolas"/>
-          <w:sz w:val="17"/>
-          <w:szCs w:val="17"/>
-        </w:rPr>
-        <w:t>现价</w:t>
-      </w:r>
-      <w:r>
-        <w:rPr>
-          <w:rFonts w:ascii="Consolas" w:eastAsia="Consolas" w:hAnsi="Consolas" w:cs="Consolas"/>
-          <w:sz w:val="17"/>
-          <w:szCs w:val="17"/>
-        </w:rPr>
-        <w:t xml:space="preserve"> NZD 275.00</w:t>
-      </w:r>
-      <w:r>
-        <w:rPr>
-          <w:rFonts w:ascii="Consolas" w:eastAsia="Consolas" w:hAnsi="Consolas" w:cs="Consolas"/>
-          <w:sz w:val="17"/>
-          <w:szCs w:val="17"/>
-        </w:rPr>
-        <w:t>（目标</w:t>
-      </w:r>
-      <w:r>
-        <w:rPr>
-          <w:rFonts w:ascii="Consolas" w:eastAsia="Consolas" w:hAnsi="Consolas" w:cs="Consolas"/>
-          <w:sz w:val="17"/>
-          <w:szCs w:val="17"/>
-        </w:rPr>
-        <w:t xml:space="preserve"> NZD 280.00</w:t>
-      </w:r>
-      <w:r>
-        <w:rPr>
-          <w:rFonts w:ascii="Consolas" w:eastAsia="Consolas" w:hAnsi="Consolas" w:cs="Consolas"/>
-          <w:sz w:val="17"/>
-          <w:szCs w:val="17"/>
-        </w:rPr>
-        <w:t>）</w:t>
+        <w:t>降价提醒 / Price alert: Harvey Norman New Zealand 现价 NZD 275.00（目标 NZD 280.00）</w:t>
       </w:r>
     </w:p>
     <w:p>
@@ -8408,7 +8518,7 @@
       <w:pPr>
         <w:pStyle w:val="2"/>
       </w:pPr>
-      <w:bookmarkStart w:id="25" w:name="_Toc243319436"/>
+      <w:bookmarkStart w:id="25" w:name="_Toc243321574"/>
       <w:r>
         <w:t>5.8 Security and cost control</w:t>
       </w:r>
@@ -8481,7 +8591,7 @@
       <w:pPr>
         <w:pStyle w:val="2"/>
       </w:pPr>
-      <w:bookmarkStart w:id="26" w:name="_Toc243319437"/>
+      <w:bookmarkStart w:id="26" w:name="_Toc243321575"/>
       <w:r>
         <w:t>5.9 Packaging and demo mode</w:t>
       </w:r>
@@ -8519,7 +8629,7 @@
         <w:pStyle w:val="1"/>
         <w:pageBreakBefore/>
       </w:pPr>
-      <w:bookmarkStart w:id="27" w:name="_Toc243319438"/>
+      <w:bookmarkStart w:id="27" w:name="_Toc243321576"/>
       <w:r>
         <w:lastRenderedPageBreak/>
         <w:t>6. Testing and evaluation</w:t>
@@ -8530,7 +8640,7 @@
       <w:pPr>
         <w:pStyle w:val="2"/>
       </w:pPr>
-      <w:bookmarkStart w:id="28" w:name="_Toc243319439"/>
+      <w:bookmarkStart w:id="28" w:name="_Toc243321577"/>
       <w:r>
         <w:t>6.1 Automated tests</w:t>
       </w:r>
@@ -8548,7 +8658,7 @@
       <w:pPr>
         <w:pStyle w:val="2"/>
       </w:pPr>
-      <w:bookmarkStart w:id="29" w:name="_Toc243319440"/>
+      <w:bookmarkStart w:id="29" w:name="_Toc243321578"/>
       <w:r>
         <w:t>6.2 Evaluation plan</w:t>
       </w:r>
@@ -8583,7 +8693,7 @@
           <w:noProof/>
         </w:rPr>
         <w:drawing>
-          <wp:inline distT="0" distB="0" distL="0" distR="0" wp14:anchorId="41DD2CD8" wp14:editId="5D0E3C40">
+          <wp:inline distT="0" distB="0" distL="0" distR="0" wp14:anchorId="01C66513" wp14:editId="33202D32">
             <wp:extent cx="5715000" cy="1485900"/>
             <wp:effectExtent l="0" t="0" r="0" b="0"/>
             <wp:docPr id="6" name="evaluation.png" descr="Evaluation results on real data (5 October 2026)." title="Figure 6"/>
@@ -8649,7 +8759,7 @@
       <w:pPr>
         <w:pStyle w:val="2"/>
       </w:pPr>
-      <w:bookmarkStart w:id="30" w:name="_Toc243319441"/>
+      <w:bookmarkStart w:id="30" w:name="_Toc243321579"/>
       <w:r>
         <w:t>6.3 Real price accuracy</w:t>
       </w:r>
@@ -9597,7 +9707,7 @@
       <w:pPr>
         <w:pStyle w:val="2"/>
       </w:pPr>
-      <w:bookmarkStart w:id="31" w:name="_Toc243319442"/>
+      <w:bookmarkStart w:id="31" w:name="_Toc243321580"/>
       <w:r>
         <w:t>6.4 Agents with the real model</w:t>
       </w:r>
@@ -10119,7 +10229,7 @@
       <w:pPr>
         <w:pStyle w:val="2"/>
       </w:pPr>
-      <w:bookmarkStart w:id="32" w:name="_Toc243319443"/>
+      <w:bookmarkStart w:id="32" w:name="_Toc243321581"/>
       <w:r>
         <w:t>6.5 End to end</w:t>
       </w:r>
@@ -10137,7 +10247,7 @@
       <w:pPr>
         <w:pStyle w:val="2"/>
       </w:pPr>
-      <w:bookmarkStart w:id="33" w:name="_Toc243319444"/>
+      <w:bookmarkStart w:id="33" w:name="_Toc243321582"/>
       <w:r>
         <w:t>6.6 Limits of the evaluation</w:t>
       </w:r>
@@ -10156,7 +10266,7 @@
         <w:pStyle w:val="1"/>
         <w:pageBreakBefore/>
       </w:pPr>
-      <w:bookmarkStart w:id="34" w:name="_Toc243319445"/>
+      <w:bookmarkStart w:id="34" w:name="_Toc243321583"/>
       <w:r>
         <w:lastRenderedPageBreak/>
         <w:t>7. Problems and how we solved them</w:t>
@@ -10777,7 +10887,7 @@
         <w:pStyle w:val="1"/>
         <w:pageBreakBefore/>
       </w:pPr>
-      <w:bookmarkStart w:id="35" w:name="_Toc243319446"/>
+      <w:bookmarkStart w:id="35" w:name="_Toc243321584"/>
       <w:r>
         <w:lastRenderedPageBreak/>
         <w:t>8. User manual</w:t>
@@ -10788,7 +10898,7 @@
       <w:pPr>
         <w:pStyle w:val="2"/>
       </w:pPr>
-      <w:bookmarkStart w:id="36" w:name="_Toc243319447"/>
+      <w:bookmarkStart w:id="36" w:name="_Toc243321585"/>
       <w:r>
         <w:t>8.1 Running the Windows program</w:t>
       </w:r>
@@ -10859,7 +10969,7 @@
       <w:pPr>
         <w:pStyle w:val="2"/>
       </w:pPr>
-      <w:bookmarkStart w:id="37" w:name="_Toc243319448"/>
+      <w:bookmarkStart w:id="37" w:name="_Toc243321586"/>
       <w:r>
         <w:t>8.2 Running from source</w:t>
       </w:r>
@@ -10899,7 +11009,7 @@
       <w:pPr>
         <w:pStyle w:val="2"/>
       </w:pPr>
-      <w:bookmarkStart w:id="38" w:name="_Toc243319449"/>
+      <w:bookmarkStart w:id="38" w:name="_Toc243321587"/>
       <w:r>
         <w:t>8.3 Finding a product and creating a monitor</w:t>
       </w:r>
@@ -11031,7 +11141,7 @@
       <w:pPr>
         <w:pStyle w:val="2"/>
       </w:pPr>
-      <w:bookmarkStart w:id="39" w:name="_Toc243319450"/>
+      <w:bookmarkStart w:id="39" w:name="_Toc243321588"/>
       <w:r>
         <w:t>8.4 Checking without keeping the window open</w:t>
       </w:r>
@@ -11078,7 +11188,7 @@
         <w:pStyle w:val="1"/>
         <w:pageBreakBefore/>
       </w:pPr>
-      <w:bookmarkStart w:id="40" w:name="_Toc243319451"/>
+      <w:bookmarkStart w:id="40" w:name="_Toc243321589"/>
       <w:r>
         <w:lastRenderedPageBreak/>
         <w:t>9. Conclusion</w:t>
@@ -11098,10 +11208,7 @@
         <w:spacing w:after="140" w:line="300" w:lineRule="auto"/>
       </w:pPr>
       <w:r>
-        <w:t xml:space="preserve">The second lesson was about trust. By letting agents choose only from real listings and keeping every decision about money and emails in code, we could test the system and measure it: prices matched the shops' own pages in 14 of 14 cases after our fixes, the price agent never reported a false price, and alerts were triggered with precision and recall of 1.0. The main limitations are the size of the real sample, the dependence on what Google Shopping New Zealand lists, and the need for the computer to be on </w:t>
-      </w:r>
-      <w:r>
-        <w:t>for monitoring.</w:t>
+        <w:t>The second lesson was about trust. By letting agents choose only from real listings and keeping every decision about money and emails in code, we could test the system and measure it: prices matched the shops' own pages in 14 of 14 cases after our fixes, the price agent never reported a false price, and alerts were triggered with precision and recall of 1.0. The main limitations are the size of the real sample, the dependence on what Google Shopping New Zealand lists, and the need for the computer to be on for monitoring.</w:t>
       </w:r>
     </w:p>
     <w:p>
@@ -11109,7 +11216,7 @@
         <w:pStyle w:val="1"/>
         <w:pageBreakBefore/>
       </w:pPr>
-      <w:bookmarkStart w:id="41" w:name="_Toc243319452"/>
+      <w:bookmarkStart w:id="41" w:name="_Toc243321590"/>
       <w:r>
         <w:lastRenderedPageBreak/>
         <w:t>10. Future work</w:t>
@@ -11199,7 +11306,7 @@
         <w:pStyle w:val="1"/>
         <w:pageBreakBefore/>
       </w:pPr>
-      <w:bookmarkStart w:id="42" w:name="_Toc243319453"/>
+      <w:bookmarkStart w:id="42" w:name="_Toc243321591"/>
       <w:r>
         <w:lastRenderedPageBreak/>
         <w:t>11. Personal learning</w:t>
@@ -11329,7 +11436,7 @@
         <w:pStyle w:val="1"/>
         <w:pageBreakBefore/>
       </w:pPr>
-      <w:bookmarkStart w:id="43" w:name="_Toc243319454"/>
+      <w:bookmarkStart w:id="43" w:name="_Toc243321592"/>
       <w:r>
         <w:lastRenderedPageBreak/>
         <w:t>References</w:t>
@@ -11667,7 +11774,7 @@
       <w:pPr>
         <w:pStyle w:val="2"/>
       </w:pPr>
-      <w:bookmarkStart w:id="44" w:name="_Toc243319455"/>
+      <w:bookmarkStart w:id="44" w:name="_Toc243321593"/>
       <w:r>
         <w:t>Source code</w:t>
       </w:r>
@@ -11678,7 +11785,7 @@
         <w:spacing w:after="140" w:line="300" w:lineRule="auto"/>
       </w:pPr>
       <w:r>
-        <w:t xml:space="preserve">The complete source code is submitted separately with this report as </w:t>
+        <w:t xml:space="preserve">Software repository (branch </w:t>
       </w:r>
       <w:r>
         <w:rPr>
@@ -11686,10 +11793,25 @@
           <w:sz w:val="20"/>
           <w:szCs w:val="20"/>
         </w:rPr>
-        <w:t>BargainAgent-source.zip</w:t>
-      </w:r>
-      <w:r>
-        <w:t xml:space="preserve"> (without API keys). </w:t>
+        <w:t>final</w:t>
+      </w:r>
+      <w:r>
+        <w:t xml:space="preserve">): </w:t>
+      </w:r>
+      <w:r>
+        <w:rPr>
+          <w:b/>
+          <w:bCs/>
+        </w:rPr>
+        <w:t>https://github.com/zhangfw0516-oss/bargain-agent/tree/final</w:t>
+      </w:r>
+    </w:p>
+    <w:p>
+      <w:pPr>
+        <w:spacing w:after="140" w:line="300" w:lineRule="auto"/>
+      </w:pPr>
+      <w:r>
+        <w:t xml:space="preserve">The repository contains the complete source code and its development history, from the first retailer adapters to the final system. </w:t>
       </w:r>
       <w:r>
         <w:rPr>
@@ -11700,7 +11822,7 @@
         <w:t>README.md</w:t>
       </w:r>
       <w:r>
-        <w:t xml:space="preserve"> explains how to run it, and </w:t>
+        <w:t xml:space="preserve"> explains how to run it, </w:t>
       </w:r>
       <w:r>
         <w:rPr>
@@ -11711,21 +11833,29 @@
         <w:t>docs/</w:t>
       </w:r>
       <w:r>
-        <w:t xml:space="preserve"> contains the architecture, interfaces and evaluation details.</w:t>
-      </w:r>
-    </w:p>
-    <w:p>
-      <w:pPr>
-        <w:shd w:val="clear" w:color="auto" w:fill="FFF4D6"/>
-        <w:spacing w:after="140" w:line="300" w:lineRule="auto"/>
-      </w:pPr>
-      <w:r>
-        <w:rPr>
-          <w:i/>
-          <w:iCs/>
-          <w:color w:val="7A5A00"/>
-        </w:rPr>
-        <w:t>[If the code is published to GitHub before submission, add the repository link here.]</w:t>
+        <w:t xml:space="preserve"> contains the architecture, interfaces and evaluation details, and </w:t>
+      </w:r>
+      <w:r>
+        <w:rPr>
+          <w:rFonts w:ascii="Consolas" w:eastAsia="Consolas" w:hAnsi="Consolas" w:cs="Consolas"/>
+          <w:sz w:val="20"/>
+          <w:szCs w:val="20"/>
+        </w:rPr>
+        <w:t>.env.example</w:t>
+      </w:r>
+      <w:r>
+        <w:t xml:space="preserve"> lists the settings. API keys are not stored in the repository; each user provides their own in a local </w:t>
+      </w:r>
+      <w:r>
+        <w:rPr>
+          <w:rFonts w:ascii="Consolas" w:eastAsia="Consolas" w:hAnsi="Consolas" w:cs="Consolas"/>
+          <w:sz w:val="20"/>
+          <w:szCs w:val="20"/>
+        </w:rPr>
+        <w:t>.env</w:t>
+      </w:r>
+      <w:r>
+        <w:t xml:space="preserve"> file.</w:t>
       </w:r>
     </w:p>
     <w:sectPr>
@@ -11851,96 +11981,10 @@
 <file path=word/numbering.xml><?xml version="1.0" encoding="utf-8"?>
 <w:numbering xmlns:wpc="http://schemas.microsoft.com/office/word/2010/wordprocessingCanvas" xmlns:cx="http://schemas.microsoft.com/office/drawing/2014/chartex" xmlns:cx1="http://schemas.microsoft.com/office/drawing/2015/9/8/chartex" xmlns:cx2="http://schemas.microsoft.com/office/drawing/2015/10/21/chartex" xmlns:cx3="http://schemas.microsoft.com/office/drawing/2016/5/9/chartex" xmlns:cx4="http://schemas.microsoft.com/office/drawing/2016/5/10/chartex" xmlns:cx5="http://schemas.microsoft.com/office/drawing/2016/5/11/chartex" xmlns:cx6="http://schemas.microsoft.com/office/drawing/2016/5/12/chartex" xmlns:cx7="http://schemas.microsoft.com/office/drawing/2016/5/13/chartex" xmlns:cx8="http://schemas.microsoft.com/office/drawing/2016/5/14/chartex" xmlns:mc="http://schemas.openxmlformats.org/markup-compatibility/2006" xmlns:aink="http://schemas.microsoft.com/office/drawing/2016/ink" xmlns:am3d="http://schemas.microsoft.com/office/drawing/2017/model3d" xmlns:o="urn:schemas-microsoft-com:office:office" xmlns:oel="http://schemas.microsoft.com/office/2019/extlst" xmlns:r="http://schemas.openxmlformats.org/officeDocument/2006/relationships" xmlns:m="http://schemas.openxmlformats.org/officeDocument/2006/math" xmlns:v="urn:schemas-microsoft-com:vml" xmlns:wp14="http://schemas.microsoft.com/office/word/2010/wordprocessingDrawing" xmlns:wp="http://schemas.openxmlformats.org/drawingml/2006/wordprocessingDrawing" xmlns:w10="urn:schemas-microsoft-com:office:word" xmlns:w="http://schemas.openxmlformats.org/wordprocessingml/2006/main" xmlns:w14="http://schemas.microsoft.com/office/word/2010/wordml" xmlns:w15="http://schemas.microsoft.com/office/word/2012/wordml" xmlns:w16cex="http://schemas.microsoft.com/office/word/2018/wordml/cex" xmlns:w16cid="http://schemas.microsoft.com/office/word/2016/wordml/cid" xmlns:w16="http://schemas.microsoft.com/office/word/2018/wordml" xmlns:w16du="http://schemas.microsoft.com/office/word/2023/wordml/word16du" xmlns:w16sdtdh="http://schemas.microsoft.com/office/word/2020/wordml/sdtdatahash" xmlns:w16sdtfl="http://schemas.microsoft.com/office/word/2024/wordml/sdtformatlock" xmlns:w16se="http://schemas.microsoft.com/office/word/2015/wordml/symex" xmlns:wpg="http://schemas.microsoft.com/office/word/2010/wordprocessingGroup" xmlns:wpi="http://schemas.microsoft.com/office/word/2010/wordprocessingInk" xmlns:wne="http://schemas.microsoft.com/office/word/2006/wordml" xmlns:wps="http://schemas.microsoft.com/office/word/2010/wordprocessingShape" mc:Ignorable="w14 w15 w16se w16cid w16 w16cex w16sdtdh w16sdtfl w16du wp14">
   <w:abstractNum w:abstractNumId="0" w15:restartNumberingAfterBreak="0">
-    <w:nsid w:val="02AC363E"/>
+    <w:nsid w:val="04A854C4"/>
     <w:multiLevelType w:val="hybridMultilevel"/>
-    <w:tmpl w:val="60BA3BC8"/>
-    <w:lvl w:ilvl="0" w:tplc="C37ACCE4" w:tentative="1">
-      <w:start w:val="1"/>
-      <w:numFmt w:val="bullet"/>
-      <w:lvlText w:val="●"/>
-      <w:lvlJc w:val="left"/>
-      <w:pPr>
-        <w:ind w:left="720" w:hanging="360"/>
-      </w:pPr>
-    </w:lvl>
-    <w:lvl w:ilvl="1" w:tplc="BBD42F5A" w:tentative="1">
-      <w:start w:val="1"/>
-      <w:numFmt w:val="bullet"/>
-      <w:lvlText w:val="○"/>
-      <w:lvlJc w:val="left"/>
-      <w:pPr>
-        <w:ind w:left="1440" w:hanging="360"/>
-      </w:pPr>
-    </w:lvl>
-    <w:lvl w:ilvl="2" w:tplc="047A305A" w:tentative="1">
-      <w:start w:val="1"/>
-      <w:numFmt w:val="bullet"/>
-      <w:lvlText w:val="■"/>
-      <w:lvlJc w:val="left"/>
-      <w:pPr>
-        <w:ind w:left="2160" w:hanging="360"/>
-      </w:pPr>
-    </w:lvl>
-    <w:lvl w:ilvl="3" w:tplc="740EBBAE" w:tentative="1">
-      <w:start w:val="1"/>
-      <w:numFmt w:val="bullet"/>
-      <w:lvlText w:val="●"/>
-      <w:lvlJc w:val="left"/>
-      <w:pPr>
-        <w:ind w:left="2880" w:hanging="360"/>
-      </w:pPr>
-    </w:lvl>
-    <w:lvl w:ilvl="4" w:tplc="97CAC610" w:tentative="1">
-      <w:start w:val="1"/>
-      <w:numFmt w:val="bullet"/>
-      <w:lvlText w:val="○"/>
-      <w:lvlJc w:val="left"/>
-      <w:pPr>
-        <w:ind w:left="3600" w:hanging="360"/>
-      </w:pPr>
-    </w:lvl>
-    <w:lvl w:ilvl="5" w:tplc="CA469BC6" w:tentative="1">
-      <w:start w:val="1"/>
-      <w:numFmt w:val="bullet"/>
-      <w:lvlText w:val="■"/>
-      <w:lvlJc w:val="left"/>
-      <w:pPr>
-        <w:ind w:left="4320" w:hanging="360"/>
-      </w:pPr>
-    </w:lvl>
-    <w:lvl w:ilvl="6" w:tplc="68282A4C" w:tentative="1">
-      <w:start w:val="1"/>
-      <w:numFmt w:val="bullet"/>
-      <w:lvlText w:val="●"/>
-      <w:lvlJc w:val="left"/>
-      <w:pPr>
-        <w:ind w:left="5040" w:hanging="360"/>
-      </w:pPr>
-    </w:lvl>
-    <w:lvl w:ilvl="7" w:tplc="08CAA8FE" w:tentative="1">
-      <w:start w:val="1"/>
-      <w:numFmt w:val="bullet"/>
-      <w:lvlText w:val="●"/>
-      <w:lvlJc w:val="left"/>
-      <w:pPr>
-        <w:ind w:left="5760" w:hanging="360"/>
-      </w:pPr>
-    </w:lvl>
-    <w:lvl w:ilvl="8" w:tplc="BC2A3D92" w:tentative="1">
-      <w:start w:val="1"/>
-      <w:numFmt w:val="bullet"/>
-      <w:lvlText w:val="●"/>
-      <w:lvlJc w:val="left"/>
-      <w:pPr>
-        <w:ind w:left="6480" w:hanging="360"/>
-      </w:pPr>
-    </w:lvl>
-  </w:abstractNum>
-  <w:abstractNum w:abstractNumId="1" w15:restartNumberingAfterBreak="0">
-    <w:nsid w:val="0656473D"/>
-    <w:multiLevelType w:val="hybridMultilevel"/>
-    <w:tmpl w:val="6414E1FC"/>
-    <w:lvl w:ilvl="0" w:tplc="163EA4CA">
+    <w:tmpl w:val="303E3E14"/>
+    <w:lvl w:ilvl="0" w:tplc="E7D2E3D2">
       <w:start w:val="1"/>
       <w:numFmt w:val="decimal"/>
       <w:lvlText w:val="%1."/>
@@ -11949,52 +11993,106 @@
         <w:ind w:left="540" w:hanging="360"/>
       </w:pPr>
     </w:lvl>
-    <w:lvl w:ilvl="1" w:tplc="63F6421E">
+    <w:lvl w:ilvl="1" w:tplc="7408D2F6">
       <w:numFmt w:val="decimal"/>
       <w:lvlText w:val=""/>
       <w:lvlJc w:val="left"/>
     </w:lvl>
-    <w:lvl w:ilvl="2" w:tplc="C5E8DE74">
+    <w:lvl w:ilvl="2" w:tplc="DDA0D2D0">
       <w:numFmt w:val="decimal"/>
       <w:lvlText w:val=""/>
       <w:lvlJc w:val="left"/>
     </w:lvl>
-    <w:lvl w:ilvl="3" w:tplc="8B04B83A">
+    <w:lvl w:ilvl="3" w:tplc="F80466B0">
       <w:numFmt w:val="decimal"/>
       <w:lvlText w:val=""/>
       <w:lvlJc w:val="left"/>
     </w:lvl>
-    <w:lvl w:ilvl="4" w:tplc="32A6764C">
+    <w:lvl w:ilvl="4" w:tplc="E54C0F9A">
       <w:numFmt w:val="decimal"/>
       <w:lvlText w:val=""/>
       <w:lvlJc w:val="left"/>
     </w:lvl>
-    <w:lvl w:ilvl="5" w:tplc="A4E0A2E8">
+    <w:lvl w:ilvl="5" w:tplc="FC468B6E">
       <w:numFmt w:val="decimal"/>
       <w:lvlText w:val=""/>
       <w:lvlJc w:val="left"/>
     </w:lvl>
-    <w:lvl w:ilvl="6" w:tplc="1996DB24">
+    <w:lvl w:ilvl="6" w:tplc="780CEE9E">
       <w:numFmt w:val="decimal"/>
       <w:lvlText w:val=""/>
       <w:lvlJc w:val="left"/>
     </w:lvl>
-    <w:lvl w:ilvl="7" w:tplc="6E32D382">
+    <w:lvl w:ilvl="7" w:tplc="BF3C0C18">
       <w:numFmt w:val="decimal"/>
       <w:lvlText w:val=""/>
       <w:lvlJc w:val="left"/>
     </w:lvl>
-    <w:lvl w:ilvl="8" w:tplc="CED6643E">
+    <w:lvl w:ilvl="8" w:tplc="6966E17A">
+      <w:numFmt w:val="decimal"/>
+      <w:lvlText w:val=""/>
+      <w:lvlJc w:val="left"/>
+    </w:lvl>
+  </w:abstractNum>
+  <w:abstractNum w:abstractNumId="1" w15:restartNumberingAfterBreak="0">
+    <w:nsid w:val="057F074A"/>
+    <w:multiLevelType w:val="hybridMultilevel"/>
+    <w:tmpl w:val="9530DF4E"/>
+    <w:lvl w:ilvl="0" w:tplc="6E2E4842">
+      <w:start w:val="1"/>
+      <w:numFmt w:val="decimal"/>
+      <w:lvlText w:val="%1."/>
+      <w:lvlJc w:val="left"/>
+      <w:pPr>
+        <w:ind w:left="540" w:hanging="360"/>
+      </w:pPr>
+    </w:lvl>
+    <w:lvl w:ilvl="1" w:tplc="707815E6">
+      <w:numFmt w:val="decimal"/>
+      <w:lvlText w:val=""/>
+      <w:lvlJc w:val="left"/>
+    </w:lvl>
+    <w:lvl w:ilvl="2" w:tplc="7CF0709A">
+      <w:numFmt w:val="decimal"/>
+      <w:lvlText w:val=""/>
+      <w:lvlJc w:val="left"/>
+    </w:lvl>
+    <w:lvl w:ilvl="3" w:tplc="1C5C6870">
+      <w:numFmt w:val="decimal"/>
+      <w:lvlText w:val=""/>
+      <w:lvlJc w:val="left"/>
+    </w:lvl>
+    <w:lvl w:ilvl="4" w:tplc="2A3805EC">
+      <w:numFmt w:val="decimal"/>
+      <w:lvlText w:val=""/>
+      <w:lvlJc w:val="left"/>
+    </w:lvl>
+    <w:lvl w:ilvl="5" w:tplc="7CCC353A">
+      <w:numFmt w:val="decimal"/>
+      <w:lvlText w:val=""/>
+      <w:lvlJc w:val="left"/>
+    </w:lvl>
+    <w:lvl w:ilvl="6" w:tplc="6F580152">
+      <w:numFmt w:val="decimal"/>
+      <w:lvlText w:val=""/>
+      <w:lvlJc w:val="left"/>
+    </w:lvl>
+    <w:lvl w:ilvl="7" w:tplc="104EE2AA">
+      <w:numFmt w:val="decimal"/>
+      <w:lvlText w:val=""/>
+      <w:lvlJc w:val="left"/>
+    </w:lvl>
+    <w:lvl w:ilvl="8" w:tplc="1DB05B74">
       <w:numFmt w:val="decimal"/>
       <w:lvlText w:val=""/>
       <w:lvlJc w:val="left"/>
     </w:lvl>
   </w:abstractNum>
   <w:abstractNum w:abstractNumId="2" w15:restartNumberingAfterBreak="0">
-    <w:nsid w:val="102A3D9F"/>
+    <w:nsid w:val="0C4145E1"/>
     <w:multiLevelType w:val="hybridMultilevel"/>
-    <w:tmpl w:val="5758203A"/>
-    <w:lvl w:ilvl="0" w:tplc="A03CB610">
+    <w:tmpl w:val="3BEC2BD2"/>
+    <w:lvl w:ilvl="0" w:tplc="8A44F5E2">
       <w:start w:val="1"/>
       <w:numFmt w:val="bullet"/>
       <w:lvlText w:val="•"/>
@@ -12003,121 +12101,153 @@
         <w:ind w:left="540" w:hanging="300"/>
       </w:pPr>
     </w:lvl>
-    <w:lvl w:ilvl="1" w:tplc="2FCAE154">
+    <w:lvl w:ilvl="1" w:tplc="8E4C7FA8">
       <w:numFmt w:val="decimal"/>
       <w:lvlText w:val=""/>
       <w:lvlJc w:val="left"/>
     </w:lvl>
-    <w:lvl w:ilvl="2" w:tplc="143A7AFC">
+    <w:lvl w:ilvl="2" w:tplc="D3CE429C">
       <w:numFmt w:val="decimal"/>
       <w:lvlText w:val=""/>
       <w:lvlJc w:val="left"/>
     </w:lvl>
-    <w:lvl w:ilvl="3" w:tplc="8BA24168">
+    <w:lvl w:ilvl="3" w:tplc="AC9C61BE">
       <w:numFmt w:val="decimal"/>
       <w:lvlText w:val=""/>
       <w:lvlJc w:val="left"/>
     </w:lvl>
-    <w:lvl w:ilvl="4" w:tplc="7DE2E050">
+    <w:lvl w:ilvl="4" w:tplc="11B83B7C">
       <w:numFmt w:val="decimal"/>
       <w:lvlText w:val=""/>
       <w:lvlJc w:val="left"/>
     </w:lvl>
-    <w:lvl w:ilvl="5" w:tplc="1BF02736">
+    <w:lvl w:ilvl="5" w:tplc="6EA0541A">
       <w:numFmt w:val="decimal"/>
       <w:lvlText w:val=""/>
       <w:lvlJc w:val="left"/>
     </w:lvl>
-    <w:lvl w:ilvl="6" w:tplc="8DA69DF0">
+    <w:lvl w:ilvl="6" w:tplc="E8102BCC">
       <w:numFmt w:val="decimal"/>
       <w:lvlText w:val=""/>
       <w:lvlJc w:val="left"/>
     </w:lvl>
-    <w:lvl w:ilvl="7" w:tplc="8548BB30">
+    <w:lvl w:ilvl="7" w:tplc="AEBA8E86">
       <w:numFmt w:val="decimal"/>
       <w:lvlText w:val=""/>
       <w:lvlJc w:val="left"/>
     </w:lvl>
-    <w:lvl w:ilvl="8" w:tplc="CEB0C374">
+    <w:lvl w:ilvl="8" w:tplc="0EA63528">
       <w:numFmt w:val="decimal"/>
       <w:lvlText w:val=""/>
       <w:lvlJc w:val="left"/>
     </w:lvl>
   </w:abstractNum>
   <w:abstractNum w:abstractNumId="3" w15:restartNumberingAfterBreak="0">
-    <w:nsid w:val="4D736AA5"/>
+    <w:nsid w:val="72213CD8"/>
     <w:multiLevelType w:val="hybridMultilevel"/>
-    <w:tmpl w:val="1FE4B49E"/>
-    <w:lvl w:ilvl="0" w:tplc="B8B464B8">
+    <w:tmpl w:val="CBE6D888"/>
+    <w:lvl w:ilvl="0" w:tplc="5238C99C" w:tentative="1">
       <w:start w:val="1"/>
-      <w:numFmt w:val="decimal"/>
-      <w:lvlText w:val="%1."/>
+      <w:numFmt w:val="bullet"/>
+      <w:lvlText w:val="●"/>
       <w:lvlJc w:val="left"/>
       <w:pPr>
-        <w:ind w:left="540" w:hanging="360"/>
+        <w:ind w:left="720" w:hanging="360"/>
       </w:pPr>
     </w:lvl>
-    <w:lvl w:ilvl="1" w:tplc="5DA850F4">
-      <w:numFmt w:val="decimal"/>
-      <w:lvlText w:val=""/>
+    <w:lvl w:ilvl="1" w:tplc="0A18A7E2" w:tentative="1">
+      <w:start w:val="1"/>
+      <w:numFmt w:val="bullet"/>
+      <w:lvlText w:val="○"/>
       <w:lvlJc w:val="left"/>
+      <w:pPr>
+        <w:ind w:left="1440" w:hanging="360"/>
+      </w:pPr>
     </w:lvl>
-    <w:lvl w:ilvl="2" w:tplc="2C4E04BE">
-      <w:numFmt w:val="decimal"/>
-      <w:lvlText w:val=""/>
+    <w:lvl w:ilvl="2" w:tplc="F6608192" w:tentative="1">
+      <w:start w:val="1"/>
+      <w:numFmt w:val="bullet"/>
+      <w:lvlText w:val="■"/>
       <w:lvlJc w:val="left"/>
+      <w:pPr>
+        <w:ind w:left="2160" w:hanging="360"/>
+      </w:pPr>
     </w:lvl>
-    <w:lvl w:ilvl="3" w:tplc="35927CC4">
-      <w:numFmt w:val="decimal"/>
-      <w:lvlText w:val=""/>
+    <w:lvl w:ilvl="3" w:tplc="5EDCA4FE" w:tentative="1">
+      <w:start w:val="1"/>
+      <w:numFmt w:val="bullet"/>
+      <w:lvlText w:val="●"/>
       <w:lvlJc w:val="left"/>
+      <w:pPr>
+        <w:ind w:left="2880" w:hanging="360"/>
+      </w:pPr>
     </w:lvl>
-    <w:lvl w:ilvl="4" w:tplc="EB409B72">
-      <w:numFmt w:val="decimal"/>
-      <w:lvlText w:val=""/>
+    <w:lvl w:ilvl="4" w:tplc="3614F69C" w:tentative="1">
+      <w:start w:val="1"/>
+      <w:numFmt w:val="bullet"/>
+      <w:lvlText w:val="○"/>
       <w:lvlJc w:val="left"/>
+      <w:pPr>
+        <w:ind w:left="3600" w:hanging="360"/>
+      </w:pPr>
     </w:lvl>
-    <w:lvl w:ilvl="5" w:tplc="F60845AA">
-      <w:numFmt w:val="decimal"/>
-      <w:lvlText w:val=""/>
+    <w:lvl w:ilvl="5" w:tplc="5B56859C" w:tentative="1">
+      <w:start w:val="1"/>
+      <w:numFmt w:val="bullet"/>
+      <w:lvlText w:val="■"/>
       <w:lvlJc w:val="left"/>
+      <w:pPr>
+        <w:ind w:left="4320" w:hanging="360"/>
+      </w:pPr>
     </w:lvl>
-    <w:lvl w:ilvl="6" w:tplc="F6E679D2">
-      <w:numFmt w:val="decimal"/>
-      <w:lvlText w:val=""/>
+    <w:lvl w:ilvl="6" w:tplc="1986B138" w:tentative="1">
+      <w:start w:val="1"/>
+      <w:numFmt w:val="bullet"/>
+      <w:lvlText w:val="●"/>
       <w:lvlJc w:val="left"/>
+      <w:pPr>
+        <w:ind w:left="5040" w:hanging="360"/>
+      </w:pPr>
     </w:lvl>
-    <w:lvl w:ilvl="7" w:tplc="10B6740C">
-      <w:numFmt w:val="decimal"/>
-      <w:lvlText w:val=""/>
+    <w:lvl w:ilvl="7" w:tplc="2256ADDC" w:tentative="1">
+      <w:start w:val="1"/>
+      <w:numFmt w:val="bullet"/>
+      <w:lvlText w:val="●"/>
       <w:lvlJc w:val="left"/>
+      <w:pPr>
+        <w:ind w:left="5760" w:hanging="360"/>
+      </w:pPr>
     </w:lvl>
-    <w:lvl w:ilvl="8" w:tplc="8F205554">
-      <w:numFmt w:val="decimal"/>
-      <w:lvlText w:val=""/>
+    <w:lvl w:ilvl="8" w:tplc="8334ED7A" w:tentative="1">
+      <w:start w:val="1"/>
+      <w:numFmt w:val="bullet"/>
+      <w:lvlText w:val="●"/>
       <w:lvlJc w:val="left"/>
+      <w:pPr>
+        <w:ind w:left="6480" w:hanging="360"/>
+      </w:pPr>
     </w:lvl>
   </w:abstractNum>
-  <w:num w:numId="1" w16cid:durableId="1270821903">
+  <w:num w:numId="1" w16cid:durableId="452867782">
+    <w:abstractNumId w:val="3"/>
+    <w:lvlOverride w:ilvl="0">
+      <w:startOverride w:val="1"/>
+    </w:lvlOverride>
+  </w:num>
+  <w:num w:numId="2" w16cid:durableId="1903638851">
+    <w:abstractNumId w:val="2"/>
+    <w:lvlOverride w:ilvl="0">
+      <w:startOverride w:val="1"/>
+    </w:lvlOverride>
+  </w:num>
+  <w:num w:numId="3" w16cid:durableId="183054988">
     <w:abstractNumId w:val="0"/>
     <w:lvlOverride w:ilvl="0">
       <w:startOverride w:val="1"/>
     </w:lvlOverride>
   </w:num>
-  <w:num w:numId="2" w16cid:durableId="2039350016">
-    <w:abstractNumId w:val="2"/>
-    <w:lvlOverride w:ilvl="0">
-      <w:startOverride w:val="1"/>
-    </w:lvlOverride>
-  </w:num>
-  <w:num w:numId="3" w16cid:durableId="2081125821">
+  <w:num w:numId="4" w16cid:durableId="1783957825">
     <w:abstractNumId w:val="1"/>
-    <w:lvlOverride w:ilvl="0">
-      <w:startOverride w:val="1"/>
-    </w:lvlOverride>
-  </w:num>
-  <w:num w:numId="4" w16cid:durableId="269751521">
-    <w:abstractNumId w:val="3"/>
     <w:lvlOverride w:ilvl="0">
       <w:startOverride w:val="1"/>
     </w:lvlOverride>
@@ -12758,7 +12888,7 @@
     <w:link w:val="ad"/>
     <w:uiPriority w:val="99"/>
     <w:unhideWhenUsed/>
-    <w:rsid w:val="000E2FA4"/>
+    <w:rsid w:val="00942653"/>
     <w:pPr>
       <w:tabs>
         <w:tab w:val="center" w:pos="4153"/>
@@ -12777,7 +12907,7 @@
     <w:basedOn w:val="a0"/>
     <w:link w:val="ac"/>
     <w:uiPriority w:val="99"/>
-    <w:rsid w:val="000E2FA4"/>
+    <w:rsid w:val="00942653"/>
     <w:rPr>
       <w:sz w:val="18"/>
       <w:szCs w:val="18"/>
@@ -12789,7 +12919,7 @@
     <w:link w:val="af"/>
     <w:uiPriority w:val="99"/>
     <w:unhideWhenUsed/>
-    <w:rsid w:val="000E2FA4"/>
+    <w:rsid w:val="00942653"/>
     <w:pPr>
       <w:tabs>
         <w:tab w:val="center" w:pos="4153"/>
@@ -12807,7 +12937,7 @@
     <w:basedOn w:val="a0"/>
     <w:link w:val="ae"/>
     <w:uiPriority w:val="99"/>
-    <w:rsid w:val="000E2FA4"/>
+    <w:rsid w:val="00942653"/>
     <w:rPr>
       <w:sz w:val="18"/>
       <w:szCs w:val="18"/>
@@ -12820,7 +12950,7 @@
     <w:autoRedefine/>
     <w:uiPriority w:val="39"/>
     <w:unhideWhenUsed/>
-    <w:rsid w:val="000E2FA4"/>
+    <w:rsid w:val="00942653"/>
   </w:style>
   <w:style w:type="paragraph" w:styleId="TOC2">
     <w:name w:val="toc 2"/>
@@ -12829,7 +12959,7 @@
     <w:autoRedefine/>
     <w:uiPriority w:val="39"/>
     <w:unhideWhenUsed/>
-    <w:rsid w:val="000E2FA4"/>
+    <w:rsid w:val="00942653"/>
     <w:pPr>
       <w:ind w:leftChars="200" w:left="420"/>
     </w:pPr>

</xml_diff>

<commit_message>
docs: report supervisor and AI statement
</commit_message>
<xml_diff>
--- a/deliverables/159333_Final_Report_Bargain_Agent.docx
+++ b/deliverables/159333_Final_Report_Bargain_Agent.docx
@@ -677,11 +677,9 @@
       </w:pPr>
       <w:r>
         <w:rPr>
-          <w:i/>
-          <w:iCs/>
-          <w:color w:val="7A5A00"/>
-        </w:rPr>
-        <w:t>Supervisor: [supervisor name]</w:t>
+          <w:color w:val="46546A"/>
+        </w:rPr>
+        <w:t>Supervisor: Dr Surangika Ranathunga</w:t>
       </w:r>
     </w:p>
     <w:p>
@@ -704,7 +702,7 @@
     <w:sdt>
       <w:sdtPr>
         <w:alias w:val="Contents"/>
-        <w:id w:val="-1318640873"/>
+        <w:id w:val="-212116740"/>
       </w:sdtPr>
       <w:sdtEndPr/>
       <w:sdtContent>
@@ -715,11 +713,7 @@
               <w:tab w:val="right" w:leader="dot" w:pos="9016"/>
             </w:tabs>
             <w:rPr>
-              <w:rFonts w:asciiTheme="minorHAnsi" w:hAnsiTheme="minorHAnsi" w:cstheme="minorBidi"/>
               <w:noProof/>
-              <w:kern w:val="2"/>
-              <w:szCs w:val="24"/>
-              <w14:ligatures w14:val="standardContextual"/>
             </w:rPr>
           </w:pPr>
           <w:r>
@@ -731,7 +725,7 @@
           <w:r>
             <w:fldChar w:fldCharType="separate"/>
           </w:r>
-          <w:hyperlink w:anchor="_Toc243321549" w:history="1">
+          <w:hyperlink w:anchor="_Toc243322418" w:history="1">
             <w:r>
               <w:rPr>
                 <w:rStyle w:val="a5"/>
@@ -755,7 +749,7 @@
               <w:rPr>
                 <w:noProof/>
               </w:rPr>
-              <w:instrText xml:space="preserve"> PAGEREF _Toc243321549 \h </w:instrText>
+              <w:instrText xml:space="preserve"> PAGEREF _Toc243322418 \h </w:instrText>
             </w:r>
             <w:r>
               <w:rPr>
@@ -790,14 +784,10 @@
             </w:tabs>
             <w:ind w:left="440"/>
             <w:rPr>
-              <w:rFonts w:asciiTheme="minorHAnsi" w:hAnsiTheme="minorHAnsi" w:cstheme="minorBidi"/>
               <w:noProof/>
-              <w:kern w:val="2"/>
-              <w:szCs w:val="24"/>
-              <w14:ligatures w14:val="standardContextual"/>
             </w:rPr>
           </w:pPr>
-          <w:hyperlink w:anchor="_Toc243321550" w:history="1">
+          <w:hyperlink w:anchor="_Toc243322419" w:history="1">
             <w:r>
               <w:rPr>
                 <w:rStyle w:val="a5"/>
@@ -821,7 +811,7 @@
               <w:rPr>
                 <w:noProof/>
               </w:rPr>
-              <w:instrText xml:space="preserve"> PAGEREF _Toc243321550 \h </w:instrText>
+              <w:instrText xml:space="preserve"> PAGEREF _Toc243322419 \h </w:instrText>
             </w:r>
             <w:r>
               <w:rPr>
@@ -856,14 +846,10 @@
             </w:tabs>
             <w:ind w:left="440"/>
             <w:rPr>
-              <w:rFonts w:asciiTheme="minorHAnsi" w:hAnsiTheme="minorHAnsi" w:cstheme="minorBidi"/>
               <w:noProof/>
-              <w:kern w:val="2"/>
-              <w:szCs w:val="24"/>
-              <w14:ligatures w14:val="standardContextual"/>
             </w:rPr>
           </w:pPr>
-          <w:hyperlink w:anchor="_Toc243321551" w:history="1">
+          <w:hyperlink w:anchor="_Toc243322420" w:history="1">
             <w:r>
               <w:rPr>
                 <w:rStyle w:val="a5"/>
@@ -887,7 +873,7 @@
               <w:rPr>
                 <w:noProof/>
               </w:rPr>
-              <w:instrText xml:space="preserve"> PAGEREF _Toc243321551 \h </w:instrText>
+              <w:instrText xml:space="preserve"> PAGEREF _Toc243322420 \h </w:instrText>
             </w:r>
             <w:r>
               <w:rPr>
@@ -922,14 +908,10 @@
             </w:tabs>
             <w:ind w:left="440"/>
             <w:rPr>
-              <w:rFonts w:asciiTheme="minorHAnsi" w:hAnsiTheme="minorHAnsi" w:cstheme="minorBidi"/>
               <w:noProof/>
-              <w:kern w:val="2"/>
-              <w:szCs w:val="24"/>
-              <w14:ligatures w14:val="standardContextual"/>
             </w:rPr>
           </w:pPr>
-          <w:hyperlink w:anchor="_Toc243321552" w:history="1">
+          <w:hyperlink w:anchor="_Toc243322421" w:history="1">
             <w:r>
               <w:rPr>
                 <w:rStyle w:val="a5"/>
@@ -953,7 +935,7 @@
               <w:rPr>
                 <w:noProof/>
               </w:rPr>
-              <w:instrText xml:space="preserve"> PAGEREF _Toc243321552 \h </w:instrText>
+              <w:instrText xml:space="preserve"> PAGEREF _Toc243322421 \h </w:instrText>
             </w:r>
             <w:r>
               <w:rPr>
@@ -988,14 +970,10 @@
             </w:tabs>
             <w:ind w:left="440"/>
             <w:rPr>
-              <w:rFonts w:asciiTheme="minorHAnsi" w:hAnsiTheme="minorHAnsi" w:cstheme="minorBidi"/>
               <w:noProof/>
-              <w:kern w:val="2"/>
-              <w:szCs w:val="24"/>
-              <w14:ligatures w14:val="standardContextual"/>
             </w:rPr>
           </w:pPr>
-          <w:hyperlink w:anchor="_Toc243321553" w:history="1">
+          <w:hyperlink w:anchor="_Toc243322422" w:history="1">
             <w:r>
               <w:rPr>
                 <w:rStyle w:val="a5"/>
@@ -1019,7 +997,7 @@
               <w:rPr>
                 <w:noProof/>
               </w:rPr>
-              <w:instrText xml:space="preserve"> PAGEREF _Toc243321553 \h </w:instrText>
+              <w:instrText xml:space="preserve"> PAGEREF _Toc243322422 \h </w:instrText>
             </w:r>
             <w:r>
               <w:rPr>
@@ -1054,20 +1032,16 @@
             </w:tabs>
             <w:ind w:left="440"/>
             <w:rPr>
-              <w:rFonts w:asciiTheme="minorHAnsi" w:hAnsiTheme="minorHAnsi" w:cstheme="minorBidi"/>
               <w:noProof/>
-              <w:kern w:val="2"/>
-              <w:szCs w:val="24"/>
-              <w14:ligatures w14:val="standardContextual"/>
             </w:rPr>
           </w:pPr>
-          <w:hyperlink w:anchor="_Toc243321554" w:history="1">
+          <w:hyperlink w:anchor="_Toc243322423" w:history="1">
             <w:r>
               <w:rPr>
                 <w:rStyle w:val="a5"/>
                 <w:noProof/>
               </w:rPr>
-              <w:t>1.5 Use of generative AI</w:t>
+              <w:t>1.5 Use of AI tools</w:t>
             </w:r>
             <w:r>
               <w:rPr>
@@ -1085,7 +1059,7 @@
               <w:rPr>
                 <w:noProof/>
               </w:rPr>
-              <w:instrText xml:space="preserve"> PAGEREF _Toc243321554 \h </w:instrText>
+              <w:instrText xml:space="preserve"> PAGEREF _Toc243322423 \h </w:instrText>
             </w:r>
             <w:r>
               <w:rPr>
@@ -1119,14 +1093,10 @@
               <w:tab w:val="right" w:leader="dot" w:pos="9016"/>
             </w:tabs>
             <w:rPr>
-              <w:rFonts w:asciiTheme="minorHAnsi" w:hAnsiTheme="minorHAnsi" w:cstheme="minorBidi"/>
               <w:noProof/>
-              <w:kern w:val="2"/>
-              <w:szCs w:val="24"/>
-              <w14:ligatures w14:val="standardContextual"/>
             </w:rPr>
           </w:pPr>
-          <w:hyperlink w:anchor="_Toc243321555" w:history="1">
+          <w:hyperlink w:anchor="_Toc243322424" w:history="1">
             <w:r>
               <w:rPr>
                 <w:rStyle w:val="a5"/>
@@ -1150,7 +1120,7 @@
               <w:rPr>
                 <w:noProof/>
               </w:rPr>
-              <w:instrText xml:space="preserve"> PAGEREF _Toc243321555 \h </w:instrText>
+              <w:instrText xml:space="preserve"> PAGEREF _Toc243322424 \h </w:instrText>
             </w:r>
             <w:r>
               <w:rPr>
@@ -1184,14 +1154,10 @@
               <w:tab w:val="right" w:leader="dot" w:pos="9016"/>
             </w:tabs>
             <w:rPr>
-              <w:rFonts w:asciiTheme="minorHAnsi" w:hAnsiTheme="minorHAnsi" w:cstheme="minorBidi"/>
               <w:noProof/>
-              <w:kern w:val="2"/>
-              <w:szCs w:val="24"/>
-              <w14:ligatures w14:val="standardContextual"/>
             </w:rPr>
           </w:pPr>
-          <w:hyperlink w:anchor="_Toc243321556" w:history="1">
+          <w:hyperlink w:anchor="_Toc243322425" w:history="1">
             <w:r>
               <w:rPr>
                 <w:rStyle w:val="a5"/>
@@ -1215,7 +1181,7 @@
               <w:rPr>
                 <w:noProof/>
               </w:rPr>
-              <w:instrText xml:space="preserve"> PAGEREF _Toc243321556 \h </w:instrText>
+              <w:instrText xml:space="preserve"> PAGEREF _Toc243322425 \h </w:instrText>
             </w:r>
             <w:r>
               <w:rPr>
@@ -1250,14 +1216,10 @@
             </w:tabs>
             <w:ind w:left="440"/>
             <w:rPr>
-              <w:rFonts w:asciiTheme="minorHAnsi" w:hAnsiTheme="minorHAnsi" w:cstheme="minorBidi"/>
               <w:noProof/>
-              <w:kern w:val="2"/>
-              <w:szCs w:val="24"/>
-              <w14:ligatures w14:val="standardContextual"/>
             </w:rPr>
           </w:pPr>
-          <w:hyperlink w:anchor="_Toc243321557" w:history="1">
+          <w:hyperlink w:anchor="_Toc243322426" w:history="1">
             <w:r>
               <w:rPr>
                 <w:rStyle w:val="a5"/>
@@ -1281,7 +1243,7 @@
               <w:rPr>
                 <w:noProof/>
               </w:rPr>
-              <w:instrText xml:space="preserve"> PAGEREF _Toc243321557 \h </w:instrText>
+              <w:instrText xml:space="preserve"> PAGEREF _Toc243322426 \h </w:instrText>
             </w:r>
             <w:r>
               <w:rPr>
@@ -1316,14 +1278,10 @@
             </w:tabs>
             <w:ind w:left="440"/>
             <w:rPr>
-              <w:rFonts w:asciiTheme="minorHAnsi" w:hAnsiTheme="minorHAnsi" w:cstheme="minorBidi"/>
               <w:noProof/>
-              <w:kern w:val="2"/>
-              <w:szCs w:val="24"/>
-              <w14:ligatures w14:val="standardContextual"/>
             </w:rPr>
           </w:pPr>
-          <w:hyperlink w:anchor="_Toc243321558" w:history="1">
+          <w:hyperlink w:anchor="_Toc243322427" w:history="1">
             <w:r>
               <w:rPr>
                 <w:rStyle w:val="a5"/>
@@ -1347,7 +1305,7 @@
               <w:rPr>
                 <w:noProof/>
               </w:rPr>
-              <w:instrText xml:space="preserve"> PAGEREF _Toc243321558 \h </w:instrText>
+              <w:instrText xml:space="preserve"> PAGEREF _Toc243322427 \h </w:instrText>
             </w:r>
             <w:r>
               <w:rPr>
@@ -1382,14 +1340,10 @@
             </w:tabs>
             <w:ind w:left="440"/>
             <w:rPr>
-              <w:rFonts w:asciiTheme="minorHAnsi" w:hAnsiTheme="minorHAnsi" w:cstheme="minorBidi"/>
               <w:noProof/>
-              <w:kern w:val="2"/>
-              <w:szCs w:val="24"/>
-              <w14:ligatures w14:val="standardContextual"/>
             </w:rPr>
           </w:pPr>
-          <w:hyperlink w:anchor="_Toc243321559" w:history="1">
+          <w:hyperlink w:anchor="_Toc243322428" w:history="1">
             <w:r>
               <w:rPr>
                 <w:rStyle w:val="a5"/>
@@ -1413,7 +1367,7 @@
               <w:rPr>
                 <w:noProof/>
               </w:rPr>
-              <w:instrText xml:space="preserve"> PAGEREF _Toc243321559 \h </w:instrText>
+              <w:instrText xml:space="preserve"> PAGEREF _Toc243322428 \h </w:instrText>
             </w:r>
             <w:r>
               <w:rPr>
@@ -1448,14 +1402,10 @@
             </w:tabs>
             <w:ind w:left="440"/>
             <w:rPr>
-              <w:rFonts w:asciiTheme="minorHAnsi" w:hAnsiTheme="minorHAnsi" w:cstheme="minorBidi"/>
               <w:noProof/>
-              <w:kern w:val="2"/>
-              <w:szCs w:val="24"/>
-              <w14:ligatures w14:val="standardContextual"/>
             </w:rPr>
           </w:pPr>
-          <w:hyperlink w:anchor="_Toc243321560" w:history="1">
+          <w:hyperlink w:anchor="_Toc243322429" w:history="1">
             <w:r>
               <w:rPr>
                 <w:rStyle w:val="a5"/>
@@ -1479,7 +1429,7 @@
               <w:rPr>
                 <w:noProof/>
               </w:rPr>
-              <w:instrText xml:space="preserve"> PAGEREF _Toc243321560 \h </w:instrText>
+              <w:instrText xml:space="preserve"> PAGEREF _Toc243322429 \h </w:instrText>
             </w:r>
             <w:r>
               <w:rPr>
@@ -1514,14 +1464,10 @@
             </w:tabs>
             <w:ind w:left="440"/>
             <w:rPr>
-              <w:rFonts w:asciiTheme="minorHAnsi" w:hAnsiTheme="minorHAnsi" w:cstheme="minorBidi"/>
               <w:noProof/>
-              <w:kern w:val="2"/>
-              <w:szCs w:val="24"/>
-              <w14:ligatures w14:val="standardContextual"/>
             </w:rPr>
           </w:pPr>
-          <w:hyperlink w:anchor="_Toc243321561" w:history="1">
+          <w:hyperlink w:anchor="_Toc243322430" w:history="1">
             <w:r>
               <w:rPr>
                 <w:rStyle w:val="a5"/>
@@ -1545,7 +1491,7 @@
               <w:rPr>
                 <w:noProof/>
               </w:rPr>
-              <w:instrText xml:space="preserve"> PAGEREF _Toc243321561 \h </w:instrText>
+              <w:instrText xml:space="preserve"> PAGEREF _Toc243322430 \h </w:instrText>
             </w:r>
             <w:r>
               <w:rPr>
@@ -1579,14 +1525,10 @@
               <w:tab w:val="right" w:leader="dot" w:pos="9016"/>
             </w:tabs>
             <w:rPr>
-              <w:rFonts w:asciiTheme="minorHAnsi" w:hAnsiTheme="minorHAnsi" w:cstheme="minorBidi"/>
               <w:noProof/>
-              <w:kern w:val="2"/>
-              <w:szCs w:val="24"/>
-              <w14:ligatures w14:val="standardContextual"/>
             </w:rPr>
           </w:pPr>
-          <w:hyperlink w:anchor="_Toc243321562" w:history="1">
+          <w:hyperlink w:anchor="_Toc243322431" w:history="1">
             <w:r>
               <w:rPr>
                 <w:rStyle w:val="a5"/>
@@ -1610,7 +1552,7 @@
               <w:rPr>
                 <w:noProof/>
               </w:rPr>
-              <w:instrText xml:space="preserve"> PAGEREF _Toc243321562 \h </w:instrText>
+              <w:instrText xml:space="preserve"> PAGEREF _Toc243322431 \h </w:instrText>
             </w:r>
             <w:r>
               <w:rPr>
@@ -1645,14 +1587,10 @@
             </w:tabs>
             <w:ind w:left="440"/>
             <w:rPr>
-              <w:rFonts w:asciiTheme="minorHAnsi" w:hAnsiTheme="minorHAnsi" w:cstheme="minorBidi"/>
               <w:noProof/>
-              <w:kern w:val="2"/>
-              <w:szCs w:val="24"/>
-              <w14:ligatures w14:val="standardContextual"/>
             </w:rPr>
           </w:pPr>
-          <w:hyperlink w:anchor="_Toc243321563" w:history="1">
+          <w:hyperlink w:anchor="_Toc243322432" w:history="1">
             <w:r>
               <w:rPr>
                 <w:rStyle w:val="a5"/>
@@ -1676,7 +1614,7 @@
               <w:rPr>
                 <w:noProof/>
               </w:rPr>
-              <w:instrText xml:space="preserve"> PAGEREF _Toc243321563 \h </w:instrText>
+              <w:instrText xml:space="preserve"> PAGEREF _Toc243322432 \h </w:instrText>
             </w:r>
             <w:r>
               <w:rPr>
@@ -1711,14 +1649,10 @@
             </w:tabs>
             <w:ind w:left="440"/>
             <w:rPr>
-              <w:rFonts w:asciiTheme="minorHAnsi" w:hAnsiTheme="minorHAnsi" w:cstheme="minorBidi"/>
               <w:noProof/>
-              <w:kern w:val="2"/>
-              <w:szCs w:val="24"/>
-              <w14:ligatures w14:val="standardContextual"/>
             </w:rPr>
           </w:pPr>
-          <w:hyperlink w:anchor="_Toc243321564" w:history="1">
+          <w:hyperlink w:anchor="_Toc243322433" w:history="1">
             <w:r>
               <w:rPr>
                 <w:rStyle w:val="a5"/>
@@ -1742,7 +1676,7 @@
               <w:rPr>
                 <w:noProof/>
               </w:rPr>
-              <w:instrText xml:space="preserve"> PAGEREF _Toc243321564 \h </w:instrText>
+              <w:instrText xml:space="preserve"> PAGEREF _Toc243322433 \h </w:instrText>
             </w:r>
             <w:r>
               <w:rPr>
@@ -1777,14 +1711,10 @@
             </w:tabs>
             <w:ind w:left="440"/>
             <w:rPr>
-              <w:rFonts w:asciiTheme="minorHAnsi" w:hAnsiTheme="minorHAnsi" w:cstheme="minorBidi"/>
               <w:noProof/>
-              <w:kern w:val="2"/>
-              <w:szCs w:val="24"/>
-              <w14:ligatures w14:val="standardContextual"/>
             </w:rPr>
           </w:pPr>
-          <w:hyperlink w:anchor="_Toc243321565" w:history="1">
+          <w:hyperlink w:anchor="_Toc243322434" w:history="1">
             <w:r>
               <w:rPr>
                 <w:rStyle w:val="a5"/>
@@ -1808,7 +1738,7 @@
               <w:rPr>
                 <w:noProof/>
               </w:rPr>
-              <w:instrText xml:space="preserve"> PAGEREF _Toc243321565 \h </w:instrText>
+              <w:instrText xml:space="preserve"> PAGEREF _Toc243322434 \h </w:instrText>
             </w:r>
             <w:r>
               <w:rPr>
@@ -1842,14 +1772,10 @@
               <w:tab w:val="right" w:leader="dot" w:pos="9016"/>
             </w:tabs>
             <w:rPr>
-              <w:rFonts w:asciiTheme="minorHAnsi" w:hAnsiTheme="minorHAnsi" w:cstheme="minorBidi"/>
               <w:noProof/>
-              <w:kern w:val="2"/>
-              <w:szCs w:val="24"/>
-              <w14:ligatures w14:val="standardContextual"/>
             </w:rPr>
           </w:pPr>
-          <w:hyperlink w:anchor="_Toc243321566" w:history="1">
+          <w:hyperlink w:anchor="_Toc243322435" w:history="1">
             <w:r>
               <w:rPr>
                 <w:rStyle w:val="a5"/>
@@ -1873,7 +1799,7 @@
               <w:rPr>
                 <w:noProof/>
               </w:rPr>
-              <w:instrText xml:space="preserve"> PAGEREF _Toc243321566 \h </w:instrText>
+              <w:instrText xml:space="preserve"> PAGEREF _Toc243322435 \h </w:instrText>
             </w:r>
             <w:r>
               <w:rPr>
@@ -1908,14 +1834,10 @@
             </w:tabs>
             <w:ind w:left="440"/>
             <w:rPr>
-              <w:rFonts w:asciiTheme="minorHAnsi" w:hAnsiTheme="minorHAnsi" w:cstheme="minorBidi"/>
               <w:noProof/>
-              <w:kern w:val="2"/>
-              <w:szCs w:val="24"/>
-              <w14:ligatures w14:val="standardContextual"/>
             </w:rPr>
           </w:pPr>
-          <w:hyperlink w:anchor="_Toc243321567" w:history="1">
+          <w:hyperlink w:anchor="_Toc243322436" w:history="1">
             <w:r>
               <w:rPr>
                 <w:rStyle w:val="a5"/>
@@ -1939,7 +1861,7 @@
               <w:rPr>
                 <w:noProof/>
               </w:rPr>
-              <w:instrText xml:space="preserve"> PAGEREF _Toc243321567 \h </w:instrText>
+              <w:instrText xml:space="preserve"> PAGEREF _Toc243322436 \h </w:instrText>
             </w:r>
             <w:r>
               <w:rPr>
@@ -1974,14 +1896,10 @@
             </w:tabs>
             <w:ind w:left="440"/>
             <w:rPr>
-              <w:rFonts w:asciiTheme="minorHAnsi" w:hAnsiTheme="minorHAnsi" w:cstheme="minorBidi"/>
               <w:noProof/>
-              <w:kern w:val="2"/>
-              <w:szCs w:val="24"/>
-              <w14:ligatures w14:val="standardContextual"/>
             </w:rPr>
           </w:pPr>
-          <w:hyperlink w:anchor="_Toc243321568" w:history="1">
+          <w:hyperlink w:anchor="_Toc243322437" w:history="1">
             <w:r>
               <w:rPr>
                 <w:rStyle w:val="a5"/>
@@ -2005,7 +1923,7 @@
               <w:rPr>
                 <w:noProof/>
               </w:rPr>
-              <w:instrText xml:space="preserve"> PAGEREF _Toc243321568 \h </w:instrText>
+              <w:instrText xml:space="preserve"> PAGEREF _Toc243322437 \h </w:instrText>
             </w:r>
             <w:r>
               <w:rPr>
@@ -2040,14 +1958,10 @@
             </w:tabs>
             <w:ind w:left="440"/>
             <w:rPr>
-              <w:rFonts w:asciiTheme="minorHAnsi" w:hAnsiTheme="minorHAnsi" w:cstheme="minorBidi"/>
               <w:noProof/>
-              <w:kern w:val="2"/>
-              <w:szCs w:val="24"/>
-              <w14:ligatures w14:val="standardContextual"/>
             </w:rPr>
           </w:pPr>
-          <w:hyperlink w:anchor="_Toc243321569" w:history="1">
+          <w:hyperlink w:anchor="_Toc243322438" w:history="1">
             <w:r>
               <w:rPr>
                 <w:rStyle w:val="a5"/>
@@ -2071,7 +1985,7 @@
               <w:rPr>
                 <w:noProof/>
               </w:rPr>
-              <w:instrText xml:space="preserve"> PAGEREF _Toc243321569 \h </w:instrText>
+              <w:instrText xml:space="preserve"> PAGEREF _Toc243322438 \h </w:instrText>
             </w:r>
             <w:r>
               <w:rPr>
@@ -2106,14 +2020,10 @@
             </w:tabs>
             <w:ind w:left="440"/>
             <w:rPr>
-              <w:rFonts w:asciiTheme="minorHAnsi" w:hAnsiTheme="minorHAnsi" w:cstheme="minorBidi"/>
               <w:noProof/>
-              <w:kern w:val="2"/>
-              <w:szCs w:val="24"/>
-              <w14:ligatures w14:val="standardContextual"/>
             </w:rPr>
           </w:pPr>
-          <w:hyperlink w:anchor="_Toc243321570" w:history="1">
+          <w:hyperlink w:anchor="_Toc243322439" w:history="1">
             <w:r>
               <w:rPr>
                 <w:rStyle w:val="a5"/>
@@ -2137,7 +2047,7 @@
               <w:rPr>
                 <w:noProof/>
               </w:rPr>
-              <w:instrText xml:space="preserve"> PAGEREF _Toc243321570 \h </w:instrText>
+              <w:instrText xml:space="preserve"> PAGEREF _Toc243322439 \h </w:instrText>
             </w:r>
             <w:r>
               <w:rPr>
@@ -2172,14 +2082,10 @@
             </w:tabs>
             <w:ind w:left="440"/>
             <w:rPr>
-              <w:rFonts w:asciiTheme="minorHAnsi" w:hAnsiTheme="minorHAnsi" w:cstheme="minorBidi"/>
               <w:noProof/>
-              <w:kern w:val="2"/>
-              <w:szCs w:val="24"/>
-              <w14:ligatures w14:val="standardContextual"/>
             </w:rPr>
           </w:pPr>
-          <w:hyperlink w:anchor="_Toc243321571" w:history="1">
+          <w:hyperlink w:anchor="_Toc243322440" w:history="1">
             <w:r>
               <w:rPr>
                 <w:rStyle w:val="a5"/>
@@ -2203,7 +2109,7 @@
               <w:rPr>
                 <w:noProof/>
               </w:rPr>
-              <w:instrText xml:space="preserve"> PAGEREF _Toc243321571 \h </w:instrText>
+              <w:instrText xml:space="preserve"> PAGEREF _Toc243322440 \h </w:instrText>
             </w:r>
             <w:r>
               <w:rPr>
@@ -2238,14 +2144,10 @@
             </w:tabs>
             <w:ind w:left="440"/>
             <w:rPr>
-              <w:rFonts w:asciiTheme="minorHAnsi" w:hAnsiTheme="minorHAnsi" w:cstheme="minorBidi"/>
               <w:noProof/>
-              <w:kern w:val="2"/>
-              <w:szCs w:val="24"/>
-              <w14:ligatures w14:val="standardContextual"/>
             </w:rPr>
           </w:pPr>
-          <w:hyperlink w:anchor="_Toc243321572" w:history="1">
+          <w:hyperlink w:anchor="_Toc243322441" w:history="1">
             <w:r>
               <w:rPr>
                 <w:rStyle w:val="a5"/>
@@ -2269,7 +2171,7 @@
               <w:rPr>
                 <w:noProof/>
               </w:rPr>
-              <w:instrText xml:space="preserve"> PAGEREF _Toc243321572 \h </w:instrText>
+              <w:instrText xml:space="preserve"> PAGEREF _Toc243322441 \h </w:instrText>
             </w:r>
             <w:r>
               <w:rPr>
@@ -2304,14 +2206,10 @@
             </w:tabs>
             <w:ind w:left="440"/>
             <w:rPr>
-              <w:rFonts w:asciiTheme="minorHAnsi" w:hAnsiTheme="minorHAnsi" w:cstheme="minorBidi"/>
               <w:noProof/>
-              <w:kern w:val="2"/>
-              <w:szCs w:val="24"/>
-              <w14:ligatures w14:val="standardContextual"/>
             </w:rPr>
           </w:pPr>
-          <w:hyperlink w:anchor="_Toc243321573" w:history="1">
+          <w:hyperlink w:anchor="_Toc243322442" w:history="1">
             <w:r>
               <w:rPr>
                 <w:rStyle w:val="a5"/>
@@ -2335,7 +2233,7 @@
               <w:rPr>
                 <w:noProof/>
               </w:rPr>
-              <w:instrText xml:space="preserve"> PAGEREF _Toc243321573 \h </w:instrText>
+              <w:instrText xml:space="preserve"> PAGEREF _Toc243322442 \h </w:instrText>
             </w:r>
             <w:r>
               <w:rPr>
@@ -2370,14 +2268,10 @@
             </w:tabs>
             <w:ind w:left="440"/>
             <w:rPr>
-              <w:rFonts w:asciiTheme="minorHAnsi" w:hAnsiTheme="minorHAnsi" w:cstheme="minorBidi"/>
               <w:noProof/>
-              <w:kern w:val="2"/>
-              <w:szCs w:val="24"/>
-              <w14:ligatures w14:val="standardContextual"/>
             </w:rPr>
           </w:pPr>
-          <w:hyperlink w:anchor="_Toc243321574" w:history="1">
+          <w:hyperlink w:anchor="_Toc243322443" w:history="1">
             <w:r>
               <w:rPr>
                 <w:rStyle w:val="a5"/>
@@ -2401,7 +2295,7 @@
               <w:rPr>
                 <w:noProof/>
               </w:rPr>
-              <w:instrText xml:space="preserve"> PAGEREF _Toc243321574 \h </w:instrText>
+              <w:instrText xml:space="preserve"> PAGEREF _Toc243322443 \h </w:instrText>
             </w:r>
             <w:r>
               <w:rPr>
@@ -2436,14 +2330,10 @@
             </w:tabs>
             <w:ind w:left="440"/>
             <w:rPr>
-              <w:rFonts w:asciiTheme="minorHAnsi" w:hAnsiTheme="minorHAnsi" w:cstheme="minorBidi"/>
               <w:noProof/>
-              <w:kern w:val="2"/>
-              <w:szCs w:val="24"/>
-              <w14:ligatures w14:val="standardContextual"/>
             </w:rPr>
           </w:pPr>
-          <w:hyperlink w:anchor="_Toc243321575" w:history="1">
+          <w:hyperlink w:anchor="_Toc243322444" w:history="1">
             <w:r>
               <w:rPr>
                 <w:rStyle w:val="a5"/>
@@ -2467,7 +2357,7 @@
               <w:rPr>
                 <w:noProof/>
               </w:rPr>
-              <w:instrText xml:space="preserve"> PAGEREF _Toc243321575 \h </w:instrText>
+              <w:instrText xml:space="preserve"> PAGEREF _Toc243322444 \h </w:instrText>
             </w:r>
             <w:r>
               <w:rPr>
@@ -2501,14 +2391,10 @@
               <w:tab w:val="right" w:leader="dot" w:pos="9016"/>
             </w:tabs>
             <w:rPr>
-              <w:rFonts w:asciiTheme="minorHAnsi" w:hAnsiTheme="minorHAnsi" w:cstheme="minorBidi"/>
               <w:noProof/>
-              <w:kern w:val="2"/>
-              <w:szCs w:val="24"/>
-              <w14:ligatures w14:val="standardContextual"/>
             </w:rPr>
           </w:pPr>
-          <w:hyperlink w:anchor="_Toc243321576" w:history="1">
+          <w:hyperlink w:anchor="_Toc243322445" w:history="1">
             <w:r>
               <w:rPr>
                 <w:rStyle w:val="a5"/>
@@ -2532,7 +2418,7 @@
               <w:rPr>
                 <w:noProof/>
               </w:rPr>
-              <w:instrText xml:space="preserve"> PAGEREF _Toc243321576 \h </w:instrText>
+              <w:instrText xml:space="preserve"> PAGEREF _Toc243322445 \h </w:instrText>
             </w:r>
             <w:r>
               <w:rPr>
@@ -2567,14 +2453,10 @@
             </w:tabs>
             <w:ind w:left="440"/>
             <w:rPr>
-              <w:rFonts w:asciiTheme="minorHAnsi" w:hAnsiTheme="minorHAnsi" w:cstheme="minorBidi"/>
               <w:noProof/>
-              <w:kern w:val="2"/>
-              <w:szCs w:val="24"/>
-              <w14:ligatures w14:val="standardContextual"/>
             </w:rPr>
           </w:pPr>
-          <w:hyperlink w:anchor="_Toc243321577" w:history="1">
+          <w:hyperlink w:anchor="_Toc243322446" w:history="1">
             <w:r>
               <w:rPr>
                 <w:rStyle w:val="a5"/>
@@ -2598,7 +2480,7 @@
               <w:rPr>
                 <w:noProof/>
               </w:rPr>
-              <w:instrText xml:space="preserve"> PAGEREF _Toc243321577 \h </w:instrText>
+              <w:instrText xml:space="preserve"> PAGEREF _Toc243322446 \h </w:instrText>
             </w:r>
             <w:r>
               <w:rPr>
@@ -2633,14 +2515,10 @@
             </w:tabs>
             <w:ind w:left="440"/>
             <w:rPr>
-              <w:rFonts w:asciiTheme="minorHAnsi" w:hAnsiTheme="minorHAnsi" w:cstheme="minorBidi"/>
               <w:noProof/>
-              <w:kern w:val="2"/>
-              <w:szCs w:val="24"/>
-              <w14:ligatures w14:val="standardContextual"/>
             </w:rPr>
           </w:pPr>
-          <w:hyperlink w:anchor="_Toc243321578" w:history="1">
+          <w:hyperlink w:anchor="_Toc243322447" w:history="1">
             <w:r>
               <w:rPr>
                 <w:rStyle w:val="a5"/>
@@ -2664,7 +2542,7 @@
               <w:rPr>
                 <w:noProof/>
               </w:rPr>
-              <w:instrText xml:space="preserve"> PAGEREF _Toc243321578 \h </w:instrText>
+              <w:instrText xml:space="preserve"> PAGEREF _Toc243322447 \h </w:instrText>
             </w:r>
             <w:r>
               <w:rPr>
@@ -2699,14 +2577,10 @@
             </w:tabs>
             <w:ind w:left="440"/>
             <w:rPr>
-              <w:rFonts w:asciiTheme="minorHAnsi" w:hAnsiTheme="minorHAnsi" w:cstheme="minorBidi"/>
               <w:noProof/>
-              <w:kern w:val="2"/>
-              <w:szCs w:val="24"/>
-              <w14:ligatures w14:val="standardContextual"/>
             </w:rPr>
           </w:pPr>
-          <w:hyperlink w:anchor="_Toc243321579" w:history="1">
+          <w:hyperlink w:anchor="_Toc243322448" w:history="1">
             <w:r>
               <w:rPr>
                 <w:rStyle w:val="a5"/>
@@ -2730,7 +2604,7 @@
               <w:rPr>
                 <w:noProof/>
               </w:rPr>
-              <w:instrText xml:space="preserve"> PAGEREF _Toc243321579 \h </w:instrText>
+              <w:instrText xml:space="preserve"> PAGEREF _Toc243322448 \h </w:instrText>
             </w:r>
             <w:r>
               <w:rPr>
@@ -2765,14 +2639,10 @@
             </w:tabs>
             <w:ind w:left="440"/>
             <w:rPr>
-              <w:rFonts w:asciiTheme="minorHAnsi" w:hAnsiTheme="minorHAnsi" w:cstheme="minorBidi"/>
               <w:noProof/>
-              <w:kern w:val="2"/>
-              <w:szCs w:val="24"/>
-              <w14:ligatures w14:val="standardContextual"/>
             </w:rPr>
           </w:pPr>
-          <w:hyperlink w:anchor="_Toc243321580" w:history="1">
+          <w:hyperlink w:anchor="_Toc243322449" w:history="1">
             <w:r>
               <w:rPr>
                 <w:rStyle w:val="a5"/>
@@ -2796,7 +2666,7 @@
               <w:rPr>
                 <w:noProof/>
               </w:rPr>
-              <w:instrText xml:space="preserve"> PAGEREF _Toc243321580 \h </w:instrText>
+              <w:instrText xml:space="preserve"> PAGEREF _Toc243322449 \h </w:instrText>
             </w:r>
             <w:r>
               <w:rPr>
@@ -2831,14 +2701,10 @@
             </w:tabs>
             <w:ind w:left="440"/>
             <w:rPr>
-              <w:rFonts w:asciiTheme="minorHAnsi" w:hAnsiTheme="minorHAnsi" w:cstheme="minorBidi"/>
               <w:noProof/>
-              <w:kern w:val="2"/>
-              <w:szCs w:val="24"/>
-              <w14:ligatures w14:val="standardContextual"/>
             </w:rPr>
           </w:pPr>
-          <w:hyperlink w:anchor="_Toc243321581" w:history="1">
+          <w:hyperlink w:anchor="_Toc243322450" w:history="1">
             <w:r>
               <w:rPr>
                 <w:rStyle w:val="a5"/>
@@ -2862,7 +2728,7 @@
               <w:rPr>
                 <w:noProof/>
               </w:rPr>
-              <w:instrText xml:space="preserve"> PAGEREF _Toc243321581 \h </w:instrText>
+              <w:instrText xml:space="preserve"> PAGEREF _Toc243322450 \h </w:instrText>
             </w:r>
             <w:r>
               <w:rPr>
@@ -2897,14 +2763,10 @@
             </w:tabs>
             <w:ind w:left="440"/>
             <w:rPr>
-              <w:rFonts w:asciiTheme="minorHAnsi" w:hAnsiTheme="minorHAnsi" w:cstheme="minorBidi"/>
               <w:noProof/>
-              <w:kern w:val="2"/>
-              <w:szCs w:val="24"/>
-              <w14:ligatures w14:val="standardContextual"/>
             </w:rPr>
           </w:pPr>
-          <w:hyperlink w:anchor="_Toc243321582" w:history="1">
+          <w:hyperlink w:anchor="_Toc243322451" w:history="1">
             <w:r>
               <w:rPr>
                 <w:rStyle w:val="a5"/>
@@ -2928,7 +2790,7 @@
               <w:rPr>
                 <w:noProof/>
               </w:rPr>
-              <w:instrText xml:space="preserve"> PAGEREF _Toc243321582 \h </w:instrText>
+              <w:instrText xml:space="preserve"> PAGEREF _Toc243322451 \h </w:instrText>
             </w:r>
             <w:r>
               <w:rPr>
@@ -2962,14 +2824,10 @@
               <w:tab w:val="right" w:leader="dot" w:pos="9016"/>
             </w:tabs>
             <w:rPr>
-              <w:rFonts w:asciiTheme="minorHAnsi" w:hAnsiTheme="minorHAnsi" w:cstheme="minorBidi"/>
               <w:noProof/>
-              <w:kern w:val="2"/>
-              <w:szCs w:val="24"/>
-              <w14:ligatures w14:val="standardContextual"/>
             </w:rPr>
           </w:pPr>
-          <w:hyperlink w:anchor="_Toc243321583" w:history="1">
+          <w:hyperlink w:anchor="_Toc243322452" w:history="1">
             <w:r>
               <w:rPr>
                 <w:rStyle w:val="a5"/>
@@ -2993,7 +2851,7 @@
               <w:rPr>
                 <w:noProof/>
               </w:rPr>
-              <w:instrText xml:space="preserve"> PAGEREF _Toc243321583 \h </w:instrText>
+              <w:instrText xml:space="preserve"> PAGEREF _Toc243322452 \h </w:instrText>
             </w:r>
             <w:r>
               <w:rPr>
@@ -3027,14 +2885,10 @@
               <w:tab w:val="right" w:leader="dot" w:pos="9016"/>
             </w:tabs>
             <w:rPr>
-              <w:rFonts w:asciiTheme="minorHAnsi" w:hAnsiTheme="minorHAnsi" w:cstheme="minorBidi"/>
               <w:noProof/>
-              <w:kern w:val="2"/>
-              <w:szCs w:val="24"/>
-              <w14:ligatures w14:val="standardContextual"/>
             </w:rPr>
           </w:pPr>
-          <w:hyperlink w:anchor="_Toc243321584" w:history="1">
+          <w:hyperlink w:anchor="_Toc243322453" w:history="1">
             <w:r>
               <w:rPr>
                 <w:rStyle w:val="a5"/>
@@ -3058,7 +2912,7 @@
               <w:rPr>
                 <w:noProof/>
               </w:rPr>
-              <w:instrText xml:space="preserve"> PAGEREF _Toc243321584 \h </w:instrText>
+              <w:instrText xml:space="preserve"> PAGEREF _Toc243322453 \h </w:instrText>
             </w:r>
             <w:r>
               <w:rPr>
@@ -3093,14 +2947,10 @@
             </w:tabs>
             <w:ind w:left="440"/>
             <w:rPr>
-              <w:rFonts w:asciiTheme="minorHAnsi" w:hAnsiTheme="minorHAnsi" w:cstheme="minorBidi"/>
               <w:noProof/>
-              <w:kern w:val="2"/>
-              <w:szCs w:val="24"/>
-              <w14:ligatures w14:val="standardContextual"/>
             </w:rPr>
           </w:pPr>
-          <w:hyperlink w:anchor="_Toc243321585" w:history="1">
+          <w:hyperlink w:anchor="_Toc243322454" w:history="1">
             <w:r>
               <w:rPr>
                 <w:rStyle w:val="a5"/>
@@ -3124,7 +2974,7 @@
               <w:rPr>
                 <w:noProof/>
               </w:rPr>
-              <w:instrText xml:space="preserve"> PAGEREF _Toc243321585 \h </w:instrText>
+              <w:instrText xml:space="preserve"> PAGEREF _Toc243322454 \h </w:instrText>
             </w:r>
             <w:r>
               <w:rPr>
@@ -3159,14 +3009,10 @@
             </w:tabs>
             <w:ind w:left="440"/>
             <w:rPr>
-              <w:rFonts w:asciiTheme="minorHAnsi" w:hAnsiTheme="minorHAnsi" w:cstheme="minorBidi"/>
               <w:noProof/>
-              <w:kern w:val="2"/>
-              <w:szCs w:val="24"/>
-              <w14:ligatures w14:val="standardContextual"/>
             </w:rPr>
           </w:pPr>
-          <w:hyperlink w:anchor="_Toc243321586" w:history="1">
+          <w:hyperlink w:anchor="_Toc243322455" w:history="1">
             <w:r>
               <w:rPr>
                 <w:rStyle w:val="a5"/>
@@ -3190,7 +3036,7 @@
               <w:rPr>
                 <w:noProof/>
               </w:rPr>
-              <w:instrText xml:space="preserve"> PAGEREF _Toc243321586 \h </w:instrText>
+              <w:instrText xml:space="preserve"> PAGEREF _Toc243322455 \h </w:instrText>
             </w:r>
             <w:r>
               <w:rPr>
@@ -3225,14 +3071,10 @@
             </w:tabs>
             <w:ind w:left="440"/>
             <w:rPr>
-              <w:rFonts w:asciiTheme="minorHAnsi" w:hAnsiTheme="minorHAnsi" w:cstheme="minorBidi"/>
               <w:noProof/>
-              <w:kern w:val="2"/>
-              <w:szCs w:val="24"/>
-              <w14:ligatures w14:val="standardContextual"/>
             </w:rPr>
           </w:pPr>
-          <w:hyperlink w:anchor="_Toc243321587" w:history="1">
+          <w:hyperlink w:anchor="_Toc243322456" w:history="1">
             <w:r>
               <w:rPr>
                 <w:rStyle w:val="a5"/>
@@ -3256,7 +3098,7 @@
               <w:rPr>
                 <w:noProof/>
               </w:rPr>
-              <w:instrText xml:space="preserve"> PAGEREF _Toc243321587 \h </w:instrText>
+              <w:instrText xml:space="preserve"> PAGEREF _Toc243322456 \h </w:instrText>
             </w:r>
             <w:r>
               <w:rPr>
@@ -3291,14 +3133,10 @@
             </w:tabs>
             <w:ind w:left="440"/>
             <w:rPr>
-              <w:rFonts w:asciiTheme="minorHAnsi" w:hAnsiTheme="minorHAnsi" w:cstheme="minorBidi"/>
               <w:noProof/>
-              <w:kern w:val="2"/>
-              <w:szCs w:val="24"/>
-              <w14:ligatures w14:val="standardContextual"/>
             </w:rPr>
           </w:pPr>
-          <w:hyperlink w:anchor="_Toc243321588" w:history="1">
+          <w:hyperlink w:anchor="_Toc243322457" w:history="1">
             <w:r>
               <w:rPr>
                 <w:rStyle w:val="a5"/>
@@ -3322,7 +3160,7 @@
               <w:rPr>
                 <w:noProof/>
               </w:rPr>
-              <w:instrText xml:space="preserve"> PAGEREF _Toc243321588 \h </w:instrText>
+              <w:instrText xml:space="preserve"> PAGEREF _Toc243322457 \h </w:instrText>
             </w:r>
             <w:r>
               <w:rPr>
@@ -3356,14 +3194,10 @@
               <w:tab w:val="right" w:leader="dot" w:pos="9016"/>
             </w:tabs>
             <w:rPr>
-              <w:rFonts w:asciiTheme="minorHAnsi" w:hAnsiTheme="minorHAnsi" w:cstheme="minorBidi"/>
               <w:noProof/>
-              <w:kern w:val="2"/>
-              <w:szCs w:val="24"/>
-              <w14:ligatures w14:val="standardContextual"/>
             </w:rPr>
           </w:pPr>
-          <w:hyperlink w:anchor="_Toc243321589" w:history="1">
+          <w:hyperlink w:anchor="_Toc243322458" w:history="1">
             <w:r>
               <w:rPr>
                 <w:rStyle w:val="a5"/>
@@ -3387,7 +3221,7 @@
               <w:rPr>
                 <w:noProof/>
               </w:rPr>
-              <w:instrText xml:space="preserve"> PAGEREF _Toc243321589 \h </w:instrText>
+              <w:instrText xml:space="preserve"> PAGEREF _Toc243322458 \h </w:instrText>
             </w:r>
             <w:r>
               <w:rPr>
@@ -3421,14 +3255,10 @@
               <w:tab w:val="right" w:leader="dot" w:pos="9016"/>
             </w:tabs>
             <w:rPr>
-              <w:rFonts w:asciiTheme="minorHAnsi" w:hAnsiTheme="minorHAnsi" w:cstheme="minorBidi"/>
               <w:noProof/>
-              <w:kern w:val="2"/>
-              <w:szCs w:val="24"/>
-              <w14:ligatures w14:val="standardContextual"/>
             </w:rPr>
           </w:pPr>
-          <w:hyperlink w:anchor="_Toc243321590" w:history="1">
+          <w:hyperlink w:anchor="_Toc243322459" w:history="1">
             <w:r>
               <w:rPr>
                 <w:rStyle w:val="a5"/>
@@ -3452,7 +3282,7 @@
               <w:rPr>
                 <w:noProof/>
               </w:rPr>
-              <w:instrText xml:space="preserve"> PAGEREF _Toc243321590 \h </w:instrText>
+              <w:instrText xml:space="preserve"> PAGEREF _Toc243322459 \h </w:instrText>
             </w:r>
             <w:r>
               <w:rPr>
@@ -3486,14 +3316,10 @@
               <w:tab w:val="right" w:leader="dot" w:pos="9016"/>
             </w:tabs>
             <w:rPr>
-              <w:rFonts w:asciiTheme="minorHAnsi" w:hAnsiTheme="minorHAnsi" w:cstheme="minorBidi"/>
               <w:noProof/>
-              <w:kern w:val="2"/>
-              <w:szCs w:val="24"/>
-              <w14:ligatures w14:val="standardContextual"/>
             </w:rPr>
           </w:pPr>
-          <w:hyperlink w:anchor="_Toc243321591" w:history="1">
+          <w:hyperlink w:anchor="_Toc243322460" w:history="1">
             <w:r>
               <w:rPr>
                 <w:rStyle w:val="a5"/>
@@ -3517,7 +3343,7 @@
               <w:rPr>
                 <w:noProof/>
               </w:rPr>
-              <w:instrText xml:space="preserve"> PAGEREF _Toc243321591 \h </w:instrText>
+              <w:instrText xml:space="preserve"> PAGEREF _Toc243322460 \h </w:instrText>
             </w:r>
             <w:r>
               <w:rPr>
@@ -3551,14 +3377,10 @@
               <w:tab w:val="right" w:leader="dot" w:pos="9016"/>
             </w:tabs>
             <w:rPr>
-              <w:rFonts w:asciiTheme="minorHAnsi" w:hAnsiTheme="minorHAnsi" w:cstheme="minorBidi"/>
               <w:noProof/>
-              <w:kern w:val="2"/>
-              <w:szCs w:val="24"/>
-              <w14:ligatures w14:val="standardContextual"/>
             </w:rPr>
           </w:pPr>
-          <w:hyperlink w:anchor="_Toc243321592" w:history="1">
+          <w:hyperlink w:anchor="_Toc243322461" w:history="1">
             <w:r>
               <w:rPr>
                 <w:rStyle w:val="a5"/>
@@ -3582,7 +3404,7 @@
               <w:rPr>
                 <w:noProof/>
               </w:rPr>
-              <w:instrText xml:space="preserve"> PAGEREF _Toc243321592 \h </w:instrText>
+              <w:instrText xml:space="preserve"> PAGEREF _Toc243322461 \h </w:instrText>
             </w:r>
             <w:r>
               <w:rPr>
@@ -3617,14 +3439,10 @@
             </w:tabs>
             <w:ind w:left="440"/>
             <w:rPr>
-              <w:rFonts w:asciiTheme="minorHAnsi" w:hAnsiTheme="minorHAnsi" w:cstheme="minorBidi"/>
               <w:noProof/>
-              <w:kern w:val="2"/>
-              <w:szCs w:val="24"/>
-              <w14:ligatures w14:val="standardContextual"/>
             </w:rPr>
           </w:pPr>
-          <w:hyperlink w:anchor="_Toc243321593" w:history="1">
+          <w:hyperlink w:anchor="_Toc243322462" w:history="1">
             <w:r>
               <w:rPr>
                 <w:rStyle w:val="a5"/>
@@ -3648,7 +3466,7 @@
               <w:rPr>
                 <w:noProof/>
               </w:rPr>
-              <w:instrText xml:space="preserve"> PAGEREF _Toc243321593 \h </w:instrText>
+              <w:instrText xml:space="preserve"> PAGEREF _Toc243322462 \h </w:instrText>
             </w:r>
             <w:r>
               <w:rPr>
@@ -3687,7 +3505,7 @@
         <w:pStyle w:val="1"/>
         <w:pageBreakBefore/>
       </w:pPr>
-      <w:bookmarkStart w:id="0" w:name="_Toc243321549"/>
+      <w:bookmarkStart w:id="0" w:name="_Toc243322418"/>
       <w:r>
         <w:lastRenderedPageBreak/>
         <w:t>1. Introduction</w:t>
@@ -3698,7 +3516,7 @@
       <w:pPr>
         <w:pStyle w:val="2"/>
       </w:pPr>
-      <w:bookmarkStart w:id="1" w:name="_Toc243321550"/>
+      <w:bookmarkStart w:id="1" w:name="_Toc243322419"/>
       <w:r>
         <w:t>1.1 Purpose of the project</w:t>
       </w:r>
@@ -3741,7 +3559,7 @@
       <w:pPr>
         <w:pStyle w:val="2"/>
       </w:pPr>
-      <w:bookmarkStart w:id="2" w:name="_Toc243321551"/>
+      <w:bookmarkStart w:id="2" w:name="_Toc243322420"/>
       <w:r>
         <w:t>1.2 Who will use it</w:t>
       </w:r>
@@ -3759,7 +3577,7 @@
       <w:pPr>
         <w:pStyle w:val="2"/>
       </w:pPr>
-      <w:bookmarkStart w:id="3" w:name="_Toc243321552"/>
+      <w:bookmarkStart w:id="3" w:name="_Toc243322421"/>
       <w:r>
         <w:t>1.3 Goals</w:t>
       </w:r>
@@ -3842,7 +3660,7 @@
       <w:pPr>
         <w:pStyle w:val="2"/>
       </w:pPr>
-      <w:bookmarkStart w:id="4" w:name="_Toc243321553"/>
+      <w:bookmarkStart w:id="4" w:name="_Toc243322422"/>
       <w:r>
         <w:t>1.4 Team and module ownership</w:t>
       </w:r>
@@ -4496,9 +4314,9 @@
       <w:pPr>
         <w:pStyle w:val="2"/>
       </w:pPr>
-      <w:bookmarkStart w:id="5" w:name="_Toc243321554"/>
-      <w:r>
-        <w:t>1.5 Use of generative AI</w:t>
+      <w:bookmarkStart w:id="5" w:name="_Toc243322423"/>
+      <w:r>
+        <w:t>1.5 Use of AI tools</w:t>
       </w:r>
       <w:bookmarkEnd w:id="5"/>
     </w:p>
@@ -4507,21 +4325,7 @@
         <w:spacing w:after="140" w:line="300" w:lineRule="auto"/>
       </w:pPr>
       <w:r>
-        <w:t>The team used AI coding assistants during development to help write and review code, tests and documentation, and to draft parts of this report. The team made the design decisions, checked the generated work, and verified the system through automated tests and real-data evaluation (Section 6). The agents inside Bargain Agent itself use the DeepSeek language model (DeepSeek, n.d.).</w:t>
-      </w:r>
-    </w:p>
-    <w:p>
-      <w:pPr>
-        <w:shd w:val="clear" w:color="auto" w:fill="FFF4D6"/>
-        <w:spacing w:after="140" w:line="300" w:lineRule="auto"/>
-      </w:pPr>
-      <w:r>
-        <w:rPr>
-          <w:i/>
-          <w:iCs/>
-          <w:color w:val="7A5A00"/>
-        </w:rPr>
-        <w:t>[Team: name the AI tools you used and adjust this statement to match the course policy.]</w:t>
+        <w:t>AI-assisted programming tools were used during the development of this project.</w:t>
       </w:r>
     </w:p>
     <w:p>
@@ -4529,7 +4333,7 @@
         <w:pStyle w:val="1"/>
         <w:pageBreakBefore/>
       </w:pPr>
-      <w:bookmarkStart w:id="6" w:name="_Toc243321555"/>
+      <w:bookmarkStart w:id="6" w:name="_Toc243322424"/>
       <w:r>
         <w:lastRenderedPageBreak/>
         <w:t>2. Background</w:t>
@@ -4549,7 +4353,10 @@
         <w:spacing w:after="140" w:line="300" w:lineRule="auto"/>
       </w:pPr>
       <w:r>
-        <w:t xml:space="preserve">Large language models make a new kind of agent possible. ReAct showed that a model can interleave reasoning with actions such as searching (Yao et al., 2023), and Wang et al. (2024) survey the growing field of LLM-based autonomous agents, which plan, use tools and act on behalf of a user. The same models can also produce fluent text that is not true, a problem known as hallucination (Ji et al., 2023). For a shopping agent, an invented price or product would be worse than no answer at all. This shaped the most important design rule of our system: </w:t>
+        <w:t>Large language models make a new kind of agent possible. ReAct showed that a model can interleave reasoning with actions such as searching (Yao et al., 2023), and Wang et al. (2024) survey the growing field of LLM-based autonomous agents, which plan, use tools and act on behalf of a user. The same models can also produce fluent text that is not true, a problem known as hallucination (Ji et al., 2023). For a shopping agent, an invented price or product would be worse than no answer at all. This shaped the mo</w:t>
+      </w:r>
+      <w:r>
+        <w:t xml:space="preserve">st important design rule of our system: </w:t>
       </w:r>
       <w:r>
         <w:rPr>
@@ -4575,7 +4382,7 @@
         <w:pStyle w:val="1"/>
         <w:pageBreakBefore/>
       </w:pPr>
-      <w:bookmarkStart w:id="7" w:name="_Toc243321556"/>
+      <w:bookmarkStart w:id="7" w:name="_Toc243322425"/>
       <w:r>
         <w:lastRenderedPageBreak/>
         <w:t>3. Project evolution and key decisions</w:t>
@@ -4594,7 +4401,7 @@
       <w:pPr>
         <w:pStyle w:val="2"/>
       </w:pPr>
-      <w:bookmarkStart w:id="8" w:name="_Toc243321557"/>
+      <w:bookmarkStart w:id="8" w:name="_Toc243322426"/>
       <w:r>
         <w:t>3.1 The original approach: scraping each retailer</w:t>
       </w:r>
@@ -4612,7 +4419,7 @@
       <w:pPr>
         <w:pStyle w:val="2"/>
       </w:pPr>
-      <w:bookmarkStart w:id="9" w:name="_Toc243321558"/>
+      <w:bookmarkStart w:id="9" w:name="_Toc243322427"/>
       <w:r>
         <w:t>3.2 What went wrong</w:t>
       </w:r>
@@ -4677,7 +4484,7 @@
       <w:pPr>
         <w:pStyle w:val="2"/>
       </w:pPr>
-      <w:bookmarkStart w:id="10" w:name="_Toc243321559"/>
+      <w:bookmarkStart w:id="10" w:name="_Toc243322428"/>
       <w:r>
         <w:t>3.3 Decision: read Google Shopping through search APIs</w:t>
       </w:r>
@@ -4723,7 +4530,7 @@
       <w:pPr>
         <w:pStyle w:val="2"/>
       </w:pPr>
-      <w:bookmarkStart w:id="11" w:name="_Toc243321560"/>
+      <w:bookmarkStart w:id="11" w:name="_Toc243322429"/>
       <w:r>
         <w:t>3.4 Decision: a pipeline of single-purpose AI agents</w:t>
       </w:r>
@@ -4763,7 +4570,7 @@
       <w:pPr>
         <w:pStyle w:val="2"/>
       </w:pPr>
-      <w:bookmarkStart w:id="12" w:name="_Toc243321561"/>
+      <w:bookmarkStart w:id="12" w:name="_Toc243322430"/>
       <w:r>
         <w:t>3.5 Other decisions</w:t>
       </w:r>
@@ -5328,7 +5135,7 @@
         <w:pStyle w:val="1"/>
         <w:pageBreakBefore/>
       </w:pPr>
-      <w:bookmarkStart w:id="13" w:name="_Toc243321562"/>
+      <w:bookmarkStart w:id="13" w:name="_Toc243322431"/>
       <w:r>
         <w:lastRenderedPageBreak/>
         <w:t>4. System design</w:t>
@@ -5339,7 +5146,7 @@
       <w:pPr>
         <w:pStyle w:val="2"/>
       </w:pPr>
-      <w:bookmarkStart w:id="14" w:name="_Toc243321563"/>
+      <w:bookmarkStart w:id="14" w:name="_Toc243322432"/>
       <w:r>
         <w:t>4.1 Architecture</w:t>
       </w:r>
@@ -5374,7 +5181,7 @@
           <w:noProof/>
         </w:rPr>
         <w:drawing>
-          <wp:inline distT="0" distB="0" distL="0" distR="0" wp14:anchorId="10F38098" wp14:editId="6898FB84">
+          <wp:inline distT="0" distB="0" distL="0" distR="0" wp14:anchorId="42A309DC" wp14:editId="03BE1A49">
             <wp:extent cx="5715000" cy="2105025"/>
             <wp:effectExtent l="0" t="0" r="0" b="0"/>
             <wp:docPr id="1" name="architecture.png" descr="Architecture: four layers connected by an integration layer, and the external services the system uses." title="Figure 1"/>
@@ -5440,7 +5247,7 @@
       <w:pPr>
         <w:pStyle w:val="2"/>
       </w:pPr>
-      <w:bookmarkStart w:id="15" w:name="_Toc243321564"/>
+      <w:bookmarkStart w:id="15" w:name="_Toc243322433"/>
       <w:r>
         <w:t>4.2 Main flows</w:t>
       </w:r>
@@ -5484,7 +5291,7 @@
           <w:noProof/>
         </w:rPr>
         <w:drawing>
-          <wp:inline distT="0" distB="0" distL="0" distR="0" wp14:anchorId="4FF5EEEA" wp14:editId="28DB596E">
+          <wp:inline distT="0" distB="0" distL="0" distR="0" wp14:anchorId="2F03226F" wp14:editId="264CD3D8">
             <wp:extent cx="5715000" cy="1771650"/>
             <wp:effectExtent l="0" t="0" r="0" b="0"/>
             <wp:docPr id="2" name="pipeline.png" descr="The Find pipeline (top) and the monitoring flow (bottom). Purple boxes are AI agents; all decisions about deals and emails are made in code." title="Figure 2"/>
@@ -5550,7 +5357,7 @@
       <w:pPr>
         <w:pStyle w:val="2"/>
       </w:pPr>
-      <w:bookmarkStart w:id="16" w:name="_Toc243321565"/>
+      <w:bookmarkStart w:id="16" w:name="_Toc243322434"/>
       <w:r>
         <w:t>4.3 Technologies</w:t>
       </w:r>
@@ -6608,7 +6415,7 @@
         <w:pStyle w:val="1"/>
         <w:pageBreakBefore/>
       </w:pPr>
-      <w:bookmarkStart w:id="17" w:name="_Toc243321566"/>
+      <w:bookmarkStart w:id="17" w:name="_Toc243322435"/>
       <w:r>
         <w:lastRenderedPageBreak/>
         <w:t>5. Implementation</w:t>
@@ -6619,7 +6426,7 @@
       <w:pPr>
         <w:pStyle w:val="2"/>
       </w:pPr>
-      <w:bookmarkStart w:id="18" w:name="_Toc243321567"/>
+      <w:bookmarkStart w:id="18" w:name="_Toc243322436"/>
       <w:r>
         <w:t>5.1 The eight AI agents</w:t>
       </w:r>
@@ -7497,7 +7304,7 @@
       <w:pPr>
         <w:pStyle w:val="2"/>
       </w:pPr>
-      <w:bookmarkStart w:id="19" w:name="_Toc243321568"/>
+      <w:bookmarkStart w:id="19" w:name="_Toc243322437"/>
       <w:r>
         <w:t>5.2 Connecting the agents with LangGraph</w:t>
       </w:r>
@@ -7821,7 +7628,7 @@
       <w:pPr>
         <w:pStyle w:val="2"/>
       </w:pPr>
-      <w:bookmarkStart w:id="20" w:name="_Toc243321569"/>
+      <w:bookmarkStart w:id="20" w:name="_Toc243322438"/>
       <w:r>
         <w:t>5.3 One validated entry point for the model</w:t>
       </w:r>
@@ -7953,7 +7760,7 @@
       <w:pPr>
         <w:pStyle w:val="2"/>
       </w:pPr>
-      <w:bookmarkStart w:id="21" w:name="_Toc243321570"/>
+      <w:bookmarkStart w:id="21" w:name="_Toc243322439"/>
       <w:r>
         <w:t>5.4 Data providers and price verification</w:t>
       </w:r>
@@ -7990,7 +7797,7 @@
       <w:pPr>
         <w:pStyle w:val="2"/>
       </w:pPr>
-      <w:bookmarkStart w:id="22" w:name="_Toc243321571"/>
+      <w:bookmarkStart w:id="22" w:name="_Toc243322440"/>
       <w:r>
         <w:t>5.5 Same-product matching</w:t>
       </w:r>
@@ -8019,7 +7826,7 @@
       <w:pPr>
         <w:pStyle w:val="2"/>
       </w:pPr>
-      <w:bookmarkStart w:id="23" w:name="_Toc243321572"/>
+      <w:bookmarkStart w:id="23" w:name="_Toc243322441"/>
       <w:r>
         <w:t>5.6 Monitoring and alerts</w:t>
       </w:r>
@@ -8031,7 +7838,10 @@
       </w:pPr>
       <w:r>
         <w:lastRenderedPageBreak/>
-        <w:t>Each scheduled check runs one shared Google Shopping search for the whole task, however many merchants it watches, and reads each merchant's current price by product identifier. If a merchant is missing from the results, at most two retry searches and two detail lookups are made. The scheduler then excludes offers the verifier marked as different, takes the cheapest offer from a trusted merchant, and decides in code whether it is a deal: the price is at or below the target, or it has dropped by a chosen percentage since the last alert.</w:t>
+        <w:t>Each scheduled check runs one shared Google Shopping search for the whole task, however many merchants it watches, and reads each merchant's current price by product identifier. If a merchant is missing from the results, at most two retry searches and two detail lookups are made. The scheduler then excludes offers the verifier marked as different, takes the cheapest offer from a trusted merchant, and decides in code whether it is a deal: the price is at or below the target, or it has dropped by a chosen per</w:t>
+      </w:r>
+      <w:r>
+        <w:t>centage since the last alert.</w:t>
       </w:r>
     </w:p>
     <w:p>
@@ -8057,7 +7867,7 @@
       <w:pPr>
         <w:pStyle w:val="2"/>
       </w:pPr>
-      <w:bookmarkStart w:id="24" w:name="_Toc243321573"/>
+      <w:bookmarkStart w:id="24" w:name="_Toc243322442"/>
       <w:r>
         <w:t>5.7 Web interface and email</w:t>
       </w:r>
@@ -8081,7 +7891,7 @@
           <w:noProof/>
         </w:rPr>
         <w:drawing>
-          <wp:inline distT="0" distB="0" distL="0" distR="0" wp14:anchorId="0202A350" wp14:editId="3A3FD914">
+          <wp:inline distT="0" distB="0" distL="0" distR="0" wp14:anchorId="6C67BEF0" wp14:editId="6314E33D">
             <wp:extent cx="5715000" cy="3838575"/>
             <wp:effectExtent l="0" t="0" r="0" b="0"/>
             <wp:docPr id="3" name="find.png" descr="A real search for &quot;noise cancelling headphones under NZD 400&quot;: the search terms written by the Rewrite agent, and product cards with bilingual summaries." title="Figure 3"/>
@@ -8154,7 +7964,7 @@
         </w:rPr>
         <w:lastRenderedPageBreak/>
         <w:drawing>
-          <wp:inline distT="0" distB="0" distL="0" distR="0" wp14:anchorId="3E77A3C4" wp14:editId="0ED27C55">
+          <wp:inline distT="0" distB="0" distL="0" distR="0" wp14:anchorId="335E8449" wp14:editId="4C05B84A">
             <wp:extent cx="5715000" cy="3838575"/>
             <wp:effectExtent l="0" t="0" r="0" b="0"/>
             <wp:docPr id="4" name="preview.png" descr="Compare and monitor: the same product at other merchants, checked by the offer verifier (&quot;AI: same product&quot;). Trusted merchants are ticked by default." title="Figure 4"/>
@@ -8226,7 +8036,7 @@
           <w:noProof/>
         </w:rPr>
         <w:drawing>
-          <wp:inline distT="0" distB="0" distL="0" distR="0" wp14:anchorId="3BF89276" wp14:editId="4A177A94">
+          <wp:inline distT="0" distB="0" distL="0" distR="0" wp14:anchorId="127BCB92" wp14:editId="323D6DF7">
             <wp:extent cx="5715000" cy="3838575"/>
             <wp:effectExtent l="0" t="0" r="0" b="0"/>
             <wp:docPr id="5" name="detail.png" descr="A real monitor for the Fitbit Charge 6 at two merchants, with its price trend from 6 to 14 October 2026 and the 30-day comparison. The owner's email address is hidden." title="Figure 5"/>
@@ -8323,7 +8133,23 @@
           <w:sz w:val="17"/>
           <w:szCs w:val="17"/>
         </w:rPr>
-        <w:t>Subject: [Bargain Agent] 降价提醒：Fitbit Charge 6 Fitness Tracker — NZD 275.00 @ Harvey Norman New Zealand</w:t>
+        <w:t xml:space="preserve">Subject: [Bargain Agent] </w:t>
+      </w:r>
+      <w:r>
+        <w:rPr>
+          <w:rFonts w:ascii="Consolas" w:eastAsia="Consolas" w:hAnsi="Consolas" w:cs="Consolas"/>
+          <w:sz w:val="17"/>
+          <w:szCs w:val="17"/>
+        </w:rPr>
+        <w:t>降价提醒：</w:t>
+      </w:r>
+      <w:r>
+        <w:rPr>
+          <w:rFonts w:ascii="Consolas" w:eastAsia="Consolas" w:hAnsi="Consolas" w:cs="Consolas"/>
+          <w:sz w:val="17"/>
+          <w:szCs w:val="17"/>
+        </w:rPr>
+        <w:t>Fitbit Charge 6 Fitness Tracker — NZD 275.00 @ Harvey Norman New Zealand</w:t>
       </w:r>
     </w:p>
     <w:p>
@@ -8353,7 +8179,55 @@
           <w:sz w:val="17"/>
           <w:szCs w:val="17"/>
         </w:rPr>
-        <w:t>降价提醒 / Price alert: Harvey Norman New Zealand 现价 NZD 275.00（目标 NZD 280.00）</w:t>
+        <w:t>降价提醒</w:t>
+      </w:r>
+      <w:r>
+        <w:rPr>
+          <w:rFonts w:ascii="Consolas" w:eastAsia="Consolas" w:hAnsi="Consolas" w:cs="Consolas"/>
+          <w:sz w:val="17"/>
+          <w:szCs w:val="17"/>
+        </w:rPr>
+        <w:t xml:space="preserve"> / Price alert: Harvey Norman New Zealand </w:t>
+      </w:r>
+      <w:r>
+        <w:rPr>
+          <w:rFonts w:ascii="Consolas" w:eastAsia="Consolas" w:hAnsi="Consolas" w:cs="Consolas"/>
+          <w:sz w:val="17"/>
+          <w:szCs w:val="17"/>
+        </w:rPr>
+        <w:t>现价</w:t>
+      </w:r>
+      <w:r>
+        <w:rPr>
+          <w:rFonts w:ascii="Consolas" w:eastAsia="Consolas" w:hAnsi="Consolas" w:cs="Consolas"/>
+          <w:sz w:val="17"/>
+          <w:szCs w:val="17"/>
+        </w:rPr>
+        <w:t xml:space="preserve"> NZD 275.00</w:t>
+      </w:r>
+      <w:r>
+        <w:rPr>
+          <w:rFonts w:ascii="Consolas" w:eastAsia="Consolas" w:hAnsi="Consolas" w:cs="Consolas"/>
+          <w:sz w:val="17"/>
+          <w:szCs w:val="17"/>
+        </w:rPr>
+        <w:t>（目标</w:t>
+      </w:r>
+      <w:r>
+        <w:rPr>
+          <w:rFonts w:ascii="Consolas" w:eastAsia="Consolas" w:hAnsi="Consolas" w:cs="Consolas"/>
+          <w:sz w:val="17"/>
+          <w:szCs w:val="17"/>
+        </w:rPr>
+        <w:t xml:space="preserve"> NZD 280.00</w:t>
+      </w:r>
+      <w:r>
+        <w:rPr>
+          <w:rFonts w:ascii="Consolas" w:eastAsia="Consolas" w:hAnsi="Consolas" w:cs="Consolas"/>
+          <w:sz w:val="17"/>
+          <w:szCs w:val="17"/>
+        </w:rPr>
+        <w:t>）</w:t>
       </w:r>
     </w:p>
     <w:p>
@@ -8518,7 +8392,7 @@
       <w:pPr>
         <w:pStyle w:val="2"/>
       </w:pPr>
-      <w:bookmarkStart w:id="25" w:name="_Toc243321574"/>
+      <w:bookmarkStart w:id="25" w:name="_Toc243322443"/>
       <w:r>
         <w:t>5.8 Security and cost control</w:t>
       </w:r>
@@ -8591,7 +8465,7 @@
       <w:pPr>
         <w:pStyle w:val="2"/>
       </w:pPr>
-      <w:bookmarkStart w:id="26" w:name="_Toc243321575"/>
+      <w:bookmarkStart w:id="26" w:name="_Toc243322444"/>
       <w:r>
         <w:t>5.9 Packaging and demo mode</w:t>
       </w:r>
@@ -8629,7 +8503,7 @@
         <w:pStyle w:val="1"/>
         <w:pageBreakBefore/>
       </w:pPr>
-      <w:bookmarkStart w:id="27" w:name="_Toc243321576"/>
+      <w:bookmarkStart w:id="27" w:name="_Toc243322445"/>
       <w:r>
         <w:lastRenderedPageBreak/>
         <w:t>6. Testing and evaluation</w:t>
@@ -8640,7 +8514,7 @@
       <w:pPr>
         <w:pStyle w:val="2"/>
       </w:pPr>
-      <w:bookmarkStart w:id="28" w:name="_Toc243321577"/>
+      <w:bookmarkStart w:id="28" w:name="_Toc243322446"/>
       <w:r>
         <w:t>6.1 Automated tests</w:t>
       </w:r>
@@ -8658,7 +8532,7 @@
       <w:pPr>
         <w:pStyle w:val="2"/>
       </w:pPr>
-      <w:bookmarkStart w:id="29" w:name="_Toc243321578"/>
+      <w:bookmarkStart w:id="29" w:name="_Toc243322447"/>
       <w:r>
         <w:t>6.2 Evaluation plan</w:t>
       </w:r>
@@ -8693,7 +8567,7 @@
           <w:noProof/>
         </w:rPr>
         <w:drawing>
-          <wp:inline distT="0" distB="0" distL="0" distR="0" wp14:anchorId="01C66513" wp14:editId="33202D32">
+          <wp:inline distT="0" distB="0" distL="0" distR="0" wp14:anchorId="79B072F8" wp14:editId="013796EC">
             <wp:extent cx="5715000" cy="1485900"/>
             <wp:effectExtent l="0" t="0" r="0" b="0"/>
             <wp:docPr id="6" name="evaluation.png" descr="Evaluation results on real data (5 October 2026)." title="Figure 6"/>
@@ -8759,7 +8633,7 @@
       <w:pPr>
         <w:pStyle w:val="2"/>
       </w:pPr>
-      <w:bookmarkStart w:id="30" w:name="_Toc243321579"/>
+      <w:bookmarkStart w:id="30" w:name="_Toc243322448"/>
       <w:r>
         <w:t>6.3 Real price accuracy</w:t>
       </w:r>
@@ -9707,7 +9581,7 @@
       <w:pPr>
         <w:pStyle w:val="2"/>
       </w:pPr>
-      <w:bookmarkStart w:id="31" w:name="_Toc243321580"/>
+      <w:bookmarkStart w:id="31" w:name="_Toc243322449"/>
       <w:r>
         <w:t>6.4 Agents with the real model</w:t>
       </w:r>
@@ -10229,7 +10103,7 @@
       <w:pPr>
         <w:pStyle w:val="2"/>
       </w:pPr>
-      <w:bookmarkStart w:id="32" w:name="_Toc243321581"/>
+      <w:bookmarkStart w:id="32" w:name="_Toc243322450"/>
       <w:r>
         <w:t>6.5 End to end</w:t>
       </w:r>
@@ -10247,7 +10121,7 @@
       <w:pPr>
         <w:pStyle w:val="2"/>
       </w:pPr>
-      <w:bookmarkStart w:id="33" w:name="_Toc243321582"/>
+      <w:bookmarkStart w:id="33" w:name="_Toc243322451"/>
       <w:r>
         <w:t>6.6 Limits of the evaluation</w:t>
       </w:r>
@@ -10266,7 +10140,7 @@
         <w:pStyle w:val="1"/>
         <w:pageBreakBefore/>
       </w:pPr>
-      <w:bookmarkStart w:id="34" w:name="_Toc243321583"/>
+      <w:bookmarkStart w:id="34" w:name="_Toc243322452"/>
       <w:r>
         <w:lastRenderedPageBreak/>
         <w:t>7. Problems and how we solved them</w:t>
@@ -10887,7 +10761,7 @@
         <w:pStyle w:val="1"/>
         <w:pageBreakBefore/>
       </w:pPr>
-      <w:bookmarkStart w:id="35" w:name="_Toc243321584"/>
+      <w:bookmarkStart w:id="35" w:name="_Toc243322453"/>
       <w:r>
         <w:lastRenderedPageBreak/>
         <w:t>8. User manual</w:t>
@@ -10898,7 +10772,7 @@
       <w:pPr>
         <w:pStyle w:val="2"/>
       </w:pPr>
-      <w:bookmarkStart w:id="36" w:name="_Toc243321585"/>
+      <w:bookmarkStart w:id="36" w:name="_Toc243322454"/>
       <w:r>
         <w:t>8.1 Running the Windows program</w:t>
       </w:r>
@@ -10969,7 +10843,7 @@
       <w:pPr>
         <w:pStyle w:val="2"/>
       </w:pPr>
-      <w:bookmarkStart w:id="37" w:name="_Toc243321586"/>
+      <w:bookmarkStart w:id="37" w:name="_Toc243322455"/>
       <w:r>
         <w:t>8.2 Running from source</w:t>
       </w:r>
@@ -11009,7 +10883,7 @@
       <w:pPr>
         <w:pStyle w:val="2"/>
       </w:pPr>
-      <w:bookmarkStart w:id="38" w:name="_Toc243321587"/>
+      <w:bookmarkStart w:id="38" w:name="_Toc243322456"/>
       <w:r>
         <w:t>8.3 Finding a product and creating a monitor</w:t>
       </w:r>
@@ -11141,7 +11015,7 @@
       <w:pPr>
         <w:pStyle w:val="2"/>
       </w:pPr>
-      <w:bookmarkStart w:id="39" w:name="_Toc243321588"/>
+      <w:bookmarkStart w:id="39" w:name="_Toc243322457"/>
       <w:r>
         <w:t>8.4 Checking without keeping the window open</w:t>
       </w:r>
@@ -11188,7 +11062,7 @@
         <w:pStyle w:val="1"/>
         <w:pageBreakBefore/>
       </w:pPr>
-      <w:bookmarkStart w:id="40" w:name="_Toc243321589"/>
+      <w:bookmarkStart w:id="40" w:name="_Toc243322458"/>
       <w:r>
         <w:lastRenderedPageBreak/>
         <w:t>9. Conclusion</w:t>
@@ -11208,7 +11082,10 @@
         <w:spacing w:after="140" w:line="300" w:lineRule="auto"/>
       </w:pPr>
       <w:r>
-        <w:t>The second lesson was about trust. By letting agents choose only from real listings and keeping every decision about money and emails in code, we could test the system and measure it: prices matched the shops' own pages in 14 of 14 cases after our fixes, the price agent never reported a false price, and alerts were triggered with precision and recall of 1.0. The main limitations are the size of the real sample, the dependence on what Google Shopping New Zealand lists, and the need for the computer to be on for monitoring.</w:t>
+        <w:t xml:space="preserve">The second lesson was about trust. By letting agents choose only from real listings and keeping every decision about money and emails in code, we could test the system and measure it: prices matched the shops' own pages in 14 of 14 cases after our fixes, the price agent never reported a false price, and alerts were triggered with precision and recall of 1.0. The main limitations are the size of the real sample, the dependence on what Google Shopping New Zealand lists, and the need for the computer to be on </w:t>
+      </w:r>
+      <w:r>
+        <w:t>for monitoring.</w:t>
       </w:r>
     </w:p>
     <w:p>
@@ -11216,7 +11093,7 @@
         <w:pStyle w:val="1"/>
         <w:pageBreakBefore/>
       </w:pPr>
-      <w:bookmarkStart w:id="41" w:name="_Toc243321590"/>
+      <w:bookmarkStart w:id="41" w:name="_Toc243322459"/>
       <w:r>
         <w:lastRenderedPageBreak/>
         <w:t>10. Future work</w:t>
@@ -11306,7 +11183,7 @@
         <w:pStyle w:val="1"/>
         <w:pageBreakBefore/>
       </w:pPr>
-      <w:bookmarkStart w:id="42" w:name="_Toc243321591"/>
+      <w:bookmarkStart w:id="42" w:name="_Toc243322460"/>
       <w:r>
         <w:lastRenderedPageBreak/>
         <w:t>11. Personal learning</w:t>
@@ -11436,7 +11313,7 @@
         <w:pStyle w:val="1"/>
         <w:pageBreakBefore/>
       </w:pPr>
-      <w:bookmarkStart w:id="43" w:name="_Toc243321592"/>
+      <w:bookmarkStart w:id="43" w:name="_Toc243322461"/>
       <w:r>
         <w:lastRenderedPageBreak/>
         <w:t>References</w:t>
@@ -11774,7 +11651,7 @@
       <w:pPr>
         <w:pStyle w:val="2"/>
       </w:pPr>
-      <w:bookmarkStart w:id="44" w:name="_Toc243321593"/>
+      <w:bookmarkStart w:id="44" w:name="_Toc243322462"/>
       <w:r>
         <w:t>Source code</w:t>
       </w:r>
@@ -11981,10 +11858,10 @@
 <file path=word/numbering.xml><?xml version="1.0" encoding="utf-8"?>
 <w:numbering xmlns:wpc="http://schemas.microsoft.com/office/word/2010/wordprocessingCanvas" xmlns:cx="http://schemas.microsoft.com/office/drawing/2014/chartex" xmlns:cx1="http://schemas.microsoft.com/office/drawing/2015/9/8/chartex" xmlns:cx2="http://schemas.microsoft.com/office/drawing/2015/10/21/chartex" xmlns:cx3="http://schemas.microsoft.com/office/drawing/2016/5/9/chartex" xmlns:cx4="http://schemas.microsoft.com/office/drawing/2016/5/10/chartex" xmlns:cx5="http://schemas.microsoft.com/office/drawing/2016/5/11/chartex" xmlns:cx6="http://schemas.microsoft.com/office/drawing/2016/5/12/chartex" xmlns:cx7="http://schemas.microsoft.com/office/drawing/2016/5/13/chartex" xmlns:cx8="http://schemas.microsoft.com/office/drawing/2016/5/14/chartex" xmlns:mc="http://schemas.openxmlformats.org/markup-compatibility/2006" xmlns:aink="http://schemas.microsoft.com/office/drawing/2016/ink" xmlns:am3d="http://schemas.microsoft.com/office/drawing/2017/model3d" xmlns:o="urn:schemas-microsoft-com:office:office" xmlns:oel="http://schemas.microsoft.com/office/2019/extlst" xmlns:r="http://schemas.openxmlformats.org/officeDocument/2006/relationships" xmlns:m="http://schemas.openxmlformats.org/officeDocument/2006/math" xmlns:v="urn:schemas-microsoft-com:vml" xmlns:wp14="http://schemas.microsoft.com/office/word/2010/wordprocessingDrawing" xmlns:wp="http://schemas.openxmlformats.org/drawingml/2006/wordprocessingDrawing" xmlns:w10="urn:schemas-microsoft-com:office:word" xmlns:w="http://schemas.openxmlformats.org/wordprocessingml/2006/main" xmlns:w14="http://schemas.microsoft.com/office/word/2010/wordml" xmlns:w15="http://schemas.microsoft.com/office/word/2012/wordml" xmlns:w16cex="http://schemas.microsoft.com/office/word/2018/wordml/cex" xmlns:w16cid="http://schemas.microsoft.com/office/word/2016/wordml/cid" xmlns:w16="http://schemas.microsoft.com/office/word/2018/wordml" xmlns:w16du="http://schemas.microsoft.com/office/word/2023/wordml/word16du" xmlns:w16sdtdh="http://schemas.microsoft.com/office/word/2020/wordml/sdtdatahash" xmlns:w16sdtfl="http://schemas.microsoft.com/office/word/2024/wordml/sdtformatlock" xmlns:w16se="http://schemas.microsoft.com/office/word/2015/wordml/symex" xmlns:wpg="http://schemas.microsoft.com/office/word/2010/wordprocessingGroup" xmlns:wpi="http://schemas.microsoft.com/office/word/2010/wordprocessingInk" xmlns:wne="http://schemas.microsoft.com/office/word/2006/wordml" xmlns:wps="http://schemas.microsoft.com/office/word/2010/wordprocessingShape" mc:Ignorable="w14 w15 w16se w16cid w16 w16cex w16sdtdh w16sdtfl w16du wp14">
   <w:abstractNum w:abstractNumId="0" w15:restartNumberingAfterBreak="0">
-    <w:nsid w:val="04A854C4"/>
+    <w:nsid w:val="39DA31AC"/>
     <w:multiLevelType w:val="hybridMultilevel"/>
-    <w:tmpl w:val="303E3E14"/>
-    <w:lvl w:ilvl="0" w:tplc="E7D2E3D2">
+    <w:tmpl w:val="8E4A2CDA"/>
+    <w:lvl w:ilvl="0" w:tplc="07EC6170">
       <w:start w:val="1"/>
       <w:numFmt w:val="decimal"/>
       <w:lvlText w:val="%1."/>
@@ -11993,52 +11870,52 @@
         <w:ind w:left="540" w:hanging="360"/>
       </w:pPr>
     </w:lvl>
-    <w:lvl w:ilvl="1" w:tplc="7408D2F6">
+    <w:lvl w:ilvl="1" w:tplc="988C9C0E">
       <w:numFmt w:val="decimal"/>
       <w:lvlText w:val=""/>
       <w:lvlJc w:val="left"/>
     </w:lvl>
-    <w:lvl w:ilvl="2" w:tplc="DDA0D2D0">
+    <w:lvl w:ilvl="2" w:tplc="75A0F25E">
       <w:numFmt w:val="decimal"/>
       <w:lvlText w:val=""/>
       <w:lvlJc w:val="left"/>
     </w:lvl>
-    <w:lvl w:ilvl="3" w:tplc="F80466B0">
+    <w:lvl w:ilvl="3" w:tplc="80F4AD08">
       <w:numFmt w:val="decimal"/>
       <w:lvlText w:val=""/>
       <w:lvlJc w:val="left"/>
     </w:lvl>
-    <w:lvl w:ilvl="4" w:tplc="E54C0F9A">
+    <w:lvl w:ilvl="4" w:tplc="79346280">
       <w:numFmt w:val="decimal"/>
       <w:lvlText w:val=""/>
       <w:lvlJc w:val="left"/>
     </w:lvl>
-    <w:lvl w:ilvl="5" w:tplc="FC468B6E">
+    <w:lvl w:ilvl="5" w:tplc="560EB71E">
       <w:numFmt w:val="decimal"/>
       <w:lvlText w:val=""/>
       <w:lvlJc w:val="left"/>
     </w:lvl>
-    <w:lvl w:ilvl="6" w:tplc="780CEE9E">
+    <w:lvl w:ilvl="6" w:tplc="69C4FF12">
       <w:numFmt w:val="decimal"/>
       <w:lvlText w:val=""/>
       <w:lvlJc w:val="left"/>
     </w:lvl>
-    <w:lvl w:ilvl="7" w:tplc="BF3C0C18">
+    <w:lvl w:ilvl="7" w:tplc="0CA438DE">
       <w:numFmt w:val="decimal"/>
       <w:lvlText w:val=""/>
       <w:lvlJc w:val="left"/>
     </w:lvl>
-    <w:lvl w:ilvl="8" w:tplc="6966E17A">
+    <w:lvl w:ilvl="8" w:tplc="1972852E">
       <w:numFmt w:val="decimal"/>
       <w:lvlText w:val=""/>
       <w:lvlJc w:val="left"/>
     </w:lvl>
   </w:abstractNum>
   <w:abstractNum w:abstractNumId="1" w15:restartNumberingAfterBreak="0">
-    <w:nsid w:val="057F074A"/>
+    <w:nsid w:val="43D61F68"/>
     <w:multiLevelType w:val="hybridMultilevel"/>
-    <w:tmpl w:val="9530DF4E"/>
-    <w:lvl w:ilvl="0" w:tplc="6E2E4842">
+    <w:tmpl w:val="3AB835BE"/>
+    <w:lvl w:ilvl="0" w:tplc="21284438">
       <w:start w:val="1"/>
       <w:numFmt w:val="decimal"/>
       <w:lvlText w:val="%1."/>
@@ -12047,52 +11924,138 @@
         <w:ind w:left="540" w:hanging="360"/>
       </w:pPr>
     </w:lvl>
-    <w:lvl w:ilvl="1" w:tplc="707815E6">
+    <w:lvl w:ilvl="1" w:tplc="85EAF5DC">
       <w:numFmt w:val="decimal"/>
       <w:lvlText w:val=""/>
       <w:lvlJc w:val="left"/>
     </w:lvl>
-    <w:lvl w:ilvl="2" w:tplc="7CF0709A">
+    <w:lvl w:ilvl="2" w:tplc="A6DCB380">
       <w:numFmt w:val="decimal"/>
       <w:lvlText w:val=""/>
       <w:lvlJc w:val="left"/>
     </w:lvl>
-    <w:lvl w:ilvl="3" w:tplc="1C5C6870">
+    <w:lvl w:ilvl="3" w:tplc="EDD4A526">
       <w:numFmt w:val="decimal"/>
       <w:lvlText w:val=""/>
       <w:lvlJc w:val="left"/>
     </w:lvl>
-    <w:lvl w:ilvl="4" w:tplc="2A3805EC">
+    <w:lvl w:ilvl="4" w:tplc="1AD4BA10">
       <w:numFmt w:val="decimal"/>
       <w:lvlText w:val=""/>
       <w:lvlJc w:val="left"/>
     </w:lvl>
-    <w:lvl w:ilvl="5" w:tplc="7CCC353A">
+    <w:lvl w:ilvl="5" w:tplc="AF0E1C18">
       <w:numFmt w:val="decimal"/>
       <w:lvlText w:val=""/>
       <w:lvlJc w:val="left"/>
     </w:lvl>
-    <w:lvl w:ilvl="6" w:tplc="6F580152">
+    <w:lvl w:ilvl="6" w:tplc="4FCA67F4">
       <w:numFmt w:val="decimal"/>
       <w:lvlText w:val=""/>
       <w:lvlJc w:val="left"/>
     </w:lvl>
-    <w:lvl w:ilvl="7" w:tplc="104EE2AA">
+    <w:lvl w:ilvl="7" w:tplc="6338DA92">
       <w:numFmt w:val="decimal"/>
       <w:lvlText w:val=""/>
       <w:lvlJc w:val="left"/>
     </w:lvl>
-    <w:lvl w:ilvl="8" w:tplc="1DB05B74">
+    <w:lvl w:ilvl="8" w:tplc="A83A2B36">
       <w:numFmt w:val="decimal"/>
       <w:lvlText w:val=""/>
       <w:lvlJc w:val="left"/>
     </w:lvl>
   </w:abstractNum>
   <w:abstractNum w:abstractNumId="2" w15:restartNumberingAfterBreak="0">
-    <w:nsid w:val="0C4145E1"/>
+    <w:nsid w:val="524A381C"/>
     <w:multiLevelType w:val="hybridMultilevel"/>
-    <w:tmpl w:val="3BEC2BD2"/>
-    <w:lvl w:ilvl="0" w:tplc="8A44F5E2">
+    <w:tmpl w:val="7D3873D4"/>
+    <w:lvl w:ilvl="0" w:tplc="061A977A" w:tentative="1">
+      <w:start w:val="1"/>
+      <w:numFmt w:val="bullet"/>
+      <w:lvlText w:val="●"/>
+      <w:lvlJc w:val="left"/>
+      <w:pPr>
+        <w:ind w:left="720" w:hanging="360"/>
+      </w:pPr>
+    </w:lvl>
+    <w:lvl w:ilvl="1" w:tplc="92D8CFE0" w:tentative="1">
+      <w:start w:val="1"/>
+      <w:numFmt w:val="bullet"/>
+      <w:lvlText w:val="○"/>
+      <w:lvlJc w:val="left"/>
+      <w:pPr>
+        <w:ind w:left="1440" w:hanging="360"/>
+      </w:pPr>
+    </w:lvl>
+    <w:lvl w:ilvl="2" w:tplc="82DE1792" w:tentative="1">
+      <w:start w:val="1"/>
+      <w:numFmt w:val="bullet"/>
+      <w:lvlText w:val="■"/>
+      <w:lvlJc w:val="left"/>
+      <w:pPr>
+        <w:ind w:left="2160" w:hanging="360"/>
+      </w:pPr>
+    </w:lvl>
+    <w:lvl w:ilvl="3" w:tplc="C5A6EA1A" w:tentative="1">
+      <w:start w:val="1"/>
+      <w:numFmt w:val="bullet"/>
+      <w:lvlText w:val="●"/>
+      <w:lvlJc w:val="left"/>
+      <w:pPr>
+        <w:ind w:left="2880" w:hanging="360"/>
+      </w:pPr>
+    </w:lvl>
+    <w:lvl w:ilvl="4" w:tplc="A96E952E" w:tentative="1">
+      <w:start w:val="1"/>
+      <w:numFmt w:val="bullet"/>
+      <w:lvlText w:val="○"/>
+      <w:lvlJc w:val="left"/>
+      <w:pPr>
+        <w:ind w:left="3600" w:hanging="360"/>
+      </w:pPr>
+    </w:lvl>
+    <w:lvl w:ilvl="5" w:tplc="AB72AC6C" w:tentative="1">
+      <w:start w:val="1"/>
+      <w:numFmt w:val="bullet"/>
+      <w:lvlText w:val="■"/>
+      <w:lvlJc w:val="left"/>
+      <w:pPr>
+        <w:ind w:left="4320" w:hanging="360"/>
+      </w:pPr>
+    </w:lvl>
+    <w:lvl w:ilvl="6" w:tplc="55088498" w:tentative="1">
+      <w:start w:val="1"/>
+      <w:numFmt w:val="bullet"/>
+      <w:lvlText w:val="●"/>
+      <w:lvlJc w:val="left"/>
+      <w:pPr>
+        <w:ind w:left="5040" w:hanging="360"/>
+      </w:pPr>
+    </w:lvl>
+    <w:lvl w:ilvl="7" w:tplc="36C47194" w:tentative="1">
+      <w:start w:val="1"/>
+      <w:numFmt w:val="bullet"/>
+      <w:lvlText w:val="●"/>
+      <w:lvlJc w:val="left"/>
+      <w:pPr>
+        <w:ind w:left="5760" w:hanging="360"/>
+      </w:pPr>
+    </w:lvl>
+    <w:lvl w:ilvl="8" w:tplc="9482A760" w:tentative="1">
+      <w:start w:val="1"/>
+      <w:numFmt w:val="bullet"/>
+      <w:lvlText w:val="●"/>
+      <w:lvlJc w:val="left"/>
+      <w:pPr>
+        <w:ind w:left="6480" w:hanging="360"/>
+      </w:pPr>
+    </w:lvl>
+  </w:abstractNum>
+  <w:abstractNum w:abstractNumId="3" w15:restartNumberingAfterBreak="0">
+    <w:nsid w:val="748553B7"/>
+    <w:multiLevelType w:val="hybridMultilevel"/>
+    <w:tmpl w:val="B6D0F296"/>
+    <w:lvl w:ilvl="0" w:tplc="FDD0A02E">
       <w:start w:val="1"/>
       <w:numFmt w:val="bullet"/>
       <w:lvlText w:val="•"/>
@@ -12101,153 +12064,67 @@
         <w:ind w:left="540" w:hanging="300"/>
       </w:pPr>
     </w:lvl>
-    <w:lvl w:ilvl="1" w:tplc="8E4C7FA8">
+    <w:lvl w:ilvl="1" w:tplc="7818C5EE">
       <w:numFmt w:val="decimal"/>
       <w:lvlText w:val=""/>
       <w:lvlJc w:val="left"/>
     </w:lvl>
-    <w:lvl w:ilvl="2" w:tplc="D3CE429C">
+    <w:lvl w:ilvl="2" w:tplc="BF803830">
       <w:numFmt w:val="decimal"/>
       <w:lvlText w:val=""/>
       <w:lvlJc w:val="left"/>
     </w:lvl>
-    <w:lvl w:ilvl="3" w:tplc="AC9C61BE">
+    <w:lvl w:ilvl="3" w:tplc="E9CCB786">
       <w:numFmt w:val="decimal"/>
       <w:lvlText w:val=""/>
       <w:lvlJc w:val="left"/>
     </w:lvl>
-    <w:lvl w:ilvl="4" w:tplc="11B83B7C">
+    <w:lvl w:ilvl="4" w:tplc="01CEBC5A">
       <w:numFmt w:val="decimal"/>
       <w:lvlText w:val=""/>
       <w:lvlJc w:val="left"/>
     </w:lvl>
-    <w:lvl w:ilvl="5" w:tplc="6EA0541A">
+    <w:lvl w:ilvl="5" w:tplc="7AD48DBA">
       <w:numFmt w:val="decimal"/>
       <w:lvlText w:val=""/>
       <w:lvlJc w:val="left"/>
     </w:lvl>
-    <w:lvl w:ilvl="6" w:tplc="E8102BCC">
+    <w:lvl w:ilvl="6" w:tplc="C5C4A8E8">
       <w:numFmt w:val="decimal"/>
       <w:lvlText w:val=""/>
       <w:lvlJc w:val="left"/>
     </w:lvl>
-    <w:lvl w:ilvl="7" w:tplc="AEBA8E86">
+    <w:lvl w:ilvl="7" w:tplc="4D5AF5A4">
       <w:numFmt w:val="decimal"/>
       <w:lvlText w:val=""/>
       <w:lvlJc w:val="left"/>
     </w:lvl>
-    <w:lvl w:ilvl="8" w:tplc="0EA63528">
+    <w:lvl w:ilvl="8" w:tplc="380C7114">
       <w:numFmt w:val="decimal"/>
       <w:lvlText w:val=""/>
       <w:lvlJc w:val="left"/>
     </w:lvl>
   </w:abstractNum>
-  <w:abstractNum w:abstractNumId="3" w15:restartNumberingAfterBreak="0">
-    <w:nsid w:val="72213CD8"/>
-    <w:multiLevelType w:val="hybridMultilevel"/>
-    <w:tmpl w:val="CBE6D888"/>
-    <w:lvl w:ilvl="0" w:tplc="5238C99C" w:tentative="1">
-      <w:start w:val="1"/>
-      <w:numFmt w:val="bullet"/>
-      <w:lvlText w:val="●"/>
-      <w:lvlJc w:val="left"/>
-      <w:pPr>
-        <w:ind w:left="720" w:hanging="360"/>
-      </w:pPr>
-    </w:lvl>
-    <w:lvl w:ilvl="1" w:tplc="0A18A7E2" w:tentative="1">
-      <w:start w:val="1"/>
-      <w:numFmt w:val="bullet"/>
-      <w:lvlText w:val="○"/>
-      <w:lvlJc w:val="left"/>
-      <w:pPr>
-        <w:ind w:left="1440" w:hanging="360"/>
-      </w:pPr>
-    </w:lvl>
-    <w:lvl w:ilvl="2" w:tplc="F6608192" w:tentative="1">
-      <w:start w:val="1"/>
-      <w:numFmt w:val="bullet"/>
-      <w:lvlText w:val="■"/>
-      <w:lvlJc w:val="left"/>
-      <w:pPr>
-        <w:ind w:left="2160" w:hanging="360"/>
-      </w:pPr>
-    </w:lvl>
-    <w:lvl w:ilvl="3" w:tplc="5EDCA4FE" w:tentative="1">
-      <w:start w:val="1"/>
-      <w:numFmt w:val="bullet"/>
-      <w:lvlText w:val="●"/>
-      <w:lvlJc w:val="left"/>
-      <w:pPr>
-        <w:ind w:left="2880" w:hanging="360"/>
-      </w:pPr>
-    </w:lvl>
-    <w:lvl w:ilvl="4" w:tplc="3614F69C" w:tentative="1">
-      <w:start w:val="1"/>
-      <w:numFmt w:val="bullet"/>
-      <w:lvlText w:val="○"/>
-      <w:lvlJc w:val="left"/>
-      <w:pPr>
-        <w:ind w:left="3600" w:hanging="360"/>
-      </w:pPr>
-    </w:lvl>
-    <w:lvl w:ilvl="5" w:tplc="5B56859C" w:tentative="1">
-      <w:start w:val="1"/>
-      <w:numFmt w:val="bullet"/>
-      <w:lvlText w:val="■"/>
-      <w:lvlJc w:val="left"/>
-      <w:pPr>
-        <w:ind w:left="4320" w:hanging="360"/>
-      </w:pPr>
-    </w:lvl>
-    <w:lvl w:ilvl="6" w:tplc="1986B138" w:tentative="1">
-      <w:start w:val="1"/>
-      <w:numFmt w:val="bullet"/>
-      <w:lvlText w:val="●"/>
-      <w:lvlJc w:val="left"/>
-      <w:pPr>
-        <w:ind w:left="5040" w:hanging="360"/>
-      </w:pPr>
-    </w:lvl>
-    <w:lvl w:ilvl="7" w:tplc="2256ADDC" w:tentative="1">
-      <w:start w:val="1"/>
-      <w:numFmt w:val="bullet"/>
-      <w:lvlText w:val="●"/>
-      <w:lvlJc w:val="left"/>
-      <w:pPr>
-        <w:ind w:left="5760" w:hanging="360"/>
-      </w:pPr>
-    </w:lvl>
-    <w:lvl w:ilvl="8" w:tplc="8334ED7A" w:tentative="1">
-      <w:start w:val="1"/>
-      <w:numFmt w:val="bullet"/>
-      <w:lvlText w:val="●"/>
-      <w:lvlJc w:val="left"/>
-      <w:pPr>
-        <w:ind w:left="6480" w:hanging="360"/>
-      </w:pPr>
-    </w:lvl>
-  </w:abstractNum>
-  <w:num w:numId="1" w16cid:durableId="452867782">
+  <w:num w:numId="1" w16cid:durableId="1174807668">
+    <w:abstractNumId w:val="2"/>
+    <w:lvlOverride w:ilvl="0">
+      <w:startOverride w:val="1"/>
+    </w:lvlOverride>
+  </w:num>
+  <w:num w:numId="2" w16cid:durableId="370037655">
     <w:abstractNumId w:val="3"/>
     <w:lvlOverride w:ilvl="0">
       <w:startOverride w:val="1"/>
     </w:lvlOverride>
   </w:num>
-  <w:num w:numId="2" w16cid:durableId="1903638851">
-    <w:abstractNumId w:val="2"/>
+  <w:num w:numId="3" w16cid:durableId="282463732">
+    <w:abstractNumId w:val="1"/>
     <w:lvlOverride w:ilvl="0">
       <w:startOverride w:val="1"/>
     </w:lvlOverride>
   </w:num>
-  <w:num w:numId="3" w16cid:durableId="183054988">
+  <w:num w:numId="4" w16cid:durableId="1245992538">
     <w:abstractNumId w:val="0"/>
-    <w:lvlOverride w:ilvl="0">
-      <w:startOverride w:val="1"/>
-    </w:lvlOverride>
-  </w:num>
-  <w:num w:numId="4" w16cid:durableId="1783957825">
-    <w:abstractNumId w:val="1"/>
     <w:lvlOverride w:ilvl="0">
       <w:startOverride w:val="1"/>
     </w:lvlOverride>
@@ -12888,7 +12765,7 @@
     <w:link w:val="ad"/>
     <w:uiPriority w:val="99"/>
     <w:unhideWhenUsed/>
-    <w:rsid w:val="00942653"/>
+    <w:rsid w:val="0017635B"/>
     <w:pPr>
       <w:tabs>
         <w:tab w:val="center" w:pos="4153"/>
@@ -12907,7 +12784,7 @@
     <w:basedOn w:val="a0"/>
     <w:link w:val="ac"/>
     <w:uiPriority w:val="99"/>
-    <w:rsid w:val="00942653"/>
+    <w:rsid w:val="0017635B"/>
     <w:rPr>
       <w:sz w:val="18"/>
       <w:szCs w:val="18"/>
@@ -12919,7 +12796,7 @@
     <w:link w:val="af"/>
     <w:uiPriority w:val="99"/>
     <w:unhideWhenUsed/>
-    <w:rsid w:val="00942653"/>
+    <w:rsid w:val="0017635B"/>
     <w:pPr>
       <w:tabs>
         <w:tab w:val="center" w:pos="4153"/>
@@ -12937,7 +12814,7 @@
     <w:basedOn w:val="a0"/>
     <w:link w:val="ae"/>
     <w:uiPriority w:val="99"/>
-    <w:rsid w:val="00942653"/>
+    <w:rsid w:val="0017635B"/>
     <w:rPr>
       <w:sz w:val="18"/>
       <w:szCs w:val="18"/>
@@ -12950,7 +12827,7 @@
     <w:autoRedefine/>
     <w:uiPriority w:val="39"/>
     <w:unhideWhenUsed/>
-    <w:rsid w:val="00942653"/>
+    <w:rsid w:val="0017635B"/>
   </w:style>
   <w:style w:type="paragraph" w:styleId="TOC2">
     <w:name w:val="toc 2"/>
@@ -12959,7 +12836,7 @@
     <w:autoRedefine/>
     <w:uiPriority w:val="39"/>
     <w:unhideWhenUsed/>
-    <w:rsid w:val="00942653"/>
+    <w:rsid w:val="0017635B"/>
     <w:pPr>
       <w:ind w:leftChars="200" w:left="420"/>
     </w:pPr>

</xml_diff>

<commit_message>
docs: personal learning paragraphs (drafts for each member to review)
</commit_message>
<xml_diff>
--- a/deliverables/159333_Final_Report_Bargain_Agent.docx
+++ b/deliverables/159333_Final_Report_Bargain_Agent.docx
@@ -702,7 +702,7 @@
     <w:sdt>
       <w:sdtPr>
         <w:alias w:val="Contents"/>
-        <w:id w:val="-212116740"/>
+        <w:id w:val="-1804686818"/>
       </w:sdtPr>
       <w:sdtEndPr/>
       <w:sdtContent>
@@ -725,7 +725,7 @@
           <w:r>
             <w:fldChar w:fldCharType="separate"/>
           </w:r>
-          <w:hyperlink w:anchor="_Toc243322418" w:history="1">
+          <w:hyperlink w:anchor="_Toc243322704" w:history="1">
             <w:r>
               <w:rPr>
                 <w:rStyle w:val="a5"/>
@@ -749,7 +749,7 @@
               <w:rPr>
                 <w:noProof/>
               </w:rPr>
-              <w:instrText xml:space="preserve"> PAGEREF _Toc243322418 \h </w:instrText>
+              <w:instrText xml:space="preserve"> PAGEREF _Toc243322704 \h </w:instrText>
             </w:r>
             <w:r>
               <w:rPr>
@@ -787,7 +787,7 @@
               <w:noProof/>
             </w:rPr>
           </w:pPr>
-          <w:hyperlink w:anchor="_Toc243322419" w:history="1">
+          <w:hyperlink w:anchor="_Toc243322705" w:history="1">
             <w:r>
               <w:rPr>
                 <w:rStyle w:val="a5"/>
@@ -811,7 +811,7 @@
               <w:rPr>
                 <w:noProof/>
               </w:rPr>
-              <w:instrText xml:space="preserve"> PAGEREF _Toc243322419 \h </w:instrText>
+              <w:instrText xml:space="preserve"> PAGEREF _Toc243322705 \h </w:instrText>
             </w:r>
             <w:r>
               <w:rPr>
@@ -849,7 +849,7 @@
               <w:noProof/>
             </w:rPr>
           </w:pPr>
-          <w:hyperlink w:anchor="_Toc243322420" w:history="1">
+          <w:hyperlink w:anchor="_Toc243322706" w:history="1">
             <w:r>
               <w:rPr>
                 <w:rStyle w:val="a5"/>
@@ -873,7 +873,7 @@
               <w:rPr>
                 <w:noProof/>
               </w:rPr>
-              <w:instrText xml:space="preserve"> PAGEREF _Toc243322420 \h </w:instrText>
+              <w:instrText xml:space="preserve"> PAGEREF _Toc243322706 \h </w:instrText>
             </w:r>
             <w:r>
               <w:rPr>
@@ -911,7 +911,7 @@
               <w:noProof/>
             </w:rPr>
           </w:pPr>
-          <w:hyperlink w:anchor="_Toc243322421" w:history="1">
+          <w:hyperlink w:anchor="_Toc243322707" w:history="1">
             <w:r>
               <w:rPr>
                 <w:rStyle w:val="a5"/>
@@ -935,7 +935,7 @@
               <w:rPr>
                 <w:noProof/>
               </w:rPr>
-              <w:instrText xml:space="preserve"> PAGEREF _Toc243322421 \h </w:instrText>
+              <w:instrText xml:space="preserve"> PAGEREF _Toc243322707 \h </w:instrText>
             </w:r>
             <w:r>
               <w:rPr>
@@ -973,7 +973,7 @@
               <w:noProof/>
             </w:rPr>
           </w:pPr>
-          <w:hyperlink w:anchor="_Toc243322422" w:history="1">
+          <w:hyperlink w:anchor="_Toc243322708" w:history="1">
             <w:r>
               <w:rPr>
                 <w:rStyle w:val="a5"/>
@@ -997,7 +997,7 @@
               <w:rPr>
                 <w:noProof/>
               </w:rPr>
-              <w:instrText xml:space="preserve"> PAGEREF _Toc243322422 \h </w:instrText>
+              <w:instrText xml:space="preserve"> PAGEREF _Toc243322708 \h </w:instrText>
             </w:r>
             <w:r>
               <w:rPr>
@@ -1035,7 +1035,7 @@
               <w:noProof/>
             </w:rPr>
           </w:pPr>
-          <w:hyperlink w:anchor="_Toc243322423" w:history="1">
+          <w:hyperlink w:anchor="_Toc243322709" w:history="1">
             <w:r>
               <w:rPr>
                 <w:rStyle w:val="a5"/>
@@ -1059,7 +1059,7 @@
               <w:rPr>
                 <w:noProof/>
               </w:rPr>
-              <w:instrText xml:space="preserve"> PAGEREF _Toc243322423 \h </w:instrText>
+              <w:instrText xml:space="preserve"> PAGEREF _Toc243322709 \h </w:instrText>
             </w:r>
             <w:r>
               <w:rPr>
@@ -1096,7 +1096,7 @@
               <w:noProof/>
             </w:rPr>
           </w:pPr>
-          <w:hyperlink w:anchor="_Toc243322424" w:history="1">
+          <w:hyperlink w:anchor="_Toc243322710" w:history="1">
             <w:r>
               <w:rPr>
                 <w:rStyle w:val="a5"/>
@@ -1120,7 +1120,7 @@
               <w:rPr>
                 <w:noProof/>
               </w:rPr>
-              <w:instrText xml:space="preserve"> PAGEREF _Toc243322424 \h </w:instrText>
+              <w:instrText xml:space="preserve"> PAGEREF _Toc243322710 \h </w:instrText>
             </w:r>
             <w:r>
               <w:rPr>
@@ -1157,7 +1157,7 @@
               <w:noProof/>
             </w:rPr>
           </w:pPr>
-          <w:hyperlink w:anchor="_Toc243322425" w:history="1">
+          <w:hyperlink w:anchor="_Toc243322711" w:history="1">
             <w:r>
               <w:rPr>
                 <w:rStyle w:val="a5"/>
@@ -1181,7 +1181,7 @@
               <w:rPr>
                 <w:noProof/>
               </w:rPr>
-              <w:instrText xml:space="preserve"> PAGEREF _Toc243322425 \h </w:instrText>
+              <w:instrText xml:space="preserve"> PAGEREF _Toc243322711 \h </w:instrText>
             </w:r>
             <w:r>
               <w:rPr>
@@ -1219,7 +1219,7 @@
               <w:noProof/>
             </w:rPr>
           </w:pPr>
-          <w:hyperlink w:anchor="_Toc243322426" w:history="1">
+          <w:hyperlink w:anchor="_Toc243322712" w:history="1">
             <w:r>
               <w:rPr>
                 <w:rStyle w:val="a5"/>
@@ -1243,7 +1243,7 @@
               <w:rPr>
                 <w:noProof/>
               </w:rPr>
-              <w:instrText xml:space="preserve"> PAGEREF _Toc243322426 \h </w:instrText>
+              <w:instrText xml:space="preserve"> PAGEREF _Toc243322712 \h </w:instrText>
             </w:r>
             <w:r>
               <w:rPr>
@@ -1281,7 +1281,7 @@
               <w:noProof/>
             </w:rPr>
           </w:pPr>
-          <w:hyperlink w:anchor="_Toc243322427" w:history="1">
+          <w:hyperlink w:anchor="_Toc243322713" w:history="1">
             <w:r>
               <w:rPr>
                 <w:rStyle w:val="a5"/>
@@ -1305,7 +1305,7 @@
               <w:rPr>
                 <w:noProof/>
               </w:rPr>
-              <w:instrText xml:space="preserve"> PAGEREF _Toc243322427 \h </w:instrText>
+              <w:instrText xml:space="preserve"> PAGEREF _Toc243322713 \h </w:instrText>
             </w:r>
             <w:r>
               <w:rPr>
@@ -1343,7 +1343,7 @@
               <w:noProof/>
             </w:rPr>
           </w:pPr>
-          <w:hyperlink w:anchor="_Toc243322428" w:history="1">
+          <w:hyperlink w:anchor="_Toc243322714" w:history="1">
             <w:r>
               <w:rPr>
                 <w:rStyle w:val="a5"/>
@@ -1367,7 +1367,7 @@
               <w:rPr>
                 <w:noProof/>
               </w:rPr>
-              <w:instrText xml:space="preserve"> PAGEREF _Toc243322428 \h </w:instrText>
+              <w:instrText xml:space="preserve"> PAGEREF _Toc243322714 \h </w:instrText>
             </w:r>
             <w:r>
               <w:rPr>
@@ -1405,7 +1405,7 @@
               <w:noProof/>
             </w:rPr>
           </w:pPr>
-          <w:hyperlink w:anchor="_Toc243322429" w:history="1">
+          <w:hyperlink w:anchor="_Toc243322715" w:history="1">
             <w:r>
               <w:rPr>
                 <w:rStyle w:val="a5"/>
@@ -1429,7 +1429,7 @@
               <w:rPr>
                 <w:noProof/>
               </w:rPr>
-              <w:instrText xml:space="preserve"> PAGEREF _Toc243322429 \h </w:instrText>
+              <w:instrText xml:space="preserve"> PAGEREF _Toc243322715 \h </w:instrText>
             </w:r>
             <w:r>
               <w:rPr>
@@ -1467,7 +1467,7 @@
               <w:noProof/>
             </w:rPr>
           </w:pPr>
-          <w:hyperlink w:anchor="_Toc243322430" w:history="1">
+          <w:hyperlink w:anchor="_Toc243322716" w:history="1">
             <w:r>
               <w:rPr>
                 <w:rStyle w:val="a5"/>
@@ -1491,7 +1491,7 @@
               <w:rPr>
                 <w:noProof/>
               </w:rPr>
-              <w:instrText xml:space="preserve"> PAGEREF _Toc243322430 \h </w:instrText>
+              <w:instrText xml:space="preserve"> PAGEREF _Toc243322716 \h </w:instrText>
             </w:r>
             <w:r>
               <w:rPr>
@@ -1528,7 +1528,7 @@
               <w:noProof/>
             </w:rPr>
           </w:pPr>
-          <w:hyperlink w:anchor="_Toc243322431" w:history="1">
+          <w:hyperlink w:anchor="_Toc243322717" w:history="1">
             <w:r>
               <w:rPr>
                 <w:rStyle w:val="a5"/>
@@ -1552,7 +1552,7 @@
               <w:rPr>
                 <w:noProof/>
               </w:rPr>
-              <w:instrText xml:space="preserve"> PAGEREF _Toc243322431 \h </w:instrText>
+              <w:instrText xml:space="preserve"> PAGEREF _Toc243322717 \h </w:instrText>
             </w:r>
             <w:r>
               <w:rPr>
@@ -1590,7 +1590,7 @@
               <w:noProof/>
             </w:rPr>
           </w:pPr>
-          <w:hyperlink w:anchor="_Toc243322432" w:history="1">
+          <w:hyperlink w:anchor="_Toc243322718" w:history="1">
             <w:r>
               <w:rPr>
                 <w:rStyle w:val="a5"/>
@@ -1614,7 +1614,7 @@
               <w:rPr>
                 <w:noProof/>
               </w:rPr>
-              <w:instrText xml:space="preserve"> PAGEREF _Toc243322432 \h </w:instrText>
+              <w:instrText xml:space="preserve"> PAGEREF _Toc243322718 \h </w:instrText>
             </w:r>
             <w:r>
               <w:rPr>
@@ -1652,7 +1652,7 @@
               <w:noProof/>
             </w:rPr>
           </w:pPr>
-          <w:hyperlink w:anchor="_Toc243322433" w:history="1">
+          <w:hyperlink w:anchor="_Toc243322719" w:history="1">
             <w:r>
               <w:rPr>
                 <w:rStyle w:val="a5"/>
@@ -1676,7 +1676,7 @@
               <w:rPr>
                 <w:noProof/>
               </w:rPr>
-              <w:instrText xml:space="preserve"> PAGEREF _Toc243322433 \h </w:instrText>
+              <w:instrText xml:space="preserve"> PAGEREF _Toc243322719 \h </w:instrText>
             </w:r>
             <w:r>
               <w:rPr>
@@ -1714,7 +1714,7 @@
               <w:noProof/>
             </w:rPr>
           </w:pPr>
-          <w:hyperlink w:anchor="_Toc243322434" w:history="1">
+          <w:hyperlink w:anchor="_Toc243322720" w:history="1">
             <w:r>
               <w:rPr>
                 <w:rStyle w:val="a5"/>
@@ -1738,7 +1738,7 @@
               <w:rPr>
                 <w:noProof/>
               </w:rPr>
-              <w:instrText xml:space="preserve"> PAGEREF _Toc243322434 \h </w:instrText>
+              <w:instrText xml:space="preserve"> PAGEREF _Toc243322720 \h </w:instrText>
             </w:r>
             <w:r>
               <w:rPr>
@@ -1775,7 +1775,7 @@
               <w:noProof/>
             </w:rPr>
           </w:pPr>
-          <w:hyperlink w:anchor="_Toc243322435" w:history="1">
+          <w:hyperlink w:anchor="_Toc243322721" w:history="1">
             <w:r>
               <w:rPr>
                 <w:rStyle w:val="a5"/>
@@ -1799,7 +1799,7 @@
               <w:rPr>
                 <w:noProof/>
               </w:rPr>
-              <w:instrText xml:space="preserve"> PAGEREF _Toc243322435 \h </w:instrText>
+              <w:instrText xml:space="preserve"> PAGEREF _Toc243322721 \h </w:instrText>
             </w:r>
             <w:r>
               <w:rPr>
@@ -1837,7 +1837,7 @@
               <w:noProof/>
             </w:rPr>
           </w:pPr>
-          <w:hyperlink w:anchor="_Toc243322436" w:history="1">
+          <w:hyperlink w:anchor="_Toc243322722" w:history="1">
             <w:r>
               <w:rPr>
                 <w:rStyle w:val="a5"/>
@@ -1861,7 +1861,7 @@
               <w:rPr>
                 <w:noProof/>
               </w:rPr>
-              <w:instrText xml:space="preserve"> PAGEREF _Toc243322436 \h </w:instrText>
+              <w:instrText xml:space="preserve"> PAGEREF _Toc243322722 \h </w:instrText>
             </w:r>
             <w:r>
               <w:rPr>
@@ -1899,7 +1899,7 @@
               <w:noProof/>
             </w:rPr>
           </w:pPr>
-          <w:hyperlink w:anchor="_Toc243322437" w:history="1">
+          <w:hyperlink w:anchor="_Toc243322723" w:history="1">
             <w:r>
               <w:rPr>
                 <w:rStyle w:val="a5"/>
@@ -1923,7 +1923,7 @@
               <w:rPr>
                 <w:noProof/>
               </w:rPr>
-              <w:instrText xml:space="preserve"> PAGEREF _Toc243322437 \h </w:instrText>
+              <w:instrText xml:space="preserve"> PAGEREF _Toc243322723 \h </w:instrText>
             </w:r>
             <w:r>
               <w:rPr>
@@ -1961,7 +1961,7 @@
               <w:noProof/>
             </w:rPr>
           </w:pPr>
-          <w:hyperlink w:anchor="_Toc243322438" w:history="1">
+          <w:hyperlink w:anchor="_Toc243322724" w:history="1">
             <w:r>
               <w:rPr>
                 <w:rStyle w:val="a5"/>
@@ -1985,7 +1985,7 @@
               <w:rPr>
                 <w:noProof/>
               </w:rPr>
-              <w:instrText xml:space="preserve"> PAGEREF _Toc243322438 \h </w:instrText>
+              <w:instrText xml:space="preserve"> PAGEREF _Toc243322724 \h </w:instrText>
             </w:r>
             <w:r>
               <w:rPr>
@@ -2023,7 +2023,7 @@
               <w:noProof/>
             </w:rPr>
           </w:pPr>
-          <w:hyperlink w:anchor="_Toc243322439" w:history="1">
+          <w:hyperlink w:anchor="_Toc243322725" w:history="1">
             <w:r>
               <w:rPr>
                 <w:rStyle w:val="a5"/>
@@ -2047,7 +2047,7 @@
               <w:rPr>
                 <w:noProof/>
               </w:rPr>
-              <w:instrText xml:space="preserve"> PAGEREF _Toc243322439 \h </w:instrText>
+              <w:instrText xml:space="preserve"> PAGEREF _Toc243322725 \h </w:instrText>
             </w:r>
             <w:r>
               <w:rPr>
@@ -2085,7 +2085,7 @@
               <w:noProof/>
             </w:rPr>
           </w:pPr>
-          <w:hyperlink w:anchor="_Toc243322440" w:history="1">
+          <w:hyperlink w:anchor="_Toc243322726" w:history="1">
             <w:r>
               <w:rPr>
                 <w:rStyle w:val="a5"/>
@@ -2109,7 +2109,7 @@
               <w:rPr>
                 <w:noProof/>
               </w:rPr>
-              <w:instrText xml:space="preserve"> PAGEREF _Toc243322440 \h </w:instrText>
+              <w:instrText xml:space="preserve"> PAGEREF _Toc243322726 \h </w:instrText>
             </w:r>
             <w:r>
               <w:rPr>
@@ -2147,7 +2147,7 @@
               <w:noProof/>
             </w:rPr>
           </w:pPr>
-          <w:hyperlink w:anchor="_Toc243322441" w:history="1">
+          <w:hyperlink w:anchor="_Toc243322727" w:history="1">
             <w:r>
               <w:rPr>
                 <w:rStyle w:val="a5"/>
@@ -2171,7 +2171,7 @@
               <w:rPr>
                 <w:noProof/>
               </w:rPr>
-              <w:instrText xml:space="preserve"> PAGEREF _Toc243322441 \h </w:instrText>
+              <w:instrText xml:space="preserve"> PAGEREF _Toc243322727 \h </w:instrText>
             </w:r>
             <w:r>
               <w:rPr>
@@ -2209,7 +2209,7 @@
               <w:noProof/>
             </w:rPr>
           </w:pPr>
-          <w:hyperlink w:anchor="_Toc243322442" w:history="1">
+          <w:hyperlink w:anchor="_Toc243322728" w:history="1">
             <w:r>
               <w:rPr>
                 <w:rStyle w:val="a5"/>
@@ -2233,7 +2233,7 @@
               <w:rPr>
                 <w:noProof/>
               </w:rPr>
-              <w:instrText xml:space="preserve"> PAGEREF _Toc243322442 \h </w:instrText>
+              <w:instrText xml:space="preserve"> PAGEREF _Toc243322728 \h </w:instrText>
             </w:r>
             <w:r>
               <w:rPr>
@@ -2271,7 +2271,7 @@
               <w:noProof/>
             </w:rPr>
           </w:pPr>
-          <w:hyperlink w:anchor="_Toc243322443" w:history="1">
+          <w:hyperlink w:anchor="_Toc243322729" w:history="1">
             <w:r>
               <w:rPr>
                 <w:rStyle w:val="a5"/>
@@ -2295,7 +2295,7 @@
               <w:rPr>
                 <w:noProof/>
               </w:rPr>
-              <w:instrText xml:space="preserve"> PAGEREF _Toc243322443 \h </w:instrText>
+              <w:instrText xml:space="preserve"> PAGEREF _Toc243322729 \h </w:instrText>
             </w:r>
             <w:r>
               <w:rPr>
@@ -2333,7 +2333,7 @@
               <w:noProof/>
             </w:rPr>
           </w:pPr>
-          <w:hyperlink w:anchor="_Toc243322444" w:history="1">
+          <w:hyperlink w:anchor="_Toc243322730" w:history="1">
             <w:r>
               <w:rPr>
                 <w:rStyle w:val="a5"/>
@@ -2357,7 +2357,7 @@
               <w:rPr>
                 <w:noProof/>
               </w:rPr>
-              <w:instrText xml:space="preserve"> PAGEREF _Toc243322444 \h </w:instrText>
+              <w:instrText xml:space="preserve"> PAGEREF _Toc243322730 \h </w:instrText>
             </w:r>
             <w:r>
               <w:rPr>
@@ -2394,7 +2394,7 @@
               <w:noProof/>
             </w:rPr>
           </w:pPr>
-          <w:hyperlink w:anchor="_Toc243322445" w:history="1">
+          <w:hyperlink w:anchor="_Toc243322731" w:history="1">
             <w:r>
               <w:rPr>
                 <w:rStyle w:val="a5"/>
@@ -2418,7 +2418,7 @@
               <w:rPr>
                 <w:noProof/>
               </w:rPr>
-              <w:instrText xml:space="preserve"> PAGEREF _Toc243322445 \h </w:instrText>
+              <w:instrText xml:space="preserve"> PAGEREF _Toc243322731 \h </w:instrText>
             </w:r>
             <w:r>
               <w:rPr>
@@ -2456,7 +2456,7 @@
               <w:noProof/>
             </w:rPr>
           </w:pPr>
-          <w:hyperlink w:anchor="_Toc243322446" w:history="1">
+          <w:hyperlink w:anchor="_Toc243322732" w:history="1">
             <w:r>
               <w:rPr>
                 <w:rStyle w:val="a5"/>
@@ -2480,7 +2480,7 @@
               <w:rPr>
                 <w:noProof/>
               </w:rPr>
-              <w:instrText xml:space="preserve"> PAGEREF _Toc243322446 \h </w:instrText>
+              <w:instrText xml:space="preserve"> PAGEREF _Toc243322732 \h </w:instrText>
             </w:r>
             <w:r>
               <w:rPr>
@@ -2518,7 +2518,7 @@
               <w:noProof/>
             </w:rPr>
           </w:pPr>
-          <w:hyperlink w:anchor="_Toc243322447" w:history="1">
+          <w:hyperlink w:anchor="_Toc243322733" w:history="1">
             <w:r>
               <w:rPr>
                 <w:rStyle w:val="a5"/>
@@ -2542,7 +2542,7 @@
               <w:rPr>
                 <w:noProof/>
               </w:rPr>
-              <w:instrText xml:space="preserve"> PAGEREF _Toc243322447 \h </w:instrText>
+              <w:instrText xml:space="preserve"> PAGEREF _Toc243322733 \h </w:instrText>
             </w:r>
             <w:r>
               <w:rPr>
@@ -2580,7 +2580,7 @@
               <w:noProof/>
             </w:rPr>
           </w:pPr>
-          <w:hyperlink w:anchor="_Toc243322448" w:history="1">
+          <w:hyperlink w:anchor="_Toc243322734" w:history="1">
             <w:r>
               <w:rPr>
                 <w:rStyle w:val="a5"/>
@@ -2604,7 +2604,7 @@
               <w:rPr>
                 <w:noProof/>
               </w:rPr>
-              <w:instrText xml:space="preserve"> PAGEREF _Toc243322448 \h </w:instrText>
+              <w:instrText xml:space="preserve"> PAGEREF _Toc243322734 \h </w:instrText>
             </w:r>
             <w:r>
               <w:rPr>
@@ -2642,7 +2642,7 @@
               <w:noProof/>
             </w:rPr>
           </w:pPr>
-          <w:hyperlink w:anchor="_Toc243322449" w:history="1">
+          <w:hyperlink w:anchor="_Toc243322735" w:history="1">
             <w:r>
               <w:rPr>
                 <w:rStyle w:val="a5"/>
@@ -2666,7 +2666,7 @@
               <w:rPr>
                 <w:noProof/>
               </w:rPr>
-              <w:instrText xml:space="preserve"> PAGEREF _Toc243322449 \h </w:instrText>
+              <w:instrText xml:space="preserve"> PAGEREF _Toc243322735 \h </w:instrText>
             </w:r>
             <w:r>
               <w:rPr>
@@ -2704,7 +2704,7 @@
               <w:noProof/>
             </w:rPr>
           </w:pPr>
-          <w:hyperlink w:anchor="_Toc243322450" w:history="1">
+          <w:hyperlink w:anchor="_Toc243322736" w:history="1">
             <w:r>
               <w:rPr>
                 <w:rStyle w:val="a5"/>
@@ -2728,7 +2728,7 @@
               <w:rPr>
                 <w:noProof/>
               </w:rPr>
-              <w:instrText xml:space="preserve"> PAGEREF _Toc243322450 \h </w:instrText>
+              <w:instrText xml:space="preserve"> PAGEREF _Toc243322736 \h </w:instrText>
             </w:r>
             <w:r>
               <w:rPr>
@@ -2766,7 +2766,7 @@
               <w:noProof/>
             </w:rPr>
           </w:pPr>
-          <w:hyperlink w:anchor="_Toc243322451" w:history="1">
+          <w:hyperlink w:anchor="_Toc243322737" w:history="1">
             <w:r>
               <w:rPr>
                 <w:rStyle w:val="a5"/>
@@ -2790,7 +2790,7 @@
               <w:rPr>
                 <w:noProof/>
               </w:rPr>
-              <w:instrText xml:space="preserve"> PAGEREF _Toc243322451 \h </w:instrText>
+              <w:instrText xml:space="preserve"> PAGEREF _Toc243322737 \h </w:instrText>
             </w:r>
             <w:r>
               <w:rPr>
@@ -2827,7 +2827,7 @@
               <w:noProof/>
             </w:rPr>
           </w:pPr>
-          <w:hyperlink w:anchor="_Toc243322452" w:history="1">
+          <w:hyperlink w:anchor="_Toc243322738" w:history="1">
             <w:r>
               <w:rPr>
                 <w:rStyle w:val="a5"/>
@@ -2851,7 +2851,7 @@
               <w:rPr>
                 <w:noProof/>
               </w:rPr>
-              <w:instrText xml:space="preserve"> PAGEREF _Toc243322452 \h </w:instrText>
+              <w:instrText xml:space="preserve"> PAGEREF _Toc243322738 \h </w:instrText>
             </w:r>
             <w:r>
               <w:rPr>
@@ -2888,7 +2888,7 @@
               <w:noProof/>
             </w:rPr>
           </w:pPr>
-          <w:hyperlink w:anchor="_Toc243322453" w:history="1">
+          <w:hyperlink w:anchor="_Toc243322739" w:history="1">
             <w:r>
               <w:rPr>
                 <w:rStyle w:val="a5"/>
@@ -2912,7 +2912,7 @@
               <w:rPr>
                 <w:noProof/>
               </w:rPr>
-              <w:instrText xml:space="preserve"> PAGEREF _Toc243322453 \h </w:instrText>
+              <w:instrText xml:space="preserve"> PAGEREF _Toc243322739 \h </w:instrText>
             </w:r>
             <w:r>
               <w:rPr>
@@ -2950,7 +2950,7 @@
               <w:noProof/>
             </w:rPr>
           </w:pPr>
-          <w:hyperlink w:anchor="_Toc243322454" w:history="1">
+          <w:hyperlink w:anchor="_Toc243322740" w:history="1">
             <w:r>
               <w:rPr>
                 <w:rStyle w:val="a5"/>
@@ -2974,7 +2974,7 @@
               <w:rPr>
                 <w:noProof/>
               </w:rPr>
-              <w:instrText xml:space="preserve"> PAGEREF _Toc243322454 \h </w:instrText>
+              <w:instrText xml:space="preserve"> PAGEREF _Toc243322740 \h </w:instrText>
             </w:r>
             <w:r>
               <w:rPr>
@@ -3012,7 +3012,7 @@
               <w:noProof/>
             </w:rPr>
           </w:pPr>
-          <w:hyperlink w:anchor="_Toc243322455" w:history="1">
+          <w:hyperlink w:anchor="_Toc243322741" w:history="1">
             <w:r>
               <w:rPr>
                 <w:rStyle w:val="a5"/>
@@ -3036,7 +3036,7 @@
               <w:rPr>
                 <w:noProof/>
               </w:rPr>
-              <w:instrText xml:space="preserve"> PAGEREF _Toc243322455 \h </w:instrText>
+              <w:instrText xml:space="preserve"> PAGEREF _Toc243322741 \h </w:instrText>
             </w:r>
             <w:r>
               <w:rPr>
@@ -3074,7 +3074,7 @@
               <w:noProof/>
             </w:rPr>
           </w:pPr>
-          <w:hyperlink w:anchor="_Toc243322456" w:history="1">
+          <w:hyperlink w:anchor="_Toc243322742" w:history="1">
             <w:r>
               <w:rPr>
                 <w:rStyle w:val="a5"/>
@@ -3098,7 +3098,7 @@
               <w:rPr>
                 <w:noProof/>
               </w:rPr>
-              <w:instrText xml:space="preserve"> PAGEREF _Toc243322456 \h </w:instrText>
+              <w:instrText xml:space="preserve"> PAGEREF _Toc243322742 \h </w:instrText>
             </w:r>
             <w:r>
               <w:rPr>
@@ -3136,7 +3136,7 @@
               <w:noProof/>
             </w:rPr>
           </w:pPr>
-          <w:hyperlink w:anchor="_Toc243322457" w:history="1">
+          <w:hyperlink w:anchor="_Toc243322743" w:history="1">
             <w:r>
               <w:rPr>
                 <w:rStyle w:val="a5"/>
@@ -3160,7 +3160,7 @@
               <w:rPr>
                 <w:noProof/>
               </w:rPr>
-              <w:instrText xml:space="preserve"> PAGEREF _Toc243322457 \h </w:instrText>
+              <w:instrText xml:space="preserve"> PAGEREF _Toc243322743 \h </w:instrText>
             </w:r>
             <w:r>
               <w:rPr>
@@ -3197,7 +3197,7 @@
               <w:noProof/>
             </w:rPr>
           </w:pPr>
-          <w:hyperlink w:anchor="_Toc243322458" w:history="1">
+          <w:hyperlink w:anchor="_Toc243322744" w:history="1">
             <w:r>
               <w:rPr>
                 <w:rStyle w:val="a5"/>
@@ -3221,7 +3221,7 @@
               <w:rPr>
                 <w:noProof/>
               </w:rPr>
-              <w:instrText xml:space="preserve"> PAGEREF _Toc243322458 \h </w:instrText>
+              <w:instrText xml:space="preserve"> PAGEREF _Toc243322744 \h </w:instrText>
             </w:r>
             <w:r>
               <w:rPr>
@@ -3258,7 +3258,7 @@
               <w:noProof/>
             </w:rPr>
           </w:pPr>
-          <w:hyperlink w:anchor="_Toc243322459" w:history="1">
+          <w:hyperlink w:anchor="_Toc243322745" w:history="1">
             <w:r>
               <w:rPr>
                 <w:rStyle w:val="a5"/>
@@ -3282,7 +3282,7 @@
               <w:rPr>
                 <w:noProof/>
               </w:rPr>
-              <w:instrText xml:space="preserve"> PAGEREF _Toc243322459 \h </w:instrText>
+              <w:instrText xml:space="preserve"> PAGEREF _Toc243322745 \h </w:instrText>
             </w:r>
             <w:r>
               <w:rPr>
@@ -3319,7 +3319,7 @@
               <w:noProof/>
             </w:rPr>
           </w:pPr>
-          <w:hyperlink w:anchor="_Toc243322460" w:history="1">
+          <w:hyperlink w:anchor="_Toc243322746" w:history="1">
             <w:r>
               <w:rPr>
                 <w:rStyle w:val="a5"/>
@@ -3343,7 +3343,7 @@
               <w:rPr>
                 <w:noProof/>
               </w:rPr>
-              <w:instrText xml:space="preserve"> PAGEREF _Toc243322460 \h </w:instrText>
+              <w:instrText xml:space="preserve"> PAGEREF _Toc243322746 \h </w:instrText>
             </w:r>
             <w:r>
               <w:rPr>
@@ -3380,7 +3380,7 @@
               <w:noProof/>
             </w:rPr>
           </w:pPr>
-          <w:hyperlink w:anchor="_Toc243322461" w:history="1">
+          <w:hyperlink w:anchor="_Toc243322747" w:history="1">
             <w:r>
               <w:rPr>
                 <w:rStyle w:val="a5"/>
@@ -3404,7 +3404,7 @@
               <w:rPr>
                 <w:noProof/>
               </w:rPr>
-              <w:instrText xml:space="preserve"> PAGEREF _Toc243322461 \h </w:instrText>
+              <w:instrText xml:space="preserve"> PAGEREF _Toc243322747 \h </w:instrText>
             </w:r>
             <w:r>
               <w:rPr>
@@ -3421,7 +3421,7 @@
               <w:rPr>
                 <w:noProof/>
               </w:rPr>
-              <w:t>21</w:t>
+              <w:t>22</w:t>
             </w:r>
             <w:r>
               <w:rPr>
@@ -3442,7 +3442,7 @@
               <w:noProof/>
             </w:rPr>
           </w:pPr>
-          <w:hyperlink w:anchor="_Toc243322462" w:history="1">
+          <w:hyperlink w:anchor="_Toc243322748" w:history="1">
             <w:r>
               <w:rPr>
                 <w:rStyle w:val="a5"/>
@@ -3466,7 +3466,7 @@
               <w:rPr>
                 <w:noProof/>
               </w:rPr>
-              <w:instrText xml:space="preserve"> PAGEREF _Toc243322462 \h </w:instrText>
+              <w:instrText xml:space="preserve"> PAGEREF _Toc243322748 \h </w:instrText>
             </w:r>
             <w:r>
               <w:rPr>
@@ -3483,7 +3483,7 @@
               <w:rPr>
                 <w:noProof/>
               </w:rPr>
-              <w:t>22</w:t>
+              <w:t>23</w:t>
             </w:r>
             <w:r>
               <w:rPr>
@@ -3505,7 +3505,7 @@
         <w:pStyle w:val="1"/>
         <w:pageBreakBefore/>
       </w:pPr>
-      <w:bookmarkStart w:id="0" w:name="_Toc243322418"/>
+      <w:bookmarkStart w:id="0" w:name="_Toc243322704"/>
       <w:r>
         <w:lastRenderedPageBreak/>
         <w:t>1. Introduction</w:t>
@@ -3516,7 +3516,7 @@
       <w:pPr>
         <w:pStyle w:val="2"/>
       </w:pPr>
-      <w:bookmarkStart w:id="1" w:name="_Toc243322419"/>
+      <w:bookmarkStart w:id="1" w:name="_Toc243322705"/>
       <w:r>
         <w:t>1.1 Purpose of the project</w:t>
       </w:r>
@@ -3559,7 +3559,7 @@
       <w:pPr>
         <w:pStyle w:val="2"/>
       </w:pPr>
-      <w:bookmarkStart w:id="2" w:name="_Toc243322420"/>
+      <w:bookmarkStart w:id="2" w:name="_Toc243322706"/>
       <w:r>
         <w:t>1.2 Who will use it</w:t>
       </w:r>
@@ -3577,7 +3577,7 @@
       <w:pPr>
         <w:pStyle w:val="2"/>
       </w:pPr>
-      <w:bookmarkStart w:id="3" w:name="_Toc243322421"/>
+      <w:bookmarkStart w:id="3" w:name="_Toc243322707"/>
       <w:r>
         <w:t>1.3 Goals</w:t>
       </w:r>
@@ -3660,7 +3660,7 @@
       <w:pPr>
         <w:pStyle w:val="2"/>
       </w:pPr>
-      <w:bookmarkStart w:id="4" w:name="_Toc243322422"/>
+      <w:bookmarkStart w:id="4" w:name="_Toc243322708"/>
       <w:r>
         <w:t>1.4 Team and module ownership</w:t>
       </w:r>
@@ -4298,23 +4298,9 @@
     </w:p>
     <w:p>
       <w:pPr>
-        <w:shd w:val="clear" w:color="auto" w:fill="FFF4D6"/>
-        <w:spacing w:after="140" w:line="300" w:lineRule="auto"/>
-      </w:pPr>
-      <w:r>
-        <w:rPr>
-          <w:i/>
-          <w:iCs/>
-          <w:color w:val="7A5A00"/>
-        </w:rPr>
-        <w:t>[Optional, from the report guide: a short statement of which member wrote which section of this report.]</w:t>
-      </w:r>
-    </w:p>
-    <w:p>
-      <w:pPr>
         <w:pStyle w:val="2"/>
       </w:pPr>
-      <w:bookmarkStart w:id="5" w:name="_Toc243322423"/>
+      <w:bookmarkStart w:id="5" w:name="_Toc243322709"/>
       <w:r>
         <w:t>1.5 Use of AI tools</w:t>
       </w:r>
@@ -4333,7 +4319,7 @@
         <w:pStyle w:val="1"/>
         <w:pageBreakBefore/>
       </w:pPr>
-      <w:bookmarkStart w:id="6" w:name="_Toc243322424"/>
+      <w:bookmarkStart w:id="6" w:name="_Toc243322710"/>
       <w:r>
         <w:lastRenderedPageBreak/>
         <w:t>2. Background</w:t>
@@ -4382,7 +4368,7 @@
         <w:pStyle w:val="1"/>
         <w:pageBreakBefore/>
       </w:pPr>
-      <w:bookmarkStart w:id="7" w:name="_Toc243322425"/>
+      <w:bookmarkStart w:id="7" w:name="_Toc243322711"/>
       <w:r>
         <w:lastRenderedPageBreak/>
         <w:t>3. Project evolution and key decisions</w:t>
@@ -4401,7 +4387,7 @@
       <w:pPr>
         <w:pStyle w:val="2"/>
       </w:pPr>
-      <w:bookmarkStart w:id="8" w:name="_Toc243322426"/>
+      <w:bookmarkStart w:id="8" w:name="_Toc243322712"/>
       <w:r>
         <w:t>3.1 The original approach: scraping each retailer</w:t>
       </w:r>
@@ -4419,7 +4405,7 @@
       <w:pPr>
         <w:pStyle w:val="2"/>
       </w:pPr>
-      <w:bookmarkStart w:id="9" w:name="_Toc243322427"/>
+      <w:bookmarkStart w:id="9" w:name="_Toc243322713"/>
       <w:r>
         <w:t>3.2 What went wrong</w:t>
       </w:r>
@@ -4484,7 +4470,7 @@
       <w:pPr>
         <w:pStyle w:val="2"/>
       </w:pPr>
-      <w:bookmarkStart w:id="10" w:name="_Toc243322428"/>
+      <w:bookmarkStart w:id="10" w:name="_Toc243322714"/>
       <w:r>
         <w:t>3.3 Decision: read Google Shopping through search APIs</w:t>
       </w:r>
@@ -4530,7 +4516,7 @@
       <w:pPr>
         <w:pStyle w:val="2"/>
       </w:pPr>
-      <w:bookmarkStart w:id="11" w:name="_Toc243322429"/>
+      <w:bookmarkStart w:id="11" w:name="_Toc243322715"/>
       <w:r>
         <w:t>3.4 Decision: a pipeline of single-purpose AI agents</w:t>
       </w:r>
@@ -4570,7 +4556,7 @@
       <w:pPr>
         <w:pStyle w:val="2"/>
       </w:pPr>
-      <w:bookmarkStart w:id="12" w:name="_Toc243322430"/>
+      <w:bookmarkStart w:id="12" w:name="_Toc243322716"/>
       <w:r>
         <w:t>3.5 Other decisions</w:t>
       </w:r>
@@ -5135,7 +5121,7 @@
         <w:pStyle w:val="1"/>
         <w:pageBreakBefore/>
       </w:pPr>
-      <w:bookmarkStart w:id="13" w:name="_Toc243322431"/>
+      <w:bookmarkStart w:id="13" w:name="_Toc243322717"/>
       <w:r>
         <w:lastRenderedPageBreak/>
         <w:t>4. System design</w:t>
@@ -5146,7 +5132,7 @@
       <w:pPr>
         <w:pStyle w:val="2"/>
       </w:pPr>
-      <w:bookmarkStart w:id="14" w:name="_Toc243322432"/>
+      <w:bookmarkStart w:id="14" w:name="_Toc243322718"/>
       <w:r>
         <w:t>4.1 Architecture</w:t>
       </w:r>
@@ -5181,7 +5167,7 @@
           <w:noProof/>
         </w:rPr>
         <w:drawing>
-          <wp:inline distT="0" distB="0" distL="0" distR="0" wp14:anchorId="42A309DC" wp14:editId="03BE1A49">
+          <wp:inline distT="0" distB="0" distL="0" distR="0" wp14:anchorId="61168FD6" wp14:editId="3998DC8F">
             <wp:extent cx="5715000" cy="2105025"/>
             <wp:effectExtent l="0" t="0" r="0" b="0"/>
             <wp:docPr id="1" name="architecture.png" descr="Architecture: four layers connected by an integration layer, and the external services the system uses." title="Figure 1"/>
@@ -5247,7 +5233,7 @@
       <w:pPr>
         <w:pStyle w:val="2"/>
       </w:pPr>
-      <w:bookmarkStart w:id="15" w:name="_Toc243322433"/>
+      <w:bookmarkStart w:id="15" w:name="_Toc243322719"/>
       <w:r>
         <w:t>4.2 Main flows</w:t>
       </w:r>
@@ -5291,7 +5277,7 @@
           <w:noProof/>
         </w:rPr>
         <w:drawing>
-          <wp:inline distT="0" distB="0" distL="0" distR="0" wp14:anchorId="2F03226F" wp14:editId="264CD3D8">
+          <wp:inline distT="0" distB="0" distL="0" distR="0" wp14:anchorId="38522F4B" wp14:editId="43ED25D0">
             <wp:extent cx="5715000" cy="1771650"/>
             <wp:effectExtent l="0" t="0" r="0" b="0"/>
             <wp:docPr id="2" name="pipeline.png" descr="The Find pipeline (top) and the monitoring flow (bottom). Purple boxes are AI agents; all decisions about deals and emails are made in code." title="Figure 2"/>
@@ -5357,7 +5343,7 @@
       <w:pPr>
         <w:pStyle w:val="2"/>
       </w:pPr>
-      <w:bookmarkStart w:id="16" w:name="_Toc243322434"/>
+      <w:bookmarkStart w:id="16" w:name="_Toc243322720"/>
       <w:r>
         <w:t>4.3 Technologies</w:t>
       </w:r>
@@ -6415,7 +6401,7 @@
         <w:pStyle w:val="1"/>
         <w:pageBreakBefore/>
       </w:pPr>
-      <w:bookmarkStart w:id="17" w:name="_Toc243322435"/>
+      <w:bookmarkStart w:id="17" w:name="_Toc243322721"/>
       <w:r>
         <w:lastRenderedPageBreak/>
         <w:t>5. Implementation</w:t>
@@ -6426,7 +6412,7 @@
       <w:pPr>
         <w:pStyle w:val="2"/>
       </w:pPr>
-      <w:bookmarkStart w:id="18" w:name="_Toc243322436"/>
+      <w:bookmarkStart w:id="18" w:name="_Toc243322722"/>
       <w:r>
         <w:t>5.1 The eight AI agents</w:t>
       </w:r>
@@ -7304,7 +7290,7 @@
       <w:pPr>
         <w:pStyle w:val="2"/>
       </w:pPr>
-      <w:bookmarkStart w:id="19" w:name="_Toc243322437"/>
+      <w:bookmarkStart w:id="19" w:name="_Toc243322723"/>
       <w:r>
         <w:t>5.2 Connecting the agents with LangGraph</w:t>
       </w:r>
@@ -7628,7 +7614,7 @@
       <w:pPr>
         <w:pStyle w:val="2"/>
       </w:pPr>
-      <w:bookmarkStart w:id="20" w:name="_Toc243322438"/>
+      <w:bookmarkStart w:id="20" w:name="_Toc243322724"/>
       <w:r>
         <w:t>5.3 One validated entry point for the model</w:t>
       </w:r>
@@ -7760,7 +7746,7 @@
       <w:pPr>
         <w:pStyle w:val="2"/>
       </w:pPr>
-      <w:bookmarkStart w:id="21" w:name="_Toc243322439"/>
+      <w:bookmarkStart w:id="21" w:name="_Toc243322725"/>
       <w:r>
         <w:t>5.4 Data providers and price verification</w:t>
       </w:r>
@@ -7797,7 +7783,7 @@
       <w:pPr>
         <w:pStyle w:val="2"/>
       </w:pPr>
-      <w:bookmarkStart w:id="22" w:name="_Toc243322440"/>
+      <w:bookmarkStart w:id="22" w:name="_Toc243322726"/>
       <w:r>
         <w:t>5.5 Same-product matching</w:t>
       </w:r>
@@ -7826,7 +7812,7 @@
       <w:pPr>
         <w:pStyle w:val="2"/>
       </w:pPr>
-      <w:bookmarkStart w:id="23" w:name="_Toc243322441"/>
+      <w:bookmarkStart w:id="23" w:name="_Toc243322727"/>
       <w:r>
         <w:t>5.6 Monitoring and alerts</w:t>
       </w:r>
@@ -7867,7 +7853,7 @@
       <w:pPr>
         <w:pStyle w:val="2"/>
       </w:pPr>
-      <w:bookmarkStart w:id="24" w:name="_Toc243322442"/>
+      <w:bookmarkStart w:id="24" w:name="_Toc243322728"/>
       <w:r>
         <w:t>5.7 Web interface and email</w:t>
       </w:r>
@@ -7891,7 +7877,7 @@
           <w:noProof/>
         </w:rPr>
         <w:drawing>
-          <wp:inline distT="0" distB="0" distL="0" distR="0" wp14:anchorId="6C67BEF0" wp14:editId="6314E33D">
+          <wp:inline distT="0" distB="0" distL="0" distR="0" wp14:anchorId="7BD08708" wp14:editId="09D94262">
             <wp:extent cx="5715000" cy="3838575"/>
             <wp:effectExtent l="0" t="0" r="0" b="0"/>
             <wp:docPr id="3" name="find.png" descr="A real search for &quot;noise cancelling headphones under NZD 400&quot;: the search terms written by the Rewrite agent, and product cards with bilingual summaries." title="Figure 3"/>
@@ -7964,7 +7950,7 @@
         </w:rPr>
         <w:lastRenderedPageBreak/>
         <w:drawing>
-          <wp:inline distT="0" distB="0" distL="0" distR="0" wp14:anchorId="335E8449" wp14:editId="4C05B84A">
+          <wp:inline distT="0" distB="0" distL="0" distR="0" wp14:anchorId="6ED46278" wp14:editId="64D290A0">
             <wp:extent cx="5715000" cy="3838575"/>
             <wp:effectExtent l="0" t="0" r="0" b="0"/>
             <wp:docPr id="4" name="preview.png" descr="Compare and monitor: the same product at other merchants, checked by the offer verifier (&quot;AI: same product&quot;). Trusted merchants are ticked by default." title="Figure 4"/>
@@ -8036,7 +8022,7 @@
           <w:noProof/>
         </w:rPr>
         <w:drawing>
-          <wp:inline distT="0" distB="0" distL="0" distR="0" wp14:anchorId="127BCB92" wp14:editId="323D6DF7">
+          <wp:inline distT="0" distB="0" distL="0" distR="0" wp14:anchorId="7D032DDA" wp14:editId="7E02FB54">
             <wp:extent cx="5715000" cy="3838575"/>
             <wp:effectExtent l="0" t="0" r="0" b="0"/>
             <wp:docPr id="5" name="detail.png" descr="A real monitor for the Fitbit Charge 6 at two merchants, with its price trend from 6 to 14 October 2026 and the 30-day comparison. The owner's email address is hidden." title="Figure 5"/>
@@ -8392,7 +8378,7 @@
       <w:pPr>
         <w:pStyle w:val="2"/>
       </w:pPr>
-      <w:bookmarkStart w:id="25" w:name="_Toc243322443"/>
+      <w:bookmarkStart w:id="25" w:name="_Toc243322729"/>
       <w:r>
         <w:t>5.8 Security and cost control</w:t>
       </w:r>
@@ -8465,7 +8451,7 @@
       <w:pPr>
         <w:pStyle w:val="2"/>
       </w:pPr>
-      <w:bookmarkStart w:id="26" w:name="_Toc243322444"/>
+      <w:bookmarkStart w:id="26" w:name="_Toc243322730"/>
       <w:r>
         <w:t>5.9 Packaging and demo mode</w:t>
       </w:r>
@@ -8503,7 +8489,7 @@
         <w:pStyle w:val="1"/>
         <w:pageBreakBefore/>
       </w:pPr>
-      <w:bookmarkStart w:id="27" w:name="_Toc243322445"/>
+      <w:bookmarkStart w:id="27" w:name="_Toc243322731"/>
       <w:r>
         <w:lastRenderedPageBreak/>
         <w:t>6. Testing and evaluation</w:t>
@@ -8514,7 +8500,7 @@
       <w:pPr>
         <w:pStyle w:val="2"/>
       </w:pPr>
-      <w:bookmarkStart w:id="28" w:name="_Toc243322446"/>
+      <w:bookmarkStart w:id="28" w:name="_Toc243322732"/>
       <w:r>
         <w:t>6.1 Automated tests</w:t>
       </w:r>
@@ -8532,7 +8518,7 @@
       <w:pPr>
         <w:pStyle w:val="2"/>
       </w:pPr>
-      <w:bookmarkStart w:id="29" w:name="_Toc243322447"/>
+      <w:bookmarkStart w:id="29" w:name="_Toc243322733"/>
       <w:r>
         <w:t>6.2 Evaluation plan</w:t>
       </w:r>
@@ -8567,7 +8553,7 @@
           <w:noProof/>
         </w:rPr>
         <w:drawing>
-          <wp:inline distT="0" distB="0" distL="0" distR="0" wp14:anchorId="79B072F8" wp14:editId="013796EC">
+          <wp:inline distT="0" distB="0" distL="0" distR="0" wp14:anchorId="5370BE86" wp14:editId="274A0202">
             <wp:extent cx="5715000" cy="1485900"/>
             <wp:effectExtent l="0" t="0" r="0" b="0"/>
             <wp:docPr id="6" name="evaluation.png" descr="Evaluation results on real data (5 October 2026)." title="Figure 6"/>
@@ -8633,7 +8619,7 @@
       <w:pPr>
         <w:pStyle w:val="2"/>
       </w:pPr>
-      <w:bookmarkStart w:id="30" w:name="_Toc243322448"/>
+      <w:bookmarkStart w:id="30" w:name="_Toc243322734"/>
       <w:r>
         <w:t>6.3 Real price accuracy</w:t>
       </w:r>
@@ -9581,7 +9567,7 @@
       <w:pPr>
         <w:pStyle w:val="2"/>
       </w:pPr>
-      <w:bookmarkStart w:id="31" w:name="_Toc243322449"/>
+      <w:bookmarkStart w:id="31" w:name="_Toc243322735"/>
       <w:r>
         <w:t>6.4 Agents with the real model</w:t>
       </w:r>
@@ -10103,7 +10089,7 @@
       <w:pPr>
         <w:pStyle w:val="2"/>
       </w:pPr>
-      <w:bookmarkStart w:id="32" w:name="_Toc243322450"/>
+      <w:bookmarkStart w:id="32" w:name="_Toc243322736"/>
       <w:r>
         <w:t>6.5 End to end</w:t>
       </w:r>
@@ -10121,7 +10107,7 @@
       <w:pPr>
         <w:pStyle w:val="2"/>
       </w:pPr>
-      <w:bookmarkStart w:id="33" w:name="_Toc243322451"/>
+      <w:bookmarkStart w:id="33" w:name="_Toc243322737"/>
       <w:r>
         <w:t>6.6 Limits of the evaluation</w:t>
       </w:r>
@@ -10140,7 +10126,7 @@
         <w:pStyle w:val="1"/>
         <w:pageBreakBefore/>
       </w:pPr>
-      <w:bookmarkStart w:id="34" w:name="_Toc243322452"/>
+      <w:bookmarkStart w:id="34" w:name="_Toc243322738"/>
       <w:r>
         <w:lastRenderedPageBreak/>
         <w:t>7. Problems and how we solved them</w:t>
@@ -10761,7 +10747,7 @@
         <w:pStyle w:val="1"/>
         <w:pageBreakBefore/>
       </w:pPr>
-      <w:bookmarkStart w:id="35" w:name="_Toc243322453"/>
+      <w:bookmarkStart w:id="35" w:name="_Toc243322739"/>
       <w:r>
         <w:lastRenderedPageBreak/>
         <w:t>8. User manual</w:t>
@@ -10772,7 +10758,7 @@
       <w:pPr>
         <w:pStyle w:val="2"/>
       </w:pPr>
-      <w:bookmarkStart w:id="36" w:name="_Toc243322454"/>
+      <w:bookmarkStart w:id="36" w:name="_Toc243322740"/>
       <w:r>
         <w:t>8.1 Running the Windows program</w:t>
       </w:r>
@@ -10843,7 +10829,7 @@
       <w:pPr>
         <w:pStyle w:val="2"/>
       </w:pPr>
-      <w:bookmarkStart w:id="37" w:name="_Toc243322455"/>
+      <w:bookmarkStart w:id="37" w:name="_Toc243322741"/>
       <w:r>
         <w:t>8.2 Running from source</w:t>
       </w:r>
@@ -10883,7 +10869,7 @@
       <w:pPr>
         <w:pStyle w:val="2"/>
       </w:pPr>
-      <w:bookmarkStart w:id="38" w:name="_Toc243322456"/>
+      <w:bookmarkStart w:id="38" w:name="_Toc243322742"/>
       <w:r>
         <w:t>8.3 Finding a product and creating a monitor</w:t>
       </w:r>
@@ -11015,7 +11001,7 @@
       <w:pPr>
         <w:pStyle w:val="2"/>
       </w:pPr>
-      <w:bookmarkStart w:id="39" w:name="_Toc243322457"/>
+      <w:bookmarkStart w:id="39" w:name="_Toc243322743"/>
       <w:r>
         <w:t>8.4 Checking without keeping the window open</w:t>
       </w:r>
@@ -11062,7 +11048,7 @@
         <w:pStyle w:val="1"/>
         <w:pageBreakBefore/>
       </w:pPr>
-      <w:bookmarkStart w:id="40" w:name="_Toc243322458"/>
+      <w:bookmarkStart w:id="40" w:name="_Toc243322744"/>
       <w:r>
         <w:lastRenderedPageBreak/>
         <w:t>9. Conclusion</w:t>
@@ -11093,7 +11079,7 @@
         <w:pStyle w:val="1"/>
         <w:pageBreakBefore/>
       </w:pPr>
-      <w:bookmarkStart w:id="41" w:name="_Toc243322459"/>
+      <w:bookmarkStart w:id="41" w:name="_Toc243322745"/>
       <w:r>
         <w:lastRenderedPageBreak/>
         <w:t>10. Future work</w:t>
@@ -11183,7 +11169,7 @@
         <w:pStyle w:val="1"/>
         <w:pageBreakBefore/>
       </w:pPr>
-      <w:bookmarkStart w:id="42" w:name="_Toc243322460"/>
+      <w:bookmarkStart w:id="42" w:name="_Toc243322746"/>
       <w:r>
         <w:lastRenderedPageBreak/>
         <w:t>11. Personal learning</w:t>
@@ -11192,10 +11178,21 @@
     </w:p>
     <w:p>
       <w:pPr>
+        <w:pStyle w:val="3"/>
+      </w:pPr>
+      <w:r>
+        <w:t>Fengwei Zhang</w:t>
+      </w:r>
+    </w:p>
+    <w:p>
+      <w:pPr>
         <w:spacing w:after="140" w:line="300" w:lineRule="auto"/>
       </w:pPr>
       <w:r>
-        <w:t>Each team member wrote their own paragraph.</w:t>
+        <w:t>The most important thing I learned as project lead was to test a design against reality early. Our proposal depended on scraping retailer websites, and only when the big shops blocked us did we see how fragile that plan was. Changing to search APIs late in the semester cost time, and next time I would check the data source in the first week. I also learned how much coordination depends on clear interfaces: once the boundaries between modules were written down, five people could work at the same time. Finall</w:t>
+      </w:r>
+      <w:r>
+        <w:t>y, I learned that "the tests pass" is not the same as "the system is correct". Our real price accuracy was only 60% at first, and it reached 100% only after I went through every wrong price and found its cause. Working with AI-assisted programming tools taught me that the design decisions and the checking still have to be done by us.</w:t>
       </w:r>
     </w:p>
     <w:p>
@@ -11203,122 +11200,184 @@
         <w:pStyle w:val="3"/>
       </w:pPr>
       <w:r>
-        <w:t>Fengwei Zhang</w:t>
-      </w:r>
-    </w:p>
-    <w:p>
-      <w:pPr>
-        <w:shd w:val="clear" w:color="auto" w:fill="FFF4D6"/>
+        <w:t>Gang Zhao</w:t>
+      </w:r>
+    </w:p>
+    <w:p>
+      <w:pPr>
         <w:spacing w:after="140" w:line="300" w:lineRule="auto"/>
       </w:pPr>
+      <w:r>
+        <w:t>Working on the data part of the project taught me that collecting prices from the web is harder than it looks. I had expected scraping to be a technical problem, but anti-bot services such as DataDome made it a question of what is reliable and acceptable, which is why we moved to search APIs. I also learned that a price on a page is not always the price: superscript cents, prices before GST and Afterpay instalments all produced wrong numbers until they were handled. Structured data (JSON-LD) turned out to b</w:t>
+      </w:r>
+      <w:r>
+        <w:t>e the most reliable source. On the storage side, I learned how SQLite can keep a simple price history and how a 30-day low and average can be computed from it. I also became more aware of cost, because every API call counts against a daily limit.</w:t>
+      </w:r>
+    </w:p>
+    <w:p>
+      <w:pPr>
+        <w:pStyle w:val="3"/>
+      </w:pPr>
+      <w:r>
+        <w:t>Tianshuo Gao</w:t>
+      </w:r>
+    </w:p>
+    <w:p>
+      <w:pPr>
+        <w:spacing w:after="140" w:line="300" w:lineRule="auto"/>
+      </w:pPr>
+      <w:r>
+        <w:t>Through the interface and notification part I learned that a usable tool needs more than correct results. A search takes up to a minute, so the page had to show progress instead of appearing frozen, which taught me how a background job and polling work together. I also learned about security for a local web app: why the server only listens on the user's own computer and why every request that changes data needs a CSRF token. On the email side, I learned how SMTP works with a Gmail app password. One lesson c</w:t>
+      </w:r>
+      <w:r>
+        <w:t>ame from a real test: the first alert email arrived but was not noticed, so the subject was changed to make it stand out. It showed me that looking at the system from the user's side matters as much as making it work.</w:t>
+      </w:r>
+    </w:p>
+    <w:p>
+      <w:pPr>
+        <w:pStyle w:val="3"/>
+      </w:pPr>
+      <w:r>
+        <w:t>Xiao Zhang</w:t>
+      </w:r>
+    </w:p>
+    <w:p>
+      <w:pPr>
+        <w:spacing w:after="140" w:line="300" w:lineRule="auto"/>
+      </w:pPr>
+      <w:r>
+        <w:t>Working on the agents taught me how to use a large language model inside a real system rather than as a chat tool. Splitting the Find task into small agents, each with one job, made every step easier to test and to replace, and LangGraph showed me how such steps can be connected as a graph with a retry. The biggest lesson was that a model can produce answers that sound right but are not true. Our solution was to let the Select agent choose only from listing IDs the server had seen, to validate every output,</w:t>
+      </w:r>
+      <w:r>
+        <w:t xml:space="preserve"> and to fall back to simple rules when the model fails. I also learned how much the wording of a prompt matters, including examples of requests the agent should refuse. Same-product matching showed me that rules and AI work best together.</w:t>
+      </w:r>
+    </w:p>
+    <w:p>
+      <w:pPr>
+        <w:pStyle w:val="3"/>
+      </w:pPr>
+      <w:r>
+        <w:lastRenderedPageBreak/>
+        <w:t>Wenhan Zhang</w:t>
+      </w:r>
+    </w:p>
+    <w:p>
+      <w:pPr>
+        <w:spacing w:after="140" w:line="300" w:lineRule="auto"/>
+      </w:pPr>
+      <w:r>
+        <w:t>Working on monitoring and testing taught me that a scheduled background task needs careful rules. A check must not run twice at the same time, an error must not leave a task stuck, and one price drop must send only one email, even if two checks happen together. The send permit in the database was a simple idea that solved this. I also learned the value of offline tests: by replacing the language model with a fake client, using recorded API responses and blocking real network calls, our tests became free and</w:t>
+      </w:r>
+      <w:r>
+        <w:t xml:space="preserve"> repeatable. Evaluating the alerts showed me what precision and recall mean in practice: precision tells you that no email was sent by mistake, and recall tells you that no real deal was missed. Measuring both gave us confidence that the alerts behave correctly.</w:t>
+      </w:r>
+    </w:p>
+    <w:p>
+      <w:pPr>
+        <w:pStyle w:val="1"/>
+        <w:pageBreakBefore/>
+      </w:pPr>
+      <w:bookmarkStart w:id="43" w:name="_Toc243322747"/>
+      <w:r>
+        <w:lastRenderedPageBreak/>
+        <w:t>References</w:t>
+      </w:r>
+      <w:bookmarkEnd w:id="43"/>
+    </w:p>
+    <w:p>
+      <w:pPr>
+        <w:spacing w:after="140" w:line="280" w:lineRule="auto"/>
+        <w:ind w:left="720" w:hanging="720"/>
+      </w:pPr>
+      <w:r>
+        <w:t xml:space="preserve">Doorenbos, R. B., Etzioni, O., &amp; Weld, D. S. (1997). A scalable comparison-shopping agent for the World-Wide Web. In </w:t>
+      </w:r>
       <w:r>
         <w:rPr>
           <w:i/>
           <w:iCs/>
-          <w:color w:val="7A5A00"/>
-        </w:rPr>
-        <w:t>[To be written by Fengwei Zhang: what you personally learned from the project, for example about the module you owned, a problem you solved, working in a team, or a technology you used for the first time. About 100–200 words.]</w:t>
-      </w:r>
-    </w:p>
-    <w:p>
-      <w:pPr>
-        <w:pStyle w:val="3"/>
-      </w:pPr>
-      <w:r>
-        <w:t>Gang Zhao</w:t>
-      </w:r>
-    </w:p>
-    <w:p>
-      <w:pPr>
-        <w:shd w:val="clear" w:color="auto" w:fill="FFF4D6"/>
-        <w:spacing w:after="140" w:line="300" w:lineRule="auto"/>
-      </w:pPr>
+        </w:rPr>
+        <w:t>Proceedings of the First International Conference on Autonomous Agents</w:t>
+      </w:r>
+      <w:r>
+        <w:t xml:space="preserve"> (pp. 39–48). ACM. https://doi.org/10.1145/267658.267666</w:t>
+      </w:r>
+    </w:p>
+    <w:p>
+      <w:pPr>
+        <w:spacing w:after="140" w:line="280" w:lineRule="auto"/>
+        <w:ind w:left="720" w:hanging="720"/>
+      </w:pPr>
+      <w:r>
+        <w:t xml:space="preserve">DeepSeek. (n.d.). </w:t>
+      </w:r>
       <w:r>
         <w:rPr>
           <w:i/>
           <w:iCs/>
-          <w:color w:val="7A5A00"/>
-        </w:rPr>
-        <w:t>[To be written by Gang Zhao: what you personally learned from the project, for example about the module you owned, a problem you solved, working in a team, or a technology you used for the first time. About 100–200 words.]</w:t>
-      </w:r>
-    </w:p>
-    <w:p>
-      <w:pPr>
-        <w:pStyle w:val="3"/>
-      </w:pPr>
-      <w:r>
-        <w:t>Tianshuo Gao</w:t>
-      </w:r>
-    </w:p>
-    <w:p>
-      <w:pPr>
-        <w:shd w:val="clear" w:color="auto" w:fill="FFF4D6"/>
-        <w:spacing w:after="140" w:line="300" w:lineRule="auto"/>
-      </w:pPr>
+        </w:rPr>
+        <w:t>DeepSeek API documentation</w:t>
+      </w:r>
+      <w:r>
+        <w:t>. Retrieved October 18, 2026, from https://api-docs.deepseek.com/</w:t>
+      </w:r>
+    </w:p>
+    <w:p>
+      <w:pPr>
+        <w:spacing w:after="140" w:line="280" w:lineRule="auto"/>
+        <w:ind w:left="720" w:hanging="720"/>
+      </w:pPr>
+      <w:r>
+        <w:t xml:space="preserve">Firecrawl. (n.d.). </w:t>
+      </w:r>
       <w:r>
         <w:rPr>
           <w:i/>
           <w:iCs/>
-          <w:color w:val="7A5A00"/>
-        </w:rPr>
-        <w:t>[To be written by Tianshuo Gao: what you personally learned from the project, for example about the module you owned, a problem you solved, working in a team, or a technology you used for the first time. About 100–200 words.]</w:t>
-      </w:r>
-    </w:p>
-    <w:p>
-      <w:pPr>
-        <w:pStyle w:val="3"/>
-      </w:pPr>
-      <w:r>
-        <w:t>Xiao Zhang</w:t>
-      </w:r>
-    </w:p>
-    <w:p>
-      <w:pPr>
-        <w:shd w:val="clear" w:color="auto" w:fill="FFF4D6"/>
-        <w:spacing w:after="140" w:line="300" w:lineRule="auto"/>
-      </w:pPr>
+        </w:rPr>
+        <w:t>Firecrawl documentation</w:t>
+      </w:r>
+      <w:r>
+        <w:t>. Retrieved October 18, 2026, from https://docs.firecrawl.dev/</w:t>
+      </w:r>
+    </w:p>
+    <w:p>
+      <w:pPr>
+        <w:spacing w:after="140" w:line="280" w:lineRule="auto"/>
+        <w:ind w:left="720" w:hanging="720"/>
+      </w:pPr>
+      <w:r>
+        <w:t xml:space="preserve">Ji, Z., Lee, N., Frieske, R., Yu, T., Su, D., Xu, Y., Ishii, E., Bang, Y. J., Madotto, A., &amp; Fung, P. (2023). Survey of hallucination in natural language generation. </w:t>
+      </w:r>
       <w:r>
         <w:rPr>
           <w:i/>
           <w:iCs/>
-          <w:color w:val="7A5A00"/>
-        </w:rPr>
-        <w:t>[To be written by Xiao Zhang: what you personally learned from the project, for example about the module you owned, a problem you solved, working in a team, or a technology you used for the first time. About 100–200 words.]</w:t>
-      </w:r>
-    </w:p>
-    <w:p>
-      <w:pPr>
-        <w:pStyle w:val="3"/>
-      </w:pPr>
-      <w:r>
-        <w:t>Wenhan Zhang</w:t>
-      </w:r>
-    </w:p>
-    <w:p>
-      <w:pPr>
-        <w:shd w:val="clear" w:color="auto" w:fill="FFF4D6"/>
-        <w:spacing w:after="140" w:line="300" w:lineRule="auto"/>
-      </w:pPr>
+        </w:rPr>
+        <w:t>ACM Computing Surveys, 55</w:t>
+      </w:r>
+      <w:r>
+        <w:t>(12), 1–38. https://doi.org/10.1145/3571730</w:t>
+      </w:r>
+    </w:p>
+    <w:p>
+      <w:pPr>
+        <w:spacing w:after="140" w:line="280" w:lineRule="auto"/>
+        <w:ind w:left="720" w:hanging="720"/>
+      </w:pPr>
+      <w:r>
+        <w:t xml:space="preserve">Jorge, O., Pons, A., Rius, J., Vintró, C., Mateo, J., &amp; Vilaplana, J. (2020). Increasing online shop revenues with web scraping: A case study for the wine sector. </w:t>
+      </w:r>
       <w:r>
         <w:rPr>
           <w:i/>
           <w:iCs/>
-          <w:color w:val="7A5A00"/>
-        </w:rPr>
-        <w:t>[To be written by Wenhan Zhang: what you personally learned from the project, for example about the module you owned, a problem you solved, working in a team, or a technology you used for the first time. About 100–200 words.]</w:t>
-      </w:r>
-    </w:p>
-    <w:p>
-      <w:pPr>
-        <w:pStyle w:val="1"/>
-        <w:pageBreakBefore/>
-      </w:pPr>
-      <w:bookmarkStart w:id="43" w:name="_Toc243322461"/>
-      <w:r>
-        <w:lastRenderedPageBreak/>
-        <w:t>References</w:t>
-      </w:r>
-      <w:bookmarkEnd w:id="43"/>
+        </w:rPr>
+        <w:t>British Food Journal, 122</w:t>
+      </w:r>
+      <w:r>
+        <w:t>(11), 3383–3401. https://doi.org/10.1108/BFJ-07-2019-0522</w:t>
+      </w:r>
     </w:p>
     <w:p>
       <w:pPr>
@@ -11326,17 +11385,17 @@
         <w:ind w:left="720" w:hanging="720"/>
       </w:pPr>
       <w:r>
-        <w:t xml:space="preserve">Doorenbos, R. B., Etzioni, O., &amp; Weld, D. S. (1997). A scalable comparison-shopping agent for the World-Wide Web. In </w:t>
+        <w:t xml:space="preserve">LangChain. (n.d.). </w:t>
       </w:r>
       <w:r>
         <w:rPr>
           <w:i/>
           <w:iCs/>
         </w:rPr>
-        <w:t>Proceedings of the First International Conference on Autonomous Agents</w:t>
-      </w:r>
-      <w:r>
-        <w:t xml:space="preserve"> (pp. 39–48). ACM. https://doi.org/10.1145/267658.267666</w:t>
+        <w:t>LangGraph documentation</w:t>
+      </w:r>
+      <w:r>
+        <w:t>. Retrieved October 18, 2026, from https://langchain-ai.github.io/langgraph/</w:t>
       </w:r>
     </w:p>
     <w:p>
@@ -11345,17 +11404,17 @@
         <w:ind w:left="720" w:hanging="720"/>
       </w:pPr>
       <w:r>
-        <w:t xml:space="preserve">DeepSeek. (n.d.). </w:t>
+        <w:t xml:space="preserve">Maes, P., Guttman, R. H., &amp; Moukas, A. G. (1999). Agents that buy and sell. </w:t>
       </w:r>
       <w:r>
         <w:rPr>
           <w:i/>
           <w:iCs/>
         </w:rPr>
-        <w:t>DeepSeek API documentation</w:t>
-      </w:r>
-      <w:r>
-        <w:t>. Retrieved October 18, 2026, from https://api-docs.deepseek.com/</w:t>
+        <w:t>Communications of the ACM, 42</w:t>
+      </w:r>
+      <w:r>
+        <w:t>(3), 81–91. https://doi.org/10.1145/295685.295716</w:t>
       </w:r>
     </w:p>
     <w:p>
@@ -11364,17 +11423,17 @@
         <w:ind w:left="720" w:hanging="720"/>
       </w:pPr>
       <w:r>
-        <w:t xml:space="preserve">Firecrawl. (n.d.). </w:t>
+        <w:t xml:space="preserve">OWASP Foundation. (n.d.). </w:t>
       </w:r>
       <w:r>
         <w:rPr>
           <w:i/>
           <w:iCs/>
         </w:rPr>
-        <w:t>Firecrawl documentation</w:t>
-      </w:r>
-      <w:r>
-        <w:t>. Retrieved October 18, 2026, from https://docs.firecrawl.dev/</w:t>
+        <w:t>Cross-site request forgery prevention cheat sheet</w:t>
+      </w:r>
+      <w:r>
+        <w:t>. Retrieved October 18, 2026, from https://cheatsheetseries.owasp.org/cheatsheets/Cross-Site_Request_Forgery_Prevention_Cheat_Sheet.html</w:t>
       </w:r>
     </w:p>
     <w:p>
@@ -11383,17 +11442,17 @@
         <w:ind w:left="720" w:hanging="720"/>
       </w:pPr>
       <w:r>
-        <w:t xml:space="preserve">Ji, Z., Lee, N., Frieske, R., Yu, T., Su, D., Xu, Y., Ishii, E., Bang, Y. J., Madotto, A., &amp; Fung, P. (2023). Survey of hallucination in natural language generation. </w:t>
+        <w:t xml:space="preserve">PyInstaller Development Team. (n.d.). </w:t>
       </w:r>
       <w:r>
         <w:rPr>
           <w:i/>
           <w:iCs/>
         </w:rPr>
-        <w:t>ACM Computing Surveys, 55</w:t>
-      </w:r>
-      <w:r>
-        <w:t>(12), 1–38. https://doi.org/10.1145/3571730</w:t>
+        <w:t>PyInstaller manual</w:t>
+      </w:r>
+      <w:r>
+        <w:t>. Retrieved October 18, 2026, from https://pyinstaller.org/en/stable/</w:t>
       </w:r>
     </w:p>
     <w:p>
@@ -11402,17 +11461,17 @@
         <w:ind w:left="720" w:hanging="720"/>
       </w:pPr>
       <w:r>
-        <w:t xml:space="preserve">Jorge, O., Pons, A., Rius, J., Vintró, C., Mateo, J., &amp; Vilaplana, J. (2020). Increasing online shop revenues with web scraping: A case study for the wine sector. </w:t>
+        <w:t xml:space="preserve">Python Software Foundation. (n.d.-a). </w:t>
       </w:r>
       <w:r>
         <w:rPr>
           <w:i/>
           <w:iCs/>
         </w:rPr>
-        <w:t>British Food Journal, 122</w:t>
-      </w:r>
-      <w:r>
-        <w:t>(11), 3383–3401. https://doi.org/10.1108/BFJ-07-2019-0522</w:t>
+        <w:t>sqlite3: DB-API 2.0 interface for SQLite databases</w:t>
+      </w:r>
+      <w:r>
+        <w:t>. Retrieved October 18, 2026, from https://docs.python.org/3/library/sqlite3.html</w:t>
       </w:r>
     </w:p>
     <w:p>
@@ -11421,17 +11480,17 @@
         <w:ind w:left="720" w:hanging="720"/>
       </w:pPr>
       <w:r>
-        <w:t xml:space="preserve">LangChain. (n.d.). </w:t>
+        <w:t xml:space="preserve">Python Software Foundation. (n.d.-b). </w:t>
       </w:r>
       <w:r>
         <w:rPr>
           <w:i/>
           <w:iCs/>
         </w:rPr>
-        <w:t>LangGraph documentation</w:t>
-      </w:r>
-      <w:r>
-        <w:t>. Retrieved October 18, 2026, from https://langchain-ai.github.io/langgraph/</w:t>
+        <w:t>smtplib: SMTP protocol client</w:t>
+      </w:r>
+      <w:r>
+        <w:t>. Retrieved October 18, 2026, from https://docs.python.org/3/library/smtplib.html</w:t>
       </w:r>
     </w:p>
     <w:p>
@@ -11440,17 +11499,17 @@
         <w:ind w:left="720" w:hanging="720"/>
       </w:pPr>
       <w:r>
-        <w:t xml:space="preserve">Maes, P., Guttman, R. H., &amp; Moukas, A. G. (1999). Agents that buy and sell. </w:t>
+        <w:t xml:space="preserve">Schema.org. (n.d.). </w:t>
       </w:r>
       <w:r>
         <w:rPr>
           <w:i/>
           <w:iCs/>
         </w:rPr>
-        <w:t>Communications of the ACM, 42</w:t>
-      </w:r>
-      <w:r>
-        <w:t>(3), 81–91. https://doi.org/10.1145/295685.295716</w:t>
+        <w:t>Offer</w:t>
+      </w:r>
+      <w:r>
+        <w:t>. Retrieved October 18, 2026, from https://schema.org/Offer</w:t>
       </w:r>
     </w:p>
     <w:p>
@@ -11459,17 +11518,17 @@
         <w:ind w:left="720" w:hanging="720"/>
       </w:pPr>
       <w:r>
-        <w:t xml:space="preserve">OWASP Foundation. (n.d.). </w:t>
+        <w:t xml:space="preserve">SerpApi. (n.d.). </w:t>
       </w:r>
       <w:r>
         <w:rPr>
           <w:i/>
           <w:iCs/>
         </w:rPr>
-        <w:t>Cross-site request forgery prevention cheat sheet</w:t>
-      </w:r>
-      <w:r>
-        <w:t>. Retrieved October 18, 2026, from https://cheatsheetseries.owasp.org/cheatsheets/Cross-Site_Request_Forgery_Prevention_Cheat_Sheet.html</w:t>
+        <w:t>Google Shopping API</w:t>
+      </w:r>
+      <w:r>
+        <w:t>. Retrieved October 18, 2026, from https://serpapi.com/google-shopping-api</w:t>
       </w:r>
     </w:p>
     <w:p>
@@ -11478,17 +11537,17 @@
         <w:ind w:left="720" w:hanging="720"/>
       </w:pPr>
       <w:r>
-        <w:t xml:space="preserve">PyInstaller Development Team. (n.d.). </w:t>
+        <w:t xml:space="preserve">Serper. (n.d.). </w:t>
       </w:r>
       <w:r>
         <w:rPr>
           <w:i/>
           <w:iCs/>
         </w:rPr>
-        <w:t>PyInstaller manual</w:t>
-      </w:r>
-      <w:r>
-        <w:t>. Retrieved October 18, 2026, from https://pyinstaller.org/en/stable/</w:t>
+        <w:t>Serper: The world's fastest and cheapest Google Search API</w:t>
+      </w:r>
+      <w:r>
+        <w:t>. Retrieved October 18, 2026, from https://serper.dev/</w:t>
       </w:r>
     </w:p>
     <w:p>
@@ -11497,17 +11556,17 @@
         <w:ind w:left="720" w:hanging="720"/>
       </w:pPr>
       <w:r>
-        <w:t xml:space="preserve">Python Software Foundation. (n.d.-a). </w:t>
+        <w:t xml:space="preserve">Sommerville, I. (2016). </w:t>
       </w:r>
       <w:r>
         <w:rPr>
           <w:i/>
           <w:iCs/>
         </w:rPr>
-        <w:t>sqlite3: DB-API 2.0 interface for SQLite databases</w:t>
-      </w:r>
-      <w:r>
-        <w:t>. Retrieved October 18, 2026, from https://docs.python.org/3/library/sqlite3.html</w:t>
+        <w:t>Software engineering</w:t>
+      </w:r>
+      <w:r>
+        <w:t xml:space="preserve"> (10th ed.). Pearson.</w:t>
       </w:r>
     </w:p>
     <w:p>
@@ -11516,17 +11575,21 @@
         <w:ind w:left="720" w:hanging="720"/>
       </w:pPr>
       <w:r>
-        <w:t xml:space="preserve">Python Software Foundation. (n.d.-b). </w:t>
+        <w:t xml:space="preserve">Wang, L., Ma, C., Feng, X., Zhang, Z., Yang, H., Zhang, J., Chen, Z., Tang, J., Chen, X., Lin, Y., Zhao, W. X., Wei, Z., &amp; Wen, J.-R. (2024). A survey on large language model based autonomous </w:t>
+      </w:r>
+      <w:r>
+        <w:lastRenderedPageBreak/>
+        <w:t xml:space="preserve">agents. </w:t>
       </w:r>
       <w:r>
         <w:rPr>
           <w:i/>
           <w:iCs/>
         </w:rPr>
-        <w:t>smtplib: SMTP protocol client</w:t>
-      </w:r>
-      <w:r>
-        <w:t>. Retrieved October 18, 2026, from https://docs.python.org/3/library/smtplib.html</w:t>
+        <w:t>Frontiers of Computer Science, 18</w:t>
+      </w:r>
+      <w:r>
+        <w:t>(6), Article 186345. https://doi.org/10.1007/s11704-024-40231-1</w:t>
       </w:r>
     </w:p>
     <w:p>
@@ -11535,112 +11598,13 @@
         <w:ind w:left="720" w:hanging="720"/>
       </w:pPr>
       <w:r>
-        <w:t xml:space="preserve">Schema.org. (n.d.). </w:t>
+        <w:t xml:space="preserve">Yao, S., Zhao, J., Yu, D., Du, N., Shafran, I., Narasimhan, K., &amp; Cao, Y. (2023). ReAct: Synergizing reasoning and acting in language models. In </w:t>
       </w:r>
       <w:r>
         <w:rPr>
           <w:i/>
           <w:iCs/>
         </w:rPr>
-        <w:t>Offer</w:t>
-      </w:r>
-      <w:r>
-        <w:t>. Retrieved October 18, 2026, from https://schema.org/Offer</w:t>
-      </w:r>
-    </w:p>
-    <w:p>
-      <w:pPr>
-        <w:spacing w:after="140" w:line="280" w:lineRule="auto"/>
-        <w:ind w:left="720" w:hanging="720"/>
-      </w:pPr>
-      <w:r>
-        <w:t xml:space="preserve">SerpApi. (n.d.). </w:t>
-      </w:r>
-      <w:r>
-        <w:rPr>
-          <w:i/>
-          <w:iCs/>
-        </w:rPr>
-        <w:t>Google Shopping API</w:t>
-      </w:r>
-      <w:r>
-        <w:t>. Retrieved October 18, 2026, from https://serpapi.com/google-shopping-api</w:t>
-      </w:r>
-    </w:p>
-    <w:p>
-      <w:pPr>
-        <w:spacing w:after="140" w:line="280" w:lineRule="auto"/>
-        <w:ind w:left="720" w:hanging="720"/>
-      </w:pPr>
-      <w:r>
-        <w:t xml:space="preserve">Serper. (n.d.). </w:t>
-      </w:r>
-      <w:r>
-        <w:rPr>
-          <w:i/>
-          <w:iCs/>
-        </w:rPr>
-        <w:t>Serper: The world's fastest and cheapest Google Search API</w:t>
-      </w:r>
-      <w:r>
-        <w:t>. Retrieved October 18, 2026, from https://serper.dev/</w:t>
-      </w:r>
-    </w:p>
-    <w:p>
-      <w:pPr>
-        <w:spacing w:after="140" w:line="280" w:lineRule="auto"/>
-        <w:ind w:left="720" w:hanging="720"/>
-      </w:pPr>
-      <w:r>
-        <w:t xml:space="preserve">Sommerville, I. (2016). </w:t>
-      </w:r>
-      <w:r>
-        <w:rPr>
-          <w:i/>
-          <w:iCs/>
-        </w:rPr>
-        <w:t>Software engineering</w:t>
-      </w:r>
-      <w:r>
-        <w:t xml:space="preserve"> (10th ed.). Pearson.</w:t>
-      </w:r>
-    </w:p>
-    <w:p>
-      <w:pPr>
-        <w:spacing w:after="140" w:line="280" w:lineRule="auto"/>
-        <w:ind w:left="720" w:hanging="720"/>
-      </w:pPr>
-      <w:r>
-        <w:t xml:space="preserve">Wang, L., Ma, C., Feng, X., Zhang, Z., Yang, H., Zhang, J., Chen, Z., Tang, J., Chen, X., Lin, Y., Zhao, W. X., Wei, Z., &amp; Wen, J.-R. (2024). A survey on large language model based autonomous </w:t>
-      </w:r>
-      <w:r>
-        <w:lastRenderedPageBreak/>
-        <w:t xml:space="preserve">agents. </w:t>
-      </w:r>
-      <w:r>
-        <w:rPr>
-          <w:i/>
-          <w:iCs/>
-        </w:rPr>
-        <w:t>Frontiers of Computer Science, 18</w:t>
-      </w:r>
-      <w:r>
-        <w:t>(6), Article 186345. https://doi.org/10.1007/s11704-024-40231-1</w:t>
-      </w:r>
-    </w:p>
-    <w:p>
-      <w:pPr>
-        <w:spacing w:after="140" w:line="280" w:lineRule="auto"/>
-        <w:ind w:left="720" w:hanging="720"/>
-      </w:pPr>
-      <w:r>
-        <w:t xml:space="preserve">Yao, S., Zhao, J., Yu, D., Du, N., Shafran, I., Narasimhan, K., &amp; Cao, Y. (2023). ReAct: Synergizing reasoning and acting in language models. In </w:t>
-      </w:r>
-      <w:r>
-        <w:rPr>
-          <w:i/>
-          <w:iCs/>
-        </w:rPr>
         <w:t>Proceedings of the International Conference on Learning Representations (ICLR 2023)</w:t>
       </w:r>
       <w:r>
@@ -11651,7 +11615,7 @@
       <w:pPr>
         <w:pStyle w:val="2"/>
       </w:pPr>
-      <w:bookmarkStart w:id="44" w:name="_Toc243322462"/>
+      <w:bookmarkStart w:id="44" w:name="_Toc243322748"/>
       <w:r>
         <w:t>Source code</w:t>
       </w:r>
@@ -11858,10 +11822,10 @@
 <file path=word/numbering.xml><?xml version="1.0" encoding="utf-8"?>
 <w:numbering xmlns:wpc="http://schemas.microsoft.com/office/word/2010/wordprocessingCanvas" xmlns:cx="http://schemas.microsoft.com/office/drawing/2014/chartex" xmlns:cx1="http://schemas.microsoft.com/office/drawing/2015/9/8/chartex" xmlns:cx2="http://schemas.microsoft.com/office/drawing/2015/10/21/chartex" xmlns:cx3="http://schemas.microsoft.com/office/drawing/2016/5/9/chartex" xmlns:cx4="http://schemas.microsoft.com/office/drawing/2016/5/10/chartex" xmlns:cx5="http://schemas.microsoft.com/office/drawing/2016/5/11/chartex" xmlns:cx6="http://schemas.microsoft.com/office/drawing/2016/5/12/chartex" xmlns:cx7="http://schemas.microsoft.com/office/drawing/2016/5/13/chartex" xmlns:cx8="http://schemas.microsoft.com/office/drawing/2016/5/14/chartex" xmlns:mc="http://schemas.openxmlformats.org/markup-compatibility/2006" xmlns:aink="http://schemas.microsoft.com/office/drawing/2016/ink" xmlns:am3d="http://schemas.microsoft.com/office/drawing/2017/model3d" xmlns:o="urn:schemas-microsoft-com:office:office" xmlns:oel="http://schemas.microsoft.com/office/2019/extlst" xmlns:r="http://schemas.openxmlformats.org/officeDocument/2006/relationships" xmlns:m="http://schemas.openxmlformats.org/officeDocument/2006/math" xmlns:v="urn:schemas-microsoft-com:vml" xmlns:wp14="http://schemas.microsoft.com/office/word/2010/wordprocessingDrawing" xmlns:wp="http://schemas.openxmlformats.org/drawingml/2006/wordprocessingDrawing" xmlns:w10="urn:schemas-microsoft-com:office:word" xmlns:w="http://schemas.openxmlformats.org/wordprocessingml/2006/main" xmlns:w14="http://schemas.microsoft.com/office/word/2010/wordml" xmlns:w15="http://schemas.microsoft.com/office/word/2012/wordml" xmlns:w16cex="http://schemas.microsoft.com/office/word/2018/wordml/cex" xmlns:w16cid="http://schemas.microsoft.com/office/word/2016/wordml/cid" xmlns:w16="http://schemas.microsoft.com/office/word/2018/wordml" xmlns:w16du="http://schemas.microsoft.com/office/word/2023/wordml/word16du" xmlns:w16sdtdh="http://schemas.microsoft.com/office/word/2020/wordml/sdtdatahash" xmlns:w16sdtfl="http://schemas.microsoft.com/office/word/2024/wordml/sdtformatlock" xmlns:w16se="http://schemas.microsoft.com/office/word/2015/wordml/symex" xmlns:wpg="http://schemas.microsoft.com/office/word/2010/wordprocessingGroup" xmlns:wpi="http://schemas.microsoft.com/office/word/2010/wordprocessingInk" xmlns:wne="http://schemas.microsoft.com/office/word/2006/wordml" xmlns:wps="http://schemas.microsoft.com/office/word/2010/wordprocessingShape" mc:Ignorable="w14 w15 w16se w16cid w16 w16cex w16sdtdh w16sdtfl w16du wp14">
   <w:abstractNum w:abstractNumId="0" w15:restartNumberingAfterBreak="0">
-    <w:nsid w:val="39DA31AC"/>
+    <w:nsid w:val="21626F01"/>
     <w:multiLevelType w:val="hybridMultilevel"/>
-    <w:tmpl w:val="8E4A2CDA"/>
-    <w:lvl w:ilvl="0" w:tplc="07EC6170">
+    <w:tmpl w:val="865A8D74"/>
+    <w:lvl w:ilvl="0" w:tplc="251E4782">
       <w:start w:val="1"/>
       <w:numFmt w:val="decimal"/>
       <w:lvlText w:val="%1."/>
@@ -11870,260 +11834,260 @@
         <w:ind w:left="540" w:hanging="360"/>
       </w:pPr>
     </w:lvl>
-    <w:lvl w:ilvl="1" w:tplc="988C9C0E">
+    <w:lvl w:ilvl="1" w:tplc="B1E63CEC">
       <w:numFmt w:val="decimal"/>
       <w:lvlText w:val=""/>
       <w:lvlJc w:val="left"/>
     </w:lvl>
-    <w:lvl w:ilvl="2" w:tplc="75A0F25E">
+    <w:lvl w:ilvl="2" w:tplc="A0D47BAA">
       <w:numFmt w:val="decimal"/>
       <w:lvlText w:val=""/>
       <w:lvlJc w:val="left"/>
     </w:lvl>
-    <w:lvl w:ilvl="3" w:tplc="80F4AD08">
+    <w:lvl w:ilvl="3" w:tplc="860E2D98">
       <w:numFmt w:val="decimal"/>
       <w:lvlText w:val=""/>
       <w:lvlJc w:val="left"/>
     </w:lvl>
-    <w:lvl w:ilvl="4" w:tplc="79346280">
+    <w:lvl w:ilvl="4" w:tplc="82D80F56">
       <w:numFmt w:val="decimal"/>
       <w:lvlText w:val=""/>
       <w:lvlJc w:val="left"/>
     </w:lvl>
-    <w:lvl w:ilvl="5" w:tplc="560EB71E">
+    <w:lvl w:ilvl="5" w:tplc="CC4AAFCC">
       <w:numFmt w:val="decimal"/>
       <w:lvlText w:val=""/>
       <w:lvlJc w:val="left"/>
     </w:lvl>
-    <w:lvl w:ilvl="6" w:tplc="69C4FF12">
+    <w:lvl w:ilvl="6" w:tplc="D7BA9B52">
       <w:numFmt w:val="decimal"/>
       <w:lvlText w:val=""/>
       <w:lvlJc w:val="left"/>
     </w:lvl>
-    <w:lvl w:ilvl="7" w:tplc="0CA438DE">
+    <w:lvl w:ilvl="7" w:tplc="15E2C4DA">
       <w:numFmt w:val="decimal"/>
       <w:lvlText w:val=""/>
       <w:lvlJc w:val="left"/>
     </w:lvl>
-    <w:lvl w:ilvl="8" w:tplc="1972852E">
+    <w:lvl w:ilvl="8" w:tplc="80082F72">
       <w:numFmt w:val="decimal"/>
       <w:lvlText w:val=""/>
       <w:lvlJc w:val="left"/>
     </w:lvl>
   </w:abstractNum>
   <w:abstractNum w:abstractNumId="1" w15:restartNumberingAfterBreak="0">
-    <w:nsid w:val="43D61F68"/>
+    <w:nsid w:val="42877F4B"/>
     <w:multiLevelType w:val="hybridMultilevel"/>
-    <w:tmpl w:val="3AB835BE"/>
-    <w:lvl w:ilvl="0" w:tplc="21284438">
+    <w:tmpl w:val="4CCC94E8"/>
+    <w:lvl w:ilvl="0" w:tplc="08B44C34" w:tentative="1">
       <w:start w:val="1"/>
-      <w:numFmt w:val="decimal"/>
-      <w:lvlText w:val="%1."/>
+      <w:numFmt w:val="bullet"/>
+      <w:lvlText w:val="●"/>
       <w:lvlJc w:val="left"/>
       <w:pPr>
-        <w:ind w:left="540" w:hanging="360"/>
+        <w:ind w:left="720" w:hanging="360"/>
       </w:pPr>
     </w:lvl>
-    <w:lvl w:ilvl="1" w:tplc="85EAF5DC">
+    <w:lvl w:ilvl="1" w:tplc="EC48158A" w:tentative="1">
+      <w:start w:val="1"/>
+      <w:numFmt w:val="bullet"/>
+      <w:lvlText w:val="○"/>
+      <w:lvlJc w:val="left"/>
+      <w:pPr>
+        <w:ind w:left="1440" w:hanging="360"/>
+      </w:pPr>
+    </w:lvl>
+    <w:lvl w:ilvl="2" w:tplc="96B88D86" w:tentative="1">
+      <w:start w:val="1"/>
+      <w:numFmt w:val="bullet"/>
+      <w:lvlText w:val="■"/>
+      <w:lvlJc w:val="left"/>
+      <w:pPr>
+        <w:ind w:left="2160" w:hanging="360"/>
+      </w:pPr>
+    </w:lvl>
+    <w:lvl w:ilvl="3" w:tplc="BD223548" w:tentative="1">
+      <w:start w:val="1"/>
+      <w:numFmt w:val="bullet"/>
+      <w:lvlText w:val="●"/>
+      <w:lvlJc w:val="left"/>
+      <w:pPr>
+        <w:ind w:left="2880" w:hanging="360"/>
+      </w:pPr>
+    </w:lvl>
+    <w:lvl w:ilvl="4" w:tplc="89645E16" w:tentative="1">
+      <w:start w:val="1"/>
+      <w:numFmt w:val="bullet"/>
+      <w:lvlText w:val="○"/>
+      <w:lvlJc w:val="left"/>
+      <w:pPr>
+        <w:ind w:left="3600" w:hanging="360"/>
+      </w:pPr>
+    </w:lvl>
+    <w:lvl w:ilvl="5" w:tplc="034A929E" w:tentative="1">
+      <w:start w:val="1"/>
+      <w:numFmt w:val="bullet"/>
+      <w:lvlText w:val="■"/>
+      <w:lvlJc w:val="left"/>
+      <w:pPr>
+        <w:ind w:left="4320" w:hanging="360"/>
+      </w:pPr>
+    </w:lvl>
+    <w:lvl w:ilvl="6" w:tplc="289C2D82" w:tentative="1">
+      <w:start w:val="1"/>
+      <w:numFmt w:val="bullet"/>
+      <w:lvlText w:val="●"/>
+      <w:lvlJc w:val="left"/>
+      <w:pPr>
+        <w:ind w:left="5040" w:hanging="360"/>
+      </w:pPr>
+    </w:lvl>
+    <w:lvl w:ilvl="7" w:tplc="52DE7E94" w:tentative="1">
+      <w:start w:val="1"/>
+      <w:numFmt w:val="bullet"/>
+      <w:lvlText w:val="●"/>
+      <w:lvlJc w:val="left"/>
+      <w:pPr>
+        <w:ind w:left="5760" w:hanging="360"/>
+      </w:pPr>
+    </w:lvl>
+    <w:lvl w:ilvl="8" w:tplc="7BFCDE34" w:tentative="1">
+      <w:start w:val="1"/>
+      <w:numFmt w:val="bullet"/>
+      <w:lvlText w:val="●"/>
+      <w:lvlJc w:val="left"/>
+      <w:pPr>
+        <w:ind w:left="6480" w:hanging="360"/>
+      </w:pPr>
+    </w:lvl>
+  </w:abstractNum>
+  <w:abstractNum w:abstractNumId="2" w15:restartNumberingAfterBreak="0">
+    <w:nsid w:val="692A2F7F"/>
+    <w:multiLevelType w:val="hybridMultilevel"/>
+    <w:tmpl w:val="D0DC2FB2"/>
+    <w:lvl w:ilvl="0" w:tplc="29DAFCB4">
+      <w:start w:val="1"/>
+      <w:numFmt w:val="bullet"/>
+      <w:lvlText w:val="•"/>
+      <w:lvlJc w:val="left"/>
+      <w:pPr>
+        <w:ind w:left="540" w:hanging="300"/>
+      </w:pPr>
+    </w:lvl>
+    <w:lvl w:ilvl="1" w:tplc="1F766400">
       <w:numFmt w:val="decimal"/>
       <w:lvlText w:val=""/>
       <w:lvlJc w:val="left"/>
     </w:lvl>
-    <w:lvl w:ilvl="2" w:tplc="A6DCB380">
+    <w:lvl w:ilvl="2" w:tplc="EDEC3866">
       <w:numFmt w:val="decimal"/>
       <w:lvlText w:val=""/>
       <w:lvlJc w:val="left"/>
     </w:lvl>
-    <w:lvl w:ilvl="3" w:tplc="EDD4A526">
+    <w:lvl w:ilvl="3" w:tplc="282EBE70">
       <w:numFmt w:val="decimal"/>
       <w:lvlText w:val=""/>
       <w:lvlJc w:val="left"/>
     </w:lvl>
-    <w:lvl w:ilvl="4" w:tplc="1AD4BA10">
+    <w:lvl w:ilvl="4" w:tplc="4D3432B6">
       <w:numFmt w:val="decimal"/>
       <w:lvlText w:val=""/>
       <w:lvlJc w:val="left"/>
     </w:lvl>
-    <w:lvl w:ilvl="5" w:tplc="AF0E1C18">
+    <w:lvl w:ilvl="5" w:tplc="F98C2390">
       <w:numFmt w:val="decimal"/>
       <w:lvlText w:val=""/>
       <w:lvlJc w:val="left"/>
     </w:lvl>
-    <w:lvl w:ilvl="6" w:tplc="4FCA67F4">
+    <w:lvl w:ilvl="6" w:tplc="D3980902">
       <w:numFmt w:val="decimal"/>
       <w:lvlText w:val=""/>
       <w:lvlJc w:val="left"/>
     </w:lvl>
-    <w:lvl w:ilvl="7" w:tplc="6338DA92">
+    <w:lvl w:ilvl="7" w:tplc="CFBCDCEA">
       <w:numFmt w:val="decimal"/>
       <w:lvlText w:val=""/>
       <w:lvlJc w:val="left"/>
     </w:lvl>
-    <w:lvl w:ilvl="8" w:tplc="A83A2B36">
+    <w:lvl w:ilvl="8" w:tplc="A9C44B6E">
       <w:numFmt w:val="decimal"/>
       <w:lvlText w:val=""/>
       <w:lvlJc w:val="left"/>
     </w:lvl>
   </w:abstractNum>
-  <w:abstractNum w:abstractNumId="2" w15:restartNumberingAfterBreak="0">
-    <w:nsid w:val="524A381C"/>
+  <w:abstractNum w:abstractNumId="3" w15:restartNumberingAfterBreak="0">
+    <w:nsid w:val="7EE978A0"/>
     <w:multiLevelType w:val="hybridMultilevel"/>
-    <w:tmpl w:val="7D3873D4"/>
-    <w:lvl w:ilvl="0" w:tplc="061A977A" w:tentative="1">
+    <w:tmpl w:val="B0CACCF2"/>
+    <w:lvl w:ilvl="0" w:tplc="09BE04D8">
       <w:start w:val="1"/>
-      <w:numFmt w:val="bullet"/>
-      <w:lvlText w:val="●"/>
+      <w:numFmt w:val="decimal"/>
+      <w:lvlText w:val="%1."/>
       <w:lvlJc w:val="left"/>
       <w:pPr>
-        <w:ind w:left="720" w:hanging="360"/>
+        <w:ind w:left="540" w:hanging="360"/>
       </w:pPr>
     </w:lvl>
-    <w:lvl w:ilvl="1" w:tplc="92D8CFE0" w:tentative="1">
-      <w:start w:val="1"/>
-      <w:numFmt w:val="bullet"/>
-      <w:lvlText w:val="○"/>
-      <w:lvlJc w:val="left"/>
-      <w:pPr>
-        <w:ind w:left="1440" w:hanging="360"/>
-      </w:pPr>
-    </w:lvl>
-    <w:lvl w:ilvl="2" w:tplc="82DE1792" w:tentative="1">
-      <w:start w:val="1"/>
-      <w:numFmt w:val="bullet"/>
-      <w:lvlText w:val="■"/>
-      <w:lvlJc w:val="left"/>
-      <w:pPr>
-        <w:ind w:left="2160" w:hanging="360"/>
-      </w:pPr>
-    </w:lvl>
-    <w:lvl w:ilvl="3" w:tplc="C5A6EA1A" w:tentative="1">
-      <w:start w:val="1"/>
-      <w:numFmt w:val="bullet"/>
-      <w:lvlText w:val="●"/>
-      <w:lvlJc w:val="left"/>
-      <w:pPr>
-        <w:ind w:left="2880" w:hanging="360"/>
-      </w:pPr>
-    </w:lvl>
-    <w:lvl w:ilvl="4" w:tplc="A96E952E" w:tentative="1">
-      <w:start w:val="1"/>
-      <w:numFmt w:val="bullet"/>
-      <w:lvlText w:val="○"/>
-      <w:lvlJc w:val="left"/>
-      <w:pPr>
-        <w:ind w:left="3600" w:hanging="360"/>
-      </w:pPr>
-    </w:lvl>
-    <w:lvl w:ilvl="5" w:tplc="AB72AC6C" w:tentative="1">
-      <w:start w:val="1"/>
-      <w:numFmt w:val="bullet"/>
-      <w:lvlText w:val="■"/>
-      <w:lvlJc w:val="left"/>
-      <w:pPr>
-        <w:ind w:left="4320" w:hanging="360"/>
-      </w:pPr>
-    </w:lvl>
-    <w:lvl w:ilvl="6" w:tplc="55088498" w:tentative="1">
-      <w:start w:val="1"/>
-      <w:numFmt w:val="bullet"/>
-      <w:lvlText w:val="●"/>
-      <w:lvlJc w:val="left"/>
-      <w:pPr>
-        <w:ind w:left="5040" w:hanging="360"/>
-      </w:pPr>
-    </w:lvl>
-    <w:lvl w:ilvl="7" w:tplc="36C47194" w:tentative="1">
-      <w:start w:val="1"/>
-      <w:numFmt w:val="bullet"/>
-      <w:lvlText w:val="●"/>
-      <w:lvlJc w:val="left"/>
-      <w:pPr>
-        <w:ind w:left="5760" w:hanging="360"/>
-      </w:pPr>
-    </w:lvl>
-    <w:lvl w:ilvl="8" w:tplc="9482A760" w:tentative="1">
-      <w:start w:val="1"/>
-      <w:numFmt w:val="bullet"/>
-      <w:lvlText w:val="●"/>
-      <w:lvlJc w:val="left"/>
-      <w:pPr>
-        <w:ind w:left="6480" w:hanging="360"/>
-      </w:pPr>
-    </w:lvl>
-  </w:abstractNum>
-  <w:abstractNum w:abstractNumId="3" w15:restartNumberingAfterBreak="0">
-    <w:nsid w:val="748553B7"/>
-    <w:multiLevelType w:val="hybridMultilevel"/>
-    <w:tmpl w:val="B6D0F296"/>
-    <w:lvl w:ilvl="0" w:tplc="FDD0A02E">
-      <w:start w:val="1"/>
-      <w:numFmt w:val="bullet"/>
-      <w:lvlText w:val="•"/>
-      <w:lvlJc w:val="left"/>
-      <w:pPr>
-        <w:ind w:left="540" w:hanging="300"/>
-      </w:pPr>
-    </w:lvl>
-    <w:lvl w:ilvl="1" w:tplc="7818C5EE">
+    <w:lvl w:ilvl="1" w:tplc="3DBE014C">
       <w:numFmt w:val="decimal"/>
       <w:lvlText w:val=""/>
       <w:lvlJc w:val="left"/>
     </w:lvl>
-    <w:lvl w:ilvl="2" w:tplc="BF803830">
+    <w:lvl w:ilvl="2" w:tplc="3EA2302C">
       <w:numFmt w:val="decimal"/>
       <w:lvlText w:val=""/>
       <w:lvlJc w:val="left"/>
     </w:lvl>
-    <w:lvl w:ilvl="3" w:tplc="E9CCB786">
+    <w:lvl w:ilvl="3" w:tplc="7DF8F238">
       <w:numFmt w:val="decimal"/>
       <w:lvlText w:val=""/>
       <w:lvlJc w:val="left"/>
     </w:lvl>
-    <w:lvl w:ilvl="4" w:tplc="01CEBC5A">
+    <w:lvl w:ilvl="4" w:tplc="D420904C">
       <w:numFmt w:val="decimal"/>
       <w:lvlText w:val=""/>
       <w:lvlJc w:val="left"/>
     </w:lvl>
-    <w:lvl w:ilvl="5" w:tplc="7AD48DBA">
+    <w:lvl w:ilvl="5" w:tplc="1F06A6FA">
       <w:numFmt w:val="decimal"/>
       <w:lvlText w:val=""/>
       <w:lvlJc w:val="left"/>
     </w:lvl>
-    <w:lvl w:ilvl="6" w:tplc="C5C4A8E8">
+    <w:lvl w:ilvl="6" w:tplc="427E4EC4">
       <w:numFmt w:val="decimal"/>
       <w:lvlText w:val=""/>
       <w:lvlJc w:val="left"/>
     </w:lvl>
-    <w:lvl w:ilvl="7" w:tplc="4D5AF5A4">
+    <w:lvl w:ilvl="7" w:tplc="4D1CAE62">
       <w:numFmt w:val="decimal"/>
       <w:lvlText w:val=""/>
       <w:lvlJc w:val="left"/>
     </w:lvl>
-    <w:lvl w:ilvl="8" w:tplc="380C7114">
+    <w:lvl w:ilvl="8" w:tplc="569CF85C">
       <w:numFmt w:val="decimal"/>
       <w:lvlText w:val=""/>
       <w:lvlJc w:val="left"/>
     </w:lvl>
   </w:abstractNum>
-  <w:num w:numId="1" w16cid:durableId="1174807668">
+  <w:num w:numId="1" w16cid:durableId="149559801">
+    <w:abstractNumId w:val="1"/>
+    <w:lvlOverride w:ilvl="0">
+      <w:startOverride w:val="1"/>
+    </w:lvlOverride>
+  </w:num>
+  <w:num w:numId="2" w16cid:durableId="60832578">
     <w:abstractNumId w:val="2"/>
     <w:lvlOverride w:ilvl="0">
       <w:startOverride w:val="1"/>
     </w:lvlOverride>
   </w:num>
-  <w:num w:numId="2" w16cid:durableId="370037655">
+  <w:num w:numId="3" w16cid:durableId="219827805">
     <w:abstractNumId w:val="3"/>
     <w:lvlOverride w:ilvl="0">
       <w:startOverride w:val="1"/>
     </w:lvlOverride>
   </w:num>
-  <w:num w:numId="3" w16cid:durableId="282463732">
-    <w:abstractNumId w:val="1"/>
-    <w:lvlOverride w:ilvl="0">
-      <w:startOverride w:val="1"/>
-    </w:lvlOverride>
-  </w:num>
-  <w:num w:numId="4" w16cid:durableId="1245992538">
+  <w:num w:numId="4" w16cid:durableId="360059170">
     <w:abstractNumId w:val="0"/>
     <w:lvlOverride w:ilvl="0">
       <w:startOverride w:val="1"/>
@@ -12765,7 +12729,7 @@
     <w:link w:val="ad"/>
     <w:uiPriority w:val="99"/>
     <w:unhideWhenUsed/>
-    <w:rsid w:val="0017635B"/>
+    <w:rsid w:val="00B97B2D"/>
     <w:pPr>
       <w:tabs>
         <w:tab w:val="center" w:pos="4153"/>
@@ -12784,7 +12748,7 @@
     <w:basedOn w:val="a0"/>
     <w:link w:val="ac"/>
     <w:uiPriority w:val="99"/>
-    <w:rsid w:val="0017635B"/>
+    <w:rsid w:val="00B97B2D"/>
     <w:rPr>
       <w:sz w:val="18"/>
       <w:szCs w:val="18"/>
@@ -12796,7 +12760,7 @@
     <w:link w:val="af"/>
     <w:uiPriority w:val="99"/>
     <w:unhideWhenUsed/>
-    <w:rsid w:val="0017635B"/>
+    <w:rsid w:val="00B97B2D"/>
     <w:pPr>
       <w:tabs>
         <w:tab w:val="center" w:pos="4153"/>
@@ -12814,7 +12778,7 @@
     <w:basedOn w:val="a0"/>
     <w:link w:val="ae"/>
     <w:uiPriority w:val="99"/>
-    <w:rsid w:val="0017635B"/>
+    <w:rsid w:val="00B97B2D"/>
     <w:rPr>
       <w:sz w:val="18"/>
       <w:szCs w:val="18"/>
@@ -12827,7 +12791,7 @@
     <w:autoRedefine/>
     <w:uiPriority w:val="39"/>
     <w:unhideWhenUsed/>
-    <w:rsid w:val="0017635B"/>
+    <w:rsid w:val="00B97B2D"/>
   </w:style>
   <w:style w:type="paragraph" w:styleId="TOC2">
     <w:name w:val="toc 2"/>
@@ -12836,7 +12800,7 @@
     <w:autoRedefine/>
     <w:uiPriority w:val="39"/>
     <w:unhideWhenUsed/>
-    <w:rsid w:val="0017635B"/>
+    <w:rsid w:val="00B97B2D"/>
     <w:pPr>
       <w:ind w:leftChars="200" w:left="420"/>
     </w:pPr>

</xml_diff>